<commit_message>
Restore complete internal Jiangbin template
</commit_message>
<xml_diff>
--- a/assets/template_minutes.docx
+++ b/assets/template_minutes.docx
@@ -11,12 +11,42 @@
           <w:sz w:val="32"/>
         </w:rPr>
       </w:pPr>
+      <w:bookmarkStart w:id="0" w:name="_Hlk128230139"/>
       <w:r>
         <w:rPr>
           <w:rFonts w:ascii="Times New Roman" w:hAnsi="Times New Roman" w:cs="Times New Roman" w:hint="eastAsia"/>
           <w:sz w:val="32"/>
         </w:rPr>
-        <w:t>项目-访谈对象-专家访谈</w:t>
+        <w:t>江滨</w:t>
+      </w:r>
+      <w:r>
+        <w:rPr>
+          <w:rFonts w:ascii="Times New Roman" w:hAnsi="Times New Roman" w:cs="Times New Roman" w:hint="eastAsia"/>
+          <w:sz w:val="32"/>
+        </w:rPr>
+        <w:t>项目</w:t>
+      </w:r>
+      <w:r>
+        <w:rPr>
+          <w:rFonts w:ascii="Times New Roman" w:hAnsi="Times New Roman" w:cs="Times New Roman" w:hint="eastAsia"/>
+          <w:sz w:val="32"/>
+        </w:rPr>
+        <w:t>-</w:t>
+      </w:r>
+      <w:bookmarkEnd w:id="0"/>
+      <w:r>
+        <w:rPr>
+          <w:rFonts w:ascii="Times New Roman" w:hAnsi="Times New Roman" w:cs="Times New Roman" w:hint="eastAsia"/>
+          <w:sz w:val="32"/>
+        </w:rPr>
+        <w:t>客户</w:t>
+      </w:r>
+      <w:r>
+        <w:rPr>
+          <w:rFonts w:ascii="Times New Roman" w:hAnsi="Times New Roman" w:cs="Times New Roman" w:hint="eastAsia"/>
+          <w:sz w:val="32"/>
+        </w:rPr>
+        <w:t>访谈</w:t>
       </w:r>
     </w:p>
     <w:tbl>
@@ -58,7 +88,49 @@
               <w:rPr>
                 <w:rFonts w:ascii="Times New Roman" w:hAnsi="Times New Roman" w:cs="Times New Roman"/>
               </w:rPr>
-              <w:t>YYYY年M月D日</w:t>
+              <w:t>202</w:t>
+            </w:r>
+            <w:r>
+              <w:rPr>
+                <w:rFonts w:ascii="Times New Roman" w:hAnsi="Times New Roman" w:cs="Times New Roman" w:hint="eastAsia"/>
+              </w:rPr>
+              <w:t>5</w:t>
+            </w:r>
+            <w:r>
+              <w:rPr>
+                <w:rFonts w:ascii="Times New Roman" w:hAnsi="Times New Roman" w:cs="Times New Roman"/>
+              </w:rPr>
+              <w:t>年</w:t>
+            </w:r>
+            <w:r>
+              <w:rPr>
+                <w:rFonts w:ascii="Times New Roman" w:hAnsi="Times New Roman" w:cs="Times New Roman" w:hint="eastAsia"/>
+              </w:rPr>
+              <w:t>9</w:t>
+            </w:r>
+            <w:r>
+              <w:rPr>
+                <w:rFonts w:ascii="Times New Roman" w:hAnsi="Times New Roman" w:cs="Times New Roman" w:hint="eastAsia"/>
+              </w:rPr>
+              <w:t>月</w:t>
+            </w:r>
+            <w:r>
+              <w:rPr>
+                <w:rFonts w:ascii="Times New Roman" w:hAnsi="Times New Roman" w:cs="Times New Roman" w:hint="eastAsia"/>
+              </w:rPr>
+              <w:t>1</w:t>
+            </w:r>
+            <w:r>
+              <w:rPr>
+                <w:rFonts w:ascii="Times New Roman" w:hAnsi="Times New Roman" w:cs="Times New Roman" w:hint="eastAsia"/>
+              </w:rPr>
+              <w:t>3</w:t>
+            </w:r>
+            <w:r>
+              <w:rPr>
+                <w:rFonts w:ascii="Times New Roman" w:hAnsi="Times New Roman" w:cs="Times New Roman" w:hint="eastAsia"/>
+              </w:rPr>
+              <w:t>日</w:t>
             </w:r>
           </w:p>
           <w:p>
@@ -81,7 +153,14 @@
                 <w:rFonts w:ascii="Times New Roman" w:hAnsi="Times New Roman" w:cs="Times New Roman" w:hint="eastAsia"/>
                 <w:bCs/>
               </w:rPr>
-              <w:t>线上</w:t>
+              <w:t>线</w:t>
+            </w:r>
+            <w:r>
+              <w:rPr>
+                <w:rFonts w:ascii="Times New Roman" w:hAnsi="Times New Roman" w:cs="Times New Roman" w:hint="eastAsia"/>
+                <w:bCs/>
+              </w:rPr>
+              <w:t>上</w:t>
             </w:r>
           </w:p>
           <w:p>
@@ -99,6 +178,12 @@
               </w:rPr>
               <w:t>访谈来源：</w:t>
             </w:r>
+            <w:r>
+              <w:rPr>
+                <w:rFonts w:ascii="Times New Roman" w:hAnsi="Times New Roman" w:cs="Times New Roman" w:hint="eastAsia"/>
+              </w:rPr>
+              <w:t>公司</w:t>
+            </w:r>
           </w:p>
           <w:p>
             <w:pPr>
@@ -113,13 +198,73 @@
                 <w:rFonts w:ascii="Times New Roman" w:hAnsi="Times New Roman" w:cs="Times New Roman"/>
                 <w:b/>
               </w:rPr>
-              <w:t>访谈对象及其背景介绍：</w:t>
+              <w:t>访谈对象及其背景介绍</w:t>
             </w:r>
             <w:r>
               <w:rPr>
+                <w:rFonts w:ascii="Times New Roman" w:hAnsi="Times New Roman" w:cs="Times New Roman" w:hint="eastAsia"/>
+                <w:b/>
+              </w:rPr>
+              <w:t>：</w:t>
+            </w:r>
+          </w:p>
+          <w:p>
+            <w:pPr>
+              <w:pStyle w:val="ab"/>
+              <w:ind w:firstLineChars="200" w:firstLine="440"/>
+              <w:rPr>
                 <w:rFonts w:ascii="Times New Roman" w:hAnsi="Times New Roman" w:cs="Times New Roman"/>
+                <w:bCs/>
               </w:rPr>
-              <w:t>姓名、职务及与本次主题相关的背景</w:t>
+            </w:pPr>
+            <w:r>
+              <w:rPr>
+                <w:rFonts w:ascii="Times New Roman" w:hAnsi="Times New Roman" w:cs="Times New Roman" w:hint="eastAsia"/>
+                <w:bCs/>
+              </w:rPr>
+              <w:t>宁德时代</w:t>
+            </w:r>
+            <w:r>
+              <w:rPr>
+                <w:rFonts w:ascii="Times New Roman" w:hAnsi="Times New Roman" w:cs="Times New Roman" w:hint="eastAsia"/>
+                <w:bCs/>
+              </w:rPr>
+              <w:t xml:space="preserve"> </w:t>
+            </w:r>
+            <w:r>
+              <w:rPr>
+                <w:rFonts w:ascii="Times New Roman" w:hAnsi="Times New Roman" w:cs="Times New Roman" w:hint="eastAsia"/>
+                <w:bCs/>
+              </w:rPr>
+              <w:t>IT</w:t>
+            </w:r>
+            <w:r>
+              <w:rPr>
+                <w:rFonts w:ascii="Times New Roman" w:hAnsi="Times New Roman" w:cs="Times New Roman" w:hint="eastAsia"/>
+                <w:bCs/>
+              </w:rPr>
+              <w:t>副部长</w:t>
+            </w:r>
+            <w:r>
+              <w:rPr>
+                <w:rFonts w:ascii="Times New Roman" w:hAnsi="Times New Roman" w:cs="Times New Roman" w:hint="eastAsia"/>
+                <w:bCs/>
+              </w:rPr>
+              <w:t xml:space="preserve"> </w:t>
+            </w:r>
+            <w:r>
+              <w:rPr>
+                <w:rFonts w:ascii="Times New Roman" w:hAnsi="Times New Roman" w:cs="Times New Roman" w:hint="eastAsia"/>
+                <w:bCs/>
+              </w:rPr>
+              <w:t>冯</w:t>
+            </w:r>
+            <w:r>
+              <w:rPr>
+                <w:rFonts w:ascii="Times New Roman" w:hAnsi="Times New Roman" w:cs="Times New Roman" w:hint="eastAsia"/>
+                <w:bCs/>
+              </w:rPr>
+              <w:t>总</w:t>
             </w:r>
           </w:p>
           <w:p>
@@ -140,7 +285,31 @@
               <w:rPr>
                 <w:rFonts w:ascii="Times New Roman" w:hAnsi="Times New Roman" w:cs="Times New Roman" w:hint="eastAsia"/>
               </w:rPr>
-              <w:t>访谈团队</w:t>
+              <w:t>陈光、杨子群、张瑞锐</w:t>
+            </w:r>
+            <w:r>
+              <w:rPr>
+                <w:rFonts w:ascii="Times New Roman" w:hAnsi="Times New Roman" w:cs="Times New Roman" w:hint="eastAsia"/>
+              </w:rPr>
+              <w:t>、</w:t>
+            </w:r>
+            <w:r>
+              <w:rPr>
+                <w:rFonts w:ascii="Times New Roman" w:hAnsi="Times New Roman" w:cs="Times New Roman" w:hint="eastAsia"/>
+              </w:rPr>
+              <w:t>贾贺、武琳</w:t>
+            </w:r>
+            <w:r>
+              <w:rPr>
+                <w:rFonts w:ascii="Times New Roman" w:hAnsi="Times New Roman" w:cs="Times New Roman" w:hint="eastAsia"/>
+              </w:rPr>
+              <w:t>、</w:t>
+            </w:r>
+            <w:r>
+              <w:rPr>
+                <w:rFonts w:ascii="Times New Roman" w:hAnsi="Times New Roman" w:cs="Times New Roman" w:hint="eastAsia"/>
+              </w:rPr>
+              <w:t>吕泓来</w:t>
             </w:r>
           </w:p>
         </w:tc>
@@ -189,17 +358,525 @@
           <w:sz w:val="22"/>
           <w:lang w:val="zh-CN"/>
         </w:rPr>
-        <w:t>结论引导语：</w:t>
-      </w:r>
-      <w:r>
-        <w:rPr>
-          <w:rFonts w:ascii="楷体" w:eastAsia="楷体" w:hAnsi="楷体" w:cs="宋体" w:hint="eastAsia"/>
-          <w:bCs/>
-          <w:kern w:val="0"/>
-          <w:sz w:val="22"/>
-          <w:lang w:val="zh-CN"/>
-        </w:rPr>
-        <w:t>核心结论及其直接依据。</w:t>
+        <w:t>合作基石：攻克核心工艺痛点。</w:t>
+      </w:r>
+      <w:r>
+        <w:rPr>
+          <w:rFonts w:ascii="楷体" w:eastAsia="楷体" w:hAnsi="楷体" w:cs="宋体" w:hint="eastAsia"/>
+          <w:bCs/>
+          <w:kern w:val="0"/>
+          <w:sz w:val="22"/>
+          <w:lang w:val="zh-CN"/>
+        </w:rPr>
+        <w:t>双方的合作始于2019年，旨在解决宁德时代在高速涂布工艺中面临的微米级精度控制挑战，这是一个传统设备商无法解决的难题。</w:t>
+      </w:r>
+      <w:proofErr w:type="gramStart"/>
+      <w:r>
+        <w:rPr>
+          <w:rFonts w:ascii="楷体" w:eastAsia="楷体" w:hAnsi="楷体" w:cs="宋体" w:hint="eastAsia"/>
+          <w:bCs/>
+          <w:kern w:val="0"/>
+          <w:sz w:val="22"/>
+          <w:lang w:val="zh-CN"/>
+        </w:rPr>
+        <w:t>安脉</w:t>
+      </w:r>
+      <w:proofErr w:type="gramEnd"/>
+      <w:r>
+        <w:rPr>
+          <w:rFonts w:ascii="楷体" w:eastAsia="楷体" w:hAnsi="楷体" w:cs="宋体" w:hint="eastAsia"/>
+          <w:bCs/>
+          <w:kern w:val="0"/>
+          <w:sz w:val="22"/>
+          <w:lang w:val="zh-CN"/>
+        </w:rPr>
+        <w:t>盛凭借其基于第一性原理而非传统试错法的解题思路，开发的智能模头方案效果立竿见影，由此建立了深厚的信任基础，成为后续所有合作的起点。</w:t>
+      </w:r>
+    </w:p>
+    <w:p>
+      <w:pPr>
+        <w:pStyle w:val="a3"/>
+        <w:numPr>
+          <w:ilvl w:val="0"/>
+          <w:numId w:val="7"/>
+        </w:numPr>
+        <w:spacing w:beforeLines="50" w:before="156" w:afterLines="50" w:after="156"/>
+        <w:ind w:firstLineChars="0"/>
+        <w:rPr>
+          <w:rFonts w:ascii="楷体" w:eastAsia="楷体" w:hAnsi="楷体" w:cs="宋体" w:hint="eastAsia"/>
+          <w:bCs/>
+          <w:kern w:val="0"/>
+          <w:sz w:val="22"/>
+          <w:lang w:val="zh-CN"/>
+        </w:rPr>
+      </w:pPr>
+      <w:r>
+        <w:rPr>
+          <w:rFonts w:ascii="楷体" w:eastAsia="楷体" w:hAnsi="楷体" w:cs="宋体" w:hint="eastAsia"/>
+          <w:b/>
+          <w:kern w:val="0"/>
+          <w:sz w:val="22"/>
+          <w:lang w:val="zh-CN"/>
+        </w:rPr>
+        <w:t>技术拓展：从涂布到全链路控制。</w:t>
+      </w:r>
+      <w:proofErr w:type="gramStart"/>
+      <w:r>
+        <w:rPr>
+          <w:rFonts w:ascii="楷体" w:eastAsia="楷体" w:hAnsi="楷体" w:cs="宋体" w:hint="eastAsia"/>
+          <w:bCs/>
+          <w:kern w:val="0"/>
+          <w:sz w:val="22"/>
+          <w:lang w:val="zh-CN"/>
+        </w:rPr>
+        <w:t>安脉</w:t>
+      </w:r>
+      <w:proofErr w:type="gramEnd"/>
+      <w:r>
+        <w:rPr>
+          <w:rFonts w:ascii="楷体" w:eastAsia="楷体" w:hAnsi="楷体" w:cs="宋体" w:hint="eastAsia"/>
+          <w:bCs/>
+          <w:kern w:val="0"/>
+          <w:sz w:val="22"/>
+          <w:lang w:val="zh-CN"/>
+        </w:rPr>
+        <w:t>盛的精密控制能力从涂布环节成功延伸至后续更复杂的工序。其为辊压工序开发的闭环控制系统将厚度一致性提升了10%，大幅降低了后续卷绕工序的浪费。同时，双方正联合研发技术难度极高的下一代卷绕控制方案，展现了</w:t>
+      </w:r>
+      <w:proofErr w:type="gramStart"/>
+      <w:r>
+        <w:rPr>
+          <w:rFonts w:ascii="楷体" w:eastAsia="楷体" w:hAnsi="楷体" w:cs="宋体" w:hint="eastAsia"/>
+          <w:bCs/>
+          <w:kern w:val="0"/>
+          <w:sz w:val="22"/>
+          <w:lang w:val="zh-CN"/>
+        </w:rPr>
+        <w:t>安脉盛提供产线</w:t>
+      </w:r>
+      <w:proofErr w:type="gramEnd"/>
+      <w:r>
+        <w:rPr>
+          <w:rFonts w:ascii="楷体" w:eastAsia="楷体" w:hAnsi="楷体" w:cs="宋体" w:hint="eastAsia"/>
+          <w:bCs/>
+          <w:kern w:val="0"/>
+          <w:sz w:val="22"/>
+          <w:lang w:val="zh-CN"/>
+        </w:rPr>
+        <w:t>全链路智能控制解决方案的实力。</w:t>
+      </w:r>
+    </w:p>
+    <w:p>
+      <w:pPr>
+        <w:pStyle w:val="a3"/>
+        <w:numPr>
+          <w:ilvl w:val="0"/>
+          <w:numId w:val="7"/>
+        </w:numPr>
+        <w:spacing w:beforeLines="50" w:before="156" w:afterLines="50" w:after="156"/>
+        <w:ind w:firstLineChars="0"/>
+        <w:rPr>
+          <w:rFonts w:ascii="楷体" w:eastAsia="楷体" w:hAnsi="楷体" w:cs="宋体" w:hint="eastAsia"/>
+          <w:bCs/>
+          <w:kern w:val="0"/>
+          <w:sz w:val="22"/>
+          <w:lang w:val="zh-CN"/>
+        </w:rPr>
+      </w:pPr>
+      <w:r>
+        <w:rPr>
+          <w:rFonts w:ascii="楷体" w:eastAsia="楷体" w:hAnsi="楷体" w:cs="宋体" w:hint="eastAsia"/>
+          <w:b/>
+          <w:kern w:val="0"/>
+          <w:sz w:val="22"/>
+          <w:lang w:val="zh-CN"/>
+        </w:rPr>
+        <w:t>视觉检测：POC模式胜出。</w:t>
+      </w:r>
+      <w:r>
+        <w:rPr>
+          <w:rFonts w:ascii="楷体" w:eastAsia="楷体" w:hAnsi="楷体" w:cs="宋体" w:hint="eastAsia"/>
+          <w:bCs/>
+          <w:kern w:val="0"/>
+          <w:sz w:val="22"/>
+          <w:lang w:val="zh-CN"/>
+        </w:rPr>
+        <w:t>在技术要求极为严苛的电</w:t>
+      </w:r>
+      <w:proofErr w:type="gramStart"/>
+      <w:r>
+        <w:rPr>
+          <w:rFonts w:ascii="楷体" w:eastAsia="楷体" w:hAnsi="楷体" w:cs="宋体" w:hint="eastAsia"/>
+          <w:bCs/>
+          <w:kern w:val="0"/>
+          <w:sz w:val="22"/>
+          <w:lang w:val="zh-CN"/>
+        </w:rPr>
+        <w:t>芯最终</w:t>
+      </w:r>
+      <w:proofErr w:type="gramEnd"/>
+      <w:r>
+        <w:rPr>
+          <w:rFonts w:ascii="楷体" w:eastAsia="楷体" w:hAnsi="楷体" w:cs="宋体" w:hint="eastAsia"/>
+          <w:bCs/>
+          <w:kern w:val="0"/>
+          <w:sz w:val="22"/>
+          <w:lang w:val="zh-CN"/>
+        </w:rPr>
+        <w:t>外观检测项目中，宁德时代秉持</w:t>
+      </w:r>
+      <w:proofErr w:type="gramStart"/>
+      <w:r>
+        <w:rPr>
+          <w:rFonts w:ascii="楷体" w:eastAsia="楷体" w:hAnsi="楷体" w:cs="宋体" w:hint="eastAsia"/>
+          <w:bCs/>
+          <w:kern w:val="0"/>
+          <w:sz w:val="22"/>
+          <w:lang w:val="zh-CN"/>
+        </w:rPr>
+        <w:t>无人化碰</w:t>
+      </w:r>
+      <w:proofErr w:type="gramEnd"/>
+      <w:r>
+        <w:rPr>
+          <w:rFonts w:ascii="楷体" w:eastAsia="楷体" w:hAnsi="楷体" w:cs="宋体" w:hint="eastAsia"/>
+          <w:bCs/>
+          <w:kern w:val="0"/>
+          <w:sz w:val="22"/>
+          <w:lang w:val="zh-CN"/>
+        </w:rPr>
+        <w:t>触理念，以POC（概念验证）模式进行招标。</w:t>
+      </w:r>
+      <w:proofErr w:type="gramStart"/>
+      <w:r>
+        <w:rPr>
+          <w:rFonts w:ascii="楷体" w:eastAsia="楷体" w:hAnsi="楷体" w:cs="宋体" w:hint="eastAsia"/>
+          <w:bCs/>
+          <w:kern w:val="0"/>
+          <w:sz w:val="22"/>
+          <w:lang w:val="zh-CN"/>
+        </w:rPr>
+        <w:t>安脉</w:t>
+      </w:r>
+      <w:proofErr w:type="gramEnd"/>
+      <w:r>
+        <w:rPr>
+          <w:rFonts w:ascii="楷体" w:eastAsia="楷体" w:hAnsi="楷体" w:cs="宋体" w:hint="eastAsia"/>
+          <w:bCs/>
+          <w:kern w:val="0"/>
+          <w:sz w:val="22"/>
+          <w:lang w:val="zh-CN"/>
+        </w:rPr>
+        <w:t>盛在与华为、</w:t>
+      </w:r>
+      <w:proofErr w:type="gramStart"/>
+      <w:r>
+        <w:rPr>
+          <w:rFonts w:ascii="楷体" w:eastAsia="楷体" w:hAnsi="楷体" w:cs="宋体" w:hint="eastAsia"/>
+          <w:bCs/>
+          <w:kern w:val="0"/>
+          <w:sz w:val="22"/>
+          <w:lang w:val="zh-CN"/>
+        </w:rPr>
+        <w:t>腾讯等</w:t>
+      </w:r>
+      <w:proofErr w:type="gramEnd"/>
+      <w:r>
+        <w:rPr>
+          <w:rFonts w:ascii="楷体" w:eastAsia="楷体" w:hAnsi="楷体" w:cs="宋体" w:hint="eastAsia"/>
+          <w:bCs/>
+          <w:kern w:val="0"/>
+          <w:sz w:val="22"/>
+          <w:lang w:val="zh-CN"/>
+        </w:rPr>
+        <w:t>行业巨头的竞争中，是唯一成功满足所有复杂技术指标的公司，从而赢得了</w:t>
+      </w:r>
+      <w:proofErr w:type="gramStart"/>
+      <w:r>
+        <w:rPr>
+          <w:rFonts w:ascii="楷体" w:eastAsia="楷体" w:hAnsi="楷体" w:cs="宋体" w:hint="eastAsia"/>
+          <w:bCs/>
+          <w:kern w:val="0"/>
+          <w:sz w:val="22"/>
+          <w:lang w:val="zh-CN"/>
+        </w:rPr>
+        <w:t>该关键</w:t>
+      </w:r>
+      <w:proofErr w:type="gramEnd"/>
+      <w:r>
+        <w:rPr>
+          <w:rFonts w:ascii="楷体" w:eastAsia="楷体" w:hAnsi="楷体" w:cs="宋体" w:hint="eastAsia"/>
+          <w:bCs/>
+          <w:kern w:val="0"/>
+          <w:sz w:val="22"/>
+          <w:lang w:val="zh-CN"/>
+        </w:rPr>
+        <w:t>项目，并将其业务拓展至毛刺、翻折等多个过程检测环节。</w:t>
+      </w:r>
+    </w:p>
+    <w:p>
+      <w:pPr>
+        <w:pStyle w:val="a3"/>
+        <w:numPr>
+          <w:ilvl w:val="0"/>
+          <w:numId w:val="7"/>
+        </w:numPr>
+        <w:spacing w:beforeLines="50" w:before="156" w:afterLines="50" w:after="156"/>
+        <w:ind w:firstLineChars="0"/>
+        <w:rPr>
+          <w:rFonts w:ascii="楷体" w:eastAsia="楷体" w:hAnsi="楷体" w:cs="宋体" w:hint="eastAsia"/>
+          <w:bCs/>
+          <w:kern w:val="0"/>
+          <w:sz w:val="22"/>
+          <w:lang w:val="zh-CN"/>
+        </w:rPr>
+      </w:pPr>
+      <w:r>
+        <w:rPr>
+          <w:rFonts w:ascii="楷体" w:eastAsia="楷体" w:hAnsi="楷体" w:cs="宋体" w:hint="eastAsia"/>
+          <w:b/>
+          <w:kern w:val="0"/>
+          <w:sz w:val="22"/>
+          <w:lang w:val="zh-CN"/>
+        </w:rPr>
+        <w:t>采购策略：定点、</w:t>
+      </w:r>
+      <w:proofErr w:type="gramStart"/>
+      <w:r>
+        <w:rPr>
+          <w:rFonts w:ascii="楷体" w:eastAsia="楷体" w:hAnsi="楷体" w:cs="宋体" w:hint="eastAsia"/>
+          <w:b/>
+          <w:kern w:val="0"/>
+          <w:sz w:val="22"/>
+          <w:lang w:val="zh-CN"/>
+        </w:rPr>
+        <w:t>二供与</w:t>
+      </w:r>
+      <w:proofErr w:type="gramEnd"/>
+      <w:r>
+        <w:rPr>
+          <w:rFonts w:ascii="楷体" w:eastAsia="楷体" w:hAnsi="楷体" w:cs="宋体" w:hint="eastAsia"/>
+          <w:b/>
+          <w:kern w:val="0"/>
+          <w:sz w:val="22"/>
+          <w:lang w:val="zh-CN"/>
+        </w:rPr>
+        <w:t>核心排他</w:t>
+      </w:r>
+      <w:r>
+        <w:rPr>
+          <w:rFonts w:ascii="楷体" w:eastAsia="楷体" w:hAnsi="楷体" w:cs="宋体" w:hint="eastAsia"/>
+          <w:b/>
+          <w:kern w:val="0"/>
+          <w:sz w:val="22"/>
+          <w:lang w:val="zh-CN"/>
+        </w:rPr>
+        <w:t>。</w:t>
+      </w:r>
+      <w:r>
+        <w:rPr>
+          <w:rFonts w:ascii="楷体" w:eastAsia="楷体" w:hAnsi="楷体" w:cs="宋体" w:hint="eastAsia"/>
+          <w:bCs/>
+          <w:kern w:val="0"/>
+          <w:sz w:val="22"/>
+          <w:lang w:val="zh-CN"/>
+        </w:rPr>
+        <w:t>宁德时代的供应商策略兼顾了创新激励与供应链安全。对于</w:t>
+      </w:r>
+      <w:proofErr w:type="gramStart"/>
+      <w:r>
+        <w:rPr>
+          <w:rFonts w:ascii="楷体" w:eastAsia="楷体" w:hAnsi="楷体" w:cs="宋体" w:hint="eastAsia"/>
+          <w:bCs/>
+          <w:kern w:val="0"/>
+          <w:sz w:val="22"/>
+          <w:lang w:val="zh-CN"/>
+        </w:rPr>
+        <w:t>安脉</w:t>
+      </w:r>
+      <w:proofErr w:type="gramEnd"/>
+      <w:r>
+        <w:rPr>
+          <w:rFonts w:ascii="楷体" w:eastAsia="楷体" w:hAnsi="楷体" w:cs="宋体" w:hint="eastAsia"/>
+          <w:bCs/>
+          <w:kern w:val="0"/>
+          <w:sz w:val="22"/>
+          <w:lang w:val="zh-CN"/>
+        </w:rPr>
+        <w:t>盛这类首创技术的厂商，会给予首批定点；待技术成熟后，会积极寻求二供以实现成本优化。但对于集成了宁德时代核心制造Know-how（如6800多个质量控制点）的尖端设备，则会签订排他协议，形成技术护城河。</w:t>
+      </w:r>
+    </w:p>
+    <w:p>
+      <w:pPr>
+        <w:pStyle w:val="a3"/>
+        <w:numPr>
+          <w:ilvl w:val="0"/>
+          <w:numId w:val="7"/>
+        </w:numPr>
+        <w:spacing w:beforeLines="50" w:before="156" w:afterLines="50" w:after="156"/>
+        <w:ind w:firstLineChars="0"/>
+        <w:rPr>
+          <w:rFonts w:ascii="楷体" w:eastAsia="楷体" w:hAnsi="楷体" w:cs="宋体" w:hint="eastAsia"/>
+          <w:bCs/>
+          <w:kern w:val="0"/>
+          <w:sz w:val="22"/>
+          <w:lang w:val="zh-CN"/>
+        </w:rPr>
+      </w:pPr>
+      <w:r>
+        <w:rPr>
+          <w:rFonts w:ascii="楷体" w:eastAsia="楷体" w:hAnsi="楷体" w:cs="宋体" w:hint="eastAsia"/>
+          <w:b/>
+          <w:kern w:val="0"/>
+          <w:sz w:val="22"/>
+          <w:lang w:val="zh-CN"/>
+        </w:rPr>
+        <w:t>交付周期：控制与视觉产品差异</w:t>
+      </w:r>
+      <w:r>
+        <w:rPr>
+          <w:rFonts w:ascii="楷体" w:eastAsia="楷体" w:hAnsi="楷体" w:cs="宋体" w:hint="eastAsia"/>
+          <w:b/>
+          <w:kern w:val="0"/>
+          <w:sz w:val="22"/>
+          <w:lang w:val="zh-CN"/>
+        </w:rPr>
+        <w:t>。</w:t>
+      </w:r>
+      <w:proofErr w:type="gramStart"/>
+      <w:r>
+        <w:rPr>
+          <w:rFonts w:ascii="楷体" w:eastAsia="楷体" w:hAnsi="楷体" w:cs="宋体" w:hint="eastAsia"/>
+          <w:bCs/>
+          <w:kern w:val="0"/>
+          <w:sz w:val="22"/>
+          <w:lang w:val="zh-CN"/>
+        </w:rPr>
+        <w:t>安脉</w:t>
+      </w:r>
+      <w:proofErr w:type="gramEnd"/>
+      <w:r>
+        <w:rPr>
+          <w:rFonts w:ascii="楷体" w:eastAsia="楷体" w:hAnsi="楷体" w:cs="宋体" w:hint="eastAsia"/>
+          <w:bCs/>
+          <w:kern w:val="0"/>
+          <w:sz w:val="22"/>
+          <w:lang w:val="zh-CN"/>
+        </w:rPr>
+        <w:t>盛两类产品的交付验收周期存在显著差异。基于物理机理的智能控制产品（</w:t>
+      </w:r>
+      <w:proofErr w:type="gramStart"/>
+      <w:r>
+        <w:rPr>
+          <w:rFonts w:ascii="楷体" w:eastAsia="楷体" w:hAnsi="楷体" w:cs="宋体" w:hint="eastAsia"/>
+          <w:bCs/>
+          <w:kern w:val="0"/>
+          <w:sz w:val="22"/>
+          <w:lang w:val="zh-CN"/>
+        </w:rPr>
+        <w:t>白盒模型</w:t>
+      </w:r>
+      <w:proofErr w:type="gramEnd"/>
+      <w:r>
+        <w:rPr>
+          <w:rFonts w:ascii="楷体" w:eastAsia="楷体" w:hAnsi="楷体" w:cs="宋体" w:hint="eastAsia"/>
+          <w:bCs/>
+          <w:kern w:val="0"/>
+          <w:sz w:val="22"/>
+          <w:lang w:val="zh-CN"/>
+        </w:rPr>
+        <w:t>）泛化性好，交付快，通常一年内可完成验收。而依赖AI的视觉检测产品（黑盒模型）面对宁德时代多样的定制化产品时，泛化性是巨大挑战，需要漫长的调试与陪产，验收周期可长达一年半。</w:t>
+      </w:r>
+    </w:p>
+    <w:p>
+      <w:pPr>
+        <w:pStyle w:val="a3"/>
+        <w:numPr>
+          <w:ilvl w:val="0"/>
+          <w:numId w:val="7"/>
+        </w:numPr>
+        <w:spacing w:beforeLines="50" w:before="156" w:afterLines="50" w:after="156"/>
+        <w:ind w:firstLineChars="0"/>
+        <w:rPr>
+          <w:rFonts w:ascii="楷体" w:eastAsia="楷体" w:hAnsi="楷体" w:cs="宋体" w:hint="eastAsia"/>
+          <w:bCs/>
+          <w:kern w:val="0"/>
+          <w:sz w:val="22"/>
+          <w:lang w:val="zh-CN"/>
+        </w:rPr>
+      </w:pPr>
+      <w:r>
+        <w:rPr>
+          <w:rFonts w:ascii="楷体" w:eastAsia="楷体" w:hAnsi="楷体" w:cs="宋体" w:hint="eastAsia"/>
+          <w:b/>
+          <w:kern w:val="0"/>
+          <w:sz w:val="22"/>
+          <w:lang w:val="zh-CN"/>
+        </w:rPr>
+        <w:t>发展驱动：极限制造与产能扩张</w:t>
+      </w:r>
+      <w:r>
+        <w:rPr>
+          <w:rFonts w:ascii="楷体" w:eastAsia="楷体" w:hAnsi="楷体" w:cs="宋体" w:hint="eastAsia"/>
+          <w:b/>
+          <w:kern w:val="0"/>
+          <w:sz w:val="22"/>
+          <w:lang w:val="zh-CN"/>
+        </w:rPr>
+        <w:t>。</w:t>
+      </w:r>
+      <w:r>
+        <w:rPr>
+          <w:rFonts w:ascii="楷体" w:eastAsia="楷体" w:hAnsi="楷体" w:cs="宋体" w:hint="eastAsia"/>
+          <w:bCs/>
+          <w:kern w:val="0"/>
+          <w:sz w:val="22"/>
+          <w:lang w:val="zh-CN"/>
+        </w:rPr>
+        <w:t>宁德时代的发展由内部的极限制造理念驱动，追求工艺、质量和效率的极致，并要求合作伙伴达到同等标准。外部则</w:t>
+      </w:r>
+      <w:proofErr w:type="gramStart"/>
+      <w:r>
+        <w:rPr>
+          <w:rFonts w:ascii="楷体" w:eastAsia="楷体" w:hAnsi="楷体" w:cs="宋体" w:hint="eastAsia"/>
+          <w:bCs/>
+          <w:kern w:val="0"/>
+          <w:sz w:val="22"/>
+          <w:lang w:val="zh-CN"/>
+        </w:rPr>
+        <w:t>受重卡和</w:t>
+      </w:r>
+      <w:proofErr w:type="gramEnd"/>
+      <w:r>
+        <w:rPr>
+          <w:rFonts w:ascii="楷体" w:eastAsia="楷体" w:hAnsi="楷体" w:cs="宋体" w:hint="eastAsia"/>
+          <w:bCs/>
+          <w:kern w:val="0"/>
+          <w:sz w:val="22"/>
+          <w:lang w:val="zh-CN"/>
+        </w:rPr>
+        <w:t>储能市场的强劲需求拉动，高端电池供不应求，公司正进行数千亿级别的全球产能扩张，这也为</w:t>
+      </w:r>
+      <w:proofErr w:type="gramStart"/>
+      <w:r>
+        <w:rPr>
+          <w:rFonts w:ascii="楷体" w:eastAsia="楷体" w:hAnsi="楷体" w:cs="宋体" w:hint="eastAsia"/>
+          <w:bCs/>
+          <w:kern w:val="0"/>
+          <w:sz w:val="22"/>
+          <w:lang w:val="zh-CN"/>
+        </w:rPr>
+        <w:t>安脉</w:t>
+      </w:r>
+      <w:proofErr w:type="gramEnd"/>
+      <w:r>
+        <w:rPr>
+          <w:rFonts w:ascii="楷体" w:eastAsia="楷体" w:hAnsi="楷体" w:cs="宋体" w:hint="eastAsia"/>
+          <w:bCs/>
+          <w:kern w:val="0"/>
+          <w:sz w:val="22"/>
+          <w:lang w:val="zh-CN"/>
+        </w:rPr>
+        <w:t>盛等核心供应商带来了巨大的市场机遇。</w:t>
       </w:r>
     </w:p>
     <w:p>
@@ -216,19 +893,17 @@
     <w:p>
       <w:pPr>
         <w:pStyle w:val="1"/>
-        <w:pageBreakBefore/>
+        <w:rPr>
+          <w:rFonts w:hint="eastAsia"/>
+        </w:rPr>
+      </w:pPr>
+      <w:r>
         <w:rPr>
           <w:rFonts w:ascii="Times New Roman" w:hAnsi="Times New Roman" w:cs="Times New Roman"/>
           <w:b/>
           <w:bCs w:val="0"/>
         </w:rPr>
-      </w:pPr>
-      <w:r>
-        <w:rPr>
-          <w:rFonts w:ascii="Times New Roman" w:hAnsi="Times New Roman" w:cs="Times New Roman" w:hint="eastAsia"/>
-          <w:b/>
-          <w:bCs w:val="0"/>
-        </w:rPr>
+        <w:lastRenderedPageBreak/>
         <w:t>访谈纪要</w:t>
       </w:r>
     </w:p>
@@ -257,7 +932,7 @@
           <w:sz w:val="22"/>
           <w:lang w:val="zh-CN"/>
         </w:rPr>
-        <w:t>一级章节标题</w:t>
+        <w:t>合作背景与历程</w:t>
       </w:r>
     </w:p>
     <w:p>
@@ -287,7 +962,18 @@
           <w:sz w:val="22"/>
           <w:lang w:val="zh-CN"/>
         </w:rPr>
-        <w:t>二级标题</w:t>
+        <w:t>冯总</w:t>
+      </w:r>
+      <w:r>
+        <w:rPr>
+          <w:rFonts w:ascii="楷体" w:eastAsia="楷体" w:hAnsi="楷体" w:cs="宋体"/>
+          <w:b/>
+          <w:bCs/>
+          <w:kern w:val="0"/>
+          <w:sz w:val="22"/>
+          <w:lang w:val="zh-CN"/>
+        </w:rPr>
+        <w:t>背景与职责</w:t>
       </w:r>
     </w:p>
     <w:p>
@@ -315,16 +1001,4041 @@
           <w:sz w:val="22"/>
           <w:lang w:val="zh-CN"/>
         </w:rPr>
-        <w:t>要点引导语：</w:t>
-      </w:r>
-      <w:r>
-        <w:rPr>
-          <w:rFonts w:ascii="楷体" w:eastAsia="楷体" w:hAnsi="楷体" w:cs="宋体" w:hint="eastAsia"/>
-          <w:kern w:val="0"/>
-          <w:sz w:val="22"/>
-          <w:lang w:val="zh-CN"/>
-        </w:rPr>
-        <w:t>要点正文。</w:t>
+        <w:t>职业履历与转型：</w:t>
+      </w:r>
+      <w:r>
+        <w:rPr>
+          <w:rFonts w:ascii="楷体" w:eastAsia="楷体" w:hAnsi="楷体" w:cs="宋体" w:hint="eastAsia"/>
+          <w:kern w:val="0"/>
+          <w:sz w:val="22"/>
+          <w:lang w:val="zh-CN"/>
+        </w:rPr>
+        <w:t>冯总</w:t>
+      </w:r>
+      <w:r>
+        <w:rPr>
+          <w:rFonts w:ascii="楷体" w:eastAsia="楷体" w:hAnsi="楷体" w:cs="宋体" w:hint="eastAsia"/>
+          <w:kern w:val="0"/>
+          <w:sz w:val="22"/>
+          <w:lang w:val="zh-CN"/>
+        </w:rPr>
+        <w:t>于2014年加入宁德时代，最初五年在IT部负责信息化和系统化建设，完成了IT部门几乎所有系统的构建。之后，为更深入地解决公司在制造领域的实际问题，主动从IT部转入生产部，直接接管一个工厂并担任厂长。</w:t>
+      </w:r>
+    </w:p>
+    <w:p>
+      <w:pPr>
+        <w:pStyle w:val="a3"/>
+        <w:numPr>
+          <w:ilvl w:val="1"/>
+          <w:numId w:val="4"/>
+        </w:numPr>
+        <w:spacing w:beforeLines="50" w:before="156"/>
+        <w:ind w:firstLineChars="0"/>
+        <w:rPr>
+          <w:rFonts w:ascii="楷体" w:eastAsia="楷体" w:hAnsi="楷体" w:cs="宋体" w:hint="eastAsia"/>
+          <w:kern w:val="0"/>
+          <w:sz w:val="22"/>
+          <w:lang w:val="zh-CN"/>
+        </w:rPr>
+      </w:pPr>
+      <w:r>
+        <w:rPr>
+          <w:rFonts w:ascii="楷体" w:eastAsia="楷体" w:hAnsi="楷体" w:cs="宋体" w:hint="eastAsia"/>
+          <w:b/>
+          <w:bCs/>
+          <w:kern w:val="0"/>
+          <w:sz w:val="22"/>
+          <w:lang w:val="zh-CN"/>
+        </w:rPr>
+        <w:t>多重角色的融合：</w:t>
+      </w:r>
+      <w:r>
+        <w:rPr>
+          <w:rFonts w:ascii="楷体" w:eastAsia="楷体" w:hAnsi="楷体" w:cs="宋体" w:hint="eastAsia"/>
+          <w:kern w:val="0"/>
+          <w:sz w:val="22"/>
+          <w:lang w:val="zh-CN"/>
+        </w:rPr>
+        <w:t>在管理工厂的同时，凭借其数字化背景，还牵头负责工厂的数字化、智能化工作，并接管了精益生产部。在实践中，发现生产过程存在许多不精益之处，便着手进行改善。后续，将精益生产部与工业工程部合并，并亲自调至工业工程部。</w:t>
+      </w:r>
+    </w:p>
+    <w:p>
+      <w:pPr>
+        <w:pStyle w:val="a3"/>
+        <w:numPr>
+          <w:ilvl w:val="1"/>
+          <w:numId w:val="4"/>
+        </w:numPr>
+        <w:spacing w:beforeLines="50" w:before="156"/>
+        <w:ind w:firstLineChars="0"/>
+        <w:rPr>
+          <w:rFonts w:ascii="楷体" w:eastAsia="楷体" w:hAnsi="楷体" w:cs="宋体" w:hint="eastAsia"/>
+          <w:kern w:val="0"/>
+          <w:sz w:val="22"/>
+          <w:lang w:val="zh-CN"/>
+        </w:rPr>
+      </w:pPr>
+      <w:r>
+        <w:rPr>
+          <w:rFonts w:ascii="楷体" w:eastAsia="楷体" w:hAnsi="楷体" w:cs="宋体" w:hint="eastAsia"/>
+          <w:b/>
+          <w:bCs/>
+          <w:kern w:val="0"/>
+          <w:sz w:val="22"/>
+          <w:lang w:val="zh-CN"/>
+        </w:rPr>
+        <w:t>创立智能工厂部：</w:t>
+      </w:r>
+      <w:r>
+        <w:rPr>
+          <w:rFonts w:ascii="楷体" w:eastAsia="楷体" w:hAnsi="楷体" w:cs="宋体" w:hint="eastAsia"/>
+          <w:kern w:val="0"/>
+          <w:sz w:val="22"/>
+          <w:lang w:val="zh-CN"/>
+        </w:rPr>
+        <w:t>随着智能制造的重要性日益凸显，</w:t>
+      </w:r>
+      <w:r>
+        <w:rPr>
+          <w:rFonts w:ascii="楷体" w:eastAsia="楷体" w:hAnsi="楷体" w:cs="宋体" w:hint="eastAsia"/>
+          <w:kern w:val="0"/>
+          <w:sz w:val="22"/>
+          <w:lang w:val="zh-CN"/>
+        </w:rPr>
+        <w:t>冯总</w:t>
+      </w:r>
+      <w:r>
+        <w:rPr>
+          <w:rFonts w:ascii="楷体" w:eastAsia="楷体" w:hAnsi="楷体" w:cs="宋体" w:hint="eastAsia"/>
+          <w:kern w:val="0"/>
+          <w:sz w:val="22"/>
+          <w:lang w:val="zh-CN"/>
+        </w:rPr>
+        <w:t>被独立出来，成立了智能工厂部。该部门主导了宁德时代三座灯塔工厂的建设，全面负责制造相关的数字化、智能化和自动化项目。</w:t>
+      </w:r>
+    </w:p>
+    <w:p>
+      <w:pPr>
+        <w:pStyle w:val="a3"/>
+        <w:numPr>
+          <w:ilvl w:val="1"/>
+          <w:numId w:val="4"/>
+        </w:numPr>
+        <w:spacing w:beforeLines="50" w:before="156"/>
+        <w:ind w:firstLineChars="0"/>
+        <w:rPr>
+          <w:rFonts w:ascii="楷体" w:eastAsia="楷体" w:hAnsi="楷体" w:cs="宋体" w:hint="eastAsia"/>
+          <w:kern w:val="0"/>
+          <w:sz w:val="22"/>
+          <w:lang w:val="zh-CN"/>
+        </w:rPr>
+      </w:pPr>
+      <w:r>
+        <w:rPr>
+          <w:rFonts w:ascii="楷体" w:eastAsia="楷体" w:hAnsi="楷体" w:cs="宋体" w:hint="eastAsia"/>
+          <w:b/>
+          <w:bCs/>
+          <w:kern w:val="0"/>
+          <w:sz w:val="22"/>
+          <w:lang w:val="zh-CN"/>
+        </w:rPr>
+        <w:t>重返IT部门：</w:t>
+      </w:r>
+      <w:r>
+        <w:rPr>
+          <w:rFonts w:ascii="楷体" w:eastAsia="楷体" w:hAnsi="楷体" w:cs="宋体" w:hint="eastAsia"/>
+          <w:kern w:val="0"/>
+          <w:sz w:val="22"/>
+          <w:lang w:val="zh-CN"/>
+        </w:rPr>
+        <w:t>2024年11月5日，</w:t>
+      </w:r>
+      <w:r>
+        <w:rPr>
+          <w:rFonts w:ascii="楷体" w:eastAsia="楷体" w:hAnsi="楷体" w:cs="宋体" w:hint="eastAsia"/>
+          <w:kern w:val="0"/>
+          <w:sz w:val="22"/>
+          <w:lang w:val="zh-CN"/>
+        </w:rPr>
+        <w:t>冯总</w:t>
+      </w:r>
+      <w:r>
+        <w:rPr>
+          <w:rFonts w:ascii="楷体" w:eastAsia="楷体" w:hAnsi="楷体" w:cs="宋体" w:hint="eastAsia"/>
+          <w:kern w:val="0"/>
+          <w:sz w:val="22"/>
+          <w:lang w:val="zh-CN"/>
+        </w:rPr>
+        <w:t>再次回到IT部，负责整个IT的工作，初期直接向董事长汇报，并有一条线向</w:t>
+      </w:r>
+      <w:r>
+        <w:rPr>
+          <w:rFonts w:ascii="楷体" w:eastAsia="楷体" w:hAnsi="楷体" w:cs="宋体" w:hint="eastAsia"/>
+          <w:kern w:val="0"/>
+          <w:sz w:val="22"/>
+          <w:lang w:val="zh-CN"/>
+        </w:rPr>
+        <w:t>对应负责人</w:t>
+      </w:r>
+      <w:r>
+        <w:rPr>
+          <w:rFonts w:ascii="楷体" w:eastAsia="楷体" w:hAnsi="楷体" w:cs="宋体" w:hint="eastAsia"/>
+          <w:kern w:val="0"/>
+          <w:sz w:val="22"/>
+          <w:lang w:val="zh-CN"/>
+        </w:rPr>
+        <w:t>汇报。目前，公司从外部聘请了IT部长，</w:t>
+      </w:r>
+      <w:r>
+        <w:rPr>
+          <w:rFonts w:ascii="楷体" w:eastAsia="楷体" w:hAnsi="楷体" w:cs="宋体" w:hint="eastAsia"/>
+          <w:kern w:val="0"/>
+          <w:sz w:val="22"/>
+          <w:lang w:val="zh-CN"/>
+        </w:rPr>
+        <w:t>冯总</w:t>
+      </w:r>
+      <w:r>
+        <w:rPr>
+          <w:rFonts w:ascii="楷体" w:eastAsia="楷体" w:hAnsi="楷体" w:cs="宋体" w:hint="eastAsia"/>
+          <w:kern w:val="0"/>
+          <w:sz w:val="22"/>
+          <w:lang w:val="zh-CN"/>
+        </w:rPr>
+        <w:t>担任IT副部长。</w:t>
+      </w:r>
+    </w:p>
+    <w:p>
+      <w:pPr>
+        <w:pStyle w:val="a3"/>
+        <w:numPr>
+          <w:ilvl w:val="1"/>
+          <w:numId w:val="10"/>
+        </w:numPr>
+        <w:spacing w:beforeLines="50" w:before="156"/>
+        <w:ind w:firstLineChars="0"/>
+        <w:rPr>
+          <w:rFonts w:ascii="楷体" w:eastAsia="楷体" w:hAnsi="楷体" w:cs="宋体" w:hint="eastAsia"/>
+          <w:b/>
+          <w:bCs/>
+          <w:kern w:val="0"/>
+          <w:sz w:val="22"/>
+          <w:lang w:val="zh-CN"/>
+        </w:rPr>
+      </w:pPr>
+      <w:r>
+        <w:rPr>
+          <w:rFonts w:ascii="楷体" w:eastAsia="楷体" w:hAnsi="楷体" w:cs="宋体"/>
+          <w:b/>
+          <w:bCs/>
+          <w:kern w:val="0"/>
+          <w:sz w:val="22"/>
+          <w:lang w:val="zh-CN"/>
+        </w:rPr>
+        <w:t>与</w:t>
+      </w:r>
+      <w:proofErr w:type="gramStart"/>
+      <w:r>
+        <w:rPr>
+          <w:rFonts w:ascii="楷体" w:eastAsia="楷体" w:hAnsi="楷体" w:cs="宋体"/>
+          <w:b/>
+          <w:bCs/>
+          <w:kern w:val="0"/>
+          <w:sz w:val="22"/>
+          <w:lang w:val="zh-CN"/>
+        </w:rPr>
+        <w:t>安脉</w:t>
+      </w:r>
+      <w:proofErr w:type="gramEnd"/>
+      <w:r>
+        <w:rPr>
+          <w:rFonts w:ascii="楷体" w:eastAsia="楷体" w:hAnsi="楷体" w:cs="宋体"/>
+          <w:b/>
+          <w:bCs/>
+          <w:kern w:val="0"/>
+          <w:sz w:val="22"/>
+          <w:lang w:val="zh-CN"/>
+        </w:rPr>
+        <w:t>盛的初次接触与合作确立</w:t>
+      </w:r>
+    </w:p>
+    <w:p>
+      <w:pPr>
+        <w:pStyle w:val="a3"/>
+        <w:numPr>
+          <w:ilvl w:val="1"/>
+          <w:numId w:val="4"/>
+        </w:numPr>
+        <w:spacing w:beforeLines="50" w:before="156"/>
+        <w:ind w:firstLineChars="0"/>
+        <w:rPr>
+          <w:rFonts w:ascii="楷体" w:eastAsia="楷体" w:hAnsi="楷体" w:cs="宋体" w:hint="eastAsia"/>
+          <w:kern w:val="0"/>
+          <w:sz w:val="22"/>
+          <w:lang w:val="zh-CN"/>
+        </w:rPr>
+      </w:pPr>
+      <w:r>
+        <w:rPr>
+          <w:rFonts w:ascii="楷体" w:eastAsia="楷体" w:hAnsi="楷体" w:cs="宋体" w:hint="eastAsia"/>
+          <w:b/>
+          <w:bCs/>
+          <w:kern w:val="0"/>
+          <w:sz w:val="22"/>
+          <w:lang w:val="zh-CN"/>
+        </w:rPr>
+        <w:t>接触契机：</w:t>
+      </w:r>
+      <w:r>
+        <w:rPr>
+          <w:rFonts w:ascii="楷体" w:eastAsia="楷体" w:hAnsi="楷体" w:cs="宋体" w:hint="eastAsia"/>
+          <w:kern w:val="0"/>
+          <w:sz w:val="22"/>
+          <w:lang w:val="zh-CN"/>
+        </w:rPr>
+        <w:t>2019年，</w:t>
+      </w:r>
+      <w:r>
+        <w:rPr>
+          <w:rFonts w:ascii="楷体" w:eastAsia="楷体" w:hAnsi="楷体" w:cs="宋体" w:hint="eastAsia"/>
+          <w:kern w:val="0"/>
+          <w:sz w:val="22"/>
+          <w:lang w:val="zh-CN"/>
+        </w:rPr>
+        <w:t>冯总</w:t>
+      </w:r>
+      <w:r>
+        <w:rPr>
+          <w:rFonts w:ascii="楷体" w:eastAsia="楷体" w:hAnsi="楷体" w:cs="宋体" w:hint="eastAsia"/>
+          <w:kern w:val="0"/>
+          <w:sz w:val="22"/>
+          <w:lang w:val="zh-CN"/>
+        </w:rPr>
+        <w:t>刚调入生产部门不久，了解到杭州有一家从事智能制造的公司</w:t>
+      </w:r>
+      <w:proofErr w:type="gramStart"/>
+      <w:r>
+        <w:rPr>
+          <w:rFonts w:ascii="楷体" w:eastAsia="楷体" w:hAnsi="楷体" w:cs="宋体" w:hint="eastAsia"/>
+          <w:kern w:val="0"/>
+          <w:sz w:val="22"/>
+          <w:lang w:val="zh-CN"/>
+        </w:rPr>
+        <w:t>安脉</w:t>
+      </w:r>
+      <w:proofErr w:type="gramEnd"/>
+      <w:r>
+        <w:rPr>
+          <w:rFonts w:ascii="楷体" w:eastAsia="楷体" w:hAnsi="楷体" w:cs="宋体" w:hint="eastAsia"/>
+          <w:kern w:val="0"/>
+          <w:sz w:val="22"/>
+          <w:lang w:val="zh-CN"/>
+        </w:rPr>
+        <w:t>盛。这次接触非常巧合，是</w:t>
+      </w:r>
+      <w:r>
+        <w:rPr>
+          <w:rFonts w:ascii="楷体" w:eastAsia="楷体" w:hAnsi="楷体" w:cs="宋体" w:hint="eastAsia"/>
+          <w:kern w:val="0"/>
+          <w:sz w:val="22"/>
+          <w:lang w:val="zh-CN"/>
+        </w:rPr>
+        <w:t>冯总</w:t>
+      </w:r>
+      <w:r>
+        <w:rPr>
+          <w:rFonts w:ascii="楷体" w:eastAsia="楷体" w:hAnsi="楷体" w:cs="宋体" w:hint="eastAsia"/>
+          <w:kern w:val="0"/>
+          <w:sz w:val="22"/>
+          <w:lang w:val="zh-CN"/>
+        </w:rPr>
+        <w:t>深入一线寻找制造难题解决方案过程中的一个</w:t>
+      </w:r>
+      <w:r>
+        <w:rPr>
+          <w:rFonts w:ascii="楷体" w:eastAsia="楷体" w:hAnsi="楷体" w:cs="宋体" w:hint="eastAsia"/>
+          <w:kern w:val="0"/>
+          <w:sz w:val="22"/>
+          <w:lang w:val="zh-CN"/>
+        </w:rPr>
+        <w:t>重要伏笔</w:t>
+      </w:r>
+      <w:r>
+        <w:rPr>
+          <w:rFonts w:ascii="楷体" w:eastAsia="楷体" w:hAnsi="楷体" w:cs="宋体" w:hint="eastAsia"/>
+          <w:kern w:val="0"/>
+          <w:sz w:val="22"/>
+          <w:lang w:val="zh-CN"/>
+        </w:rPr>
+        <w:t>。</w:t>
+      </w:r>
+    </w:p>
+    <w:p>
+      <w:pPr>
+        <w:pStyle w:val="a3"/>
+        <w:numPr>
+          <w:ilvl w:val="1"/>
+          <w:numId w:val="4"/>
+        </w:numPr>
+        <w:spacing w:beforeLines="50" w:before="156"/>
+        <w:ind w:firstLineChars="0"/>
+        <w:rPr>
+          <w:rFonts w:ascii="楷体" w:eastAsia="楷体" w:hAnsi="楷体" w:cs="宋体" w:hint="eastAsia"/>
+          <w:kern w:val="0"/>
+          <w:sz w:val="22"/>
+          <w:lang w:val="zh-CN"/>
+        </w:rPr>
+      </w:pPr>
+      <w:proofErr w:type="gramStart"/>
+      <w:r>
+        <w:rPr>
+          <w:rFonts w:ascii="楷体" w:eastAsia="楷体" w:hAnsi="楷体" w:cs="宋体" w:hint="eastAsia"/>
+          <w:b/>
+          <w:bCs/>
+          <w:kern w:val="0"/>
+          <w:sz w:val="22"/>
+          <w:lang w:val="zh-CN"/>
+        </w:rPr>
+        <w:t>双维度</w:t>
+      </w:r>
+      <w:proofErr w:type="gramEnd"/>
+      <w:r>
+        <w:rPr>
+          <w:rFonts w:ascii="楷体" w:eastAsia="楷体" w:hAnsi="楷体" w:cs="宋体" w:hint="eastAsia"/>
+          <w:b/>
+          <w:bCs/>
+          <w:kern w:val="0"/>
+          <w:sz w:val="22"/>
+          <w:lang w:val="zh-CN"/>
+        </w:rPr>
+        <w:t>考察：</w:t>
+      </w:r>
+      <w:r>
+        <w:rPr>
+          <w:rFonts w:ascii="楷体" w:eastAsia="楷体" w:hAnsi="楷体" w:cs="宋体" w:hint="eastAsia"/>
+          <w:kern w:val="0"/>
+          <w:sz w:val="22"/>
+          <w:lang w:val="zh-CN"/>
+        </w:rPr>
+        <w:t>公司随即组织了一次考察，由公司的投资负责人和</w:t>
+      </w:r>
+      <w:proofErr w:type="gramStart"/>
+      <w:r>
+        <w:rPr>
+          <w:rFonts w:ascii="楷体" w:eastAsia="楷体" w:hAnsi="楷体" w:cs="宋体" w:hint="eastAsia"/>
+          <w:kern w:val="0"/>
+          <w:sz w:val="22"/>
+          <w:lang w:val="zh-CN"/>
+        </w:rPr>
+        <w:t>冯</w:t>
+      </w:r>
+      <w:proofErr w:type="gramEnd"/>
+      <w:r>
+        <w:rPr>
+          <w:rFonts w:ascii="楷体" w:eastAsia="楷体" w:hAnsi="楷体" w:cs="宋体" w:hint="eastAsia"/>
+          <w:kern w:val="0"/>
+          <w:sz w:val="22"/>
+          <w:lang w:val="zh-CN"/>
+        </w:rPr>
+        <w:t>总</w:t>
+      </w:r>
+      <w:r>
+        <w:rPr>
+          <w:rFonts w:ascii="楷体" w:eastAsia="楷体" w:hAnsi="楷体" w:cs="宋体" w:hint="eastAsia"/>
+          <w:kern w:val="0"/>
+          <w:sz w:val="22"/>
+          <w:lang w:val="zh-CN"/>
+        </w:rPr>
+        <w:t>共同参与。投资负责人从资本角度评估其价值，而</w:t>
+      </w:r>
+      <w:proofErr w:type="gramStart"/>
+      <w:r>
+        <w:rPr>
+          <w:rFonts w:ascii="楷体" w:eastAsia="楷体" w:hAnsi="楷体" w:cs="宋体" w:hint="eastAsia"/>
+          <w:kern w:val="0"/>
+          <w:sz w:val="22"/>
+          <w:lang w:val="zh-CN"/>
+        </w:rPr>
+        <w:t>冯</w:t>
+      </w:r>
+      <w:proofErr w:type="gramEnd"/>
+      <w:r>
+        <w:rPr>
+          <w:rFonts w:ascii="楷体" w:eastAsia="楷体" w:hAnsi="楷体" w:cs="宋体" w:hint="eastAsia"/>
+          <w:kern w:val="0"/>
+          <w:sz w:val="22"/>
+          <w:lang w:val="zh-CN"/>
+        </w:rPr>
+        <w:t>总</w:t>
+      </w:r>
+      <w:r>
+        <w:rPr>
+          <w:rFonts w:ascii="楷体" w:eastAsia="楷体" w:hAnsi="楷体" w:cs="宋体" w:hint="eastAsia"/>
+          <w:kern w:val="0"/>
+          <w:sz w:val="22"/>
+          <w:lang w:val="zh-CN"/>
+        </w:rPr>
+        <w:t>则从产业和技术的维度评估其能力和解决方案的可行性。这是双方合作的开端。</w:t>
+      </w:r>
+    </w:p>
+    <w:p>
+      <w:pPr>
+        <w:pStyle w:val="a3"/>
+        <w:numPr>
+          <w:ilvl w:val="1"/>
+          <w:numId w:val="4"/>
+        </w:numPr>
+        <w:spacing w:beforeLines="50" w:before="156"/>
+        <w:ind w:firstLineChars="0"/>
+        <w:rPr>
+          <w:rFonts w:ascii="楷体" w:eastAsia="楷体" w:hAnsi="楷体" w:cs="宋体" w:hint="eastAsia"/>
+          <w:kern w:val="0"/>
+          <w:sz w:val="22"/>
+          <w:lang w:val="zh-CN"/>
+        </w:rPr>
+      </w:pPr>
+      <w:r>
+        <w:rPr>
+          <w:rFonts w:ascii="楷体" w:eastAsia="楷体" w:hAnsi="楷体" w:cs="宋体" w:hint="eastAsia"/>
+          <w:b/>
+          <w:bCs/>
+          <w:kern w:val="0"/>
+          <w:sz w:val="22"/>
+          <w:lang w:val="zh-CN"/>
+        </w:rPr>
+        <w:t>合作模式：</w:t>
+      </w:r>
+      <w:r>
+        <w:rPr>
+          <w:rFonts w:ascii="楷体" w:eastAsia="楷体" w:hAnsi="楷体" w:cs="宋体" w:hint="eastAsia"/>
+          <w:kern w:val="0"/>
+          <w:sz w:val="22"/>
+          <w:lang w:val="zh-CN"/>
+        </w:rPr>
+        <w:t>合作始于顶层的双向洽谈，即投资与产业从一开始就同步介入，共同评估与推进。</w:t>
+      </w:r>
+    </w:p>
+    <w:p>
+      <w:pPr>
+        <w:spacing w:beforeLines="50" w:before="156"/>
+        <w:rPr>
+          <w:rFonts w:ascii="楷体" w:eastAsia="楷体" w:hAnsi="楷体" w:cs="宋体" w:hint="eastAsia"/>
+          <w:kern w:val="0"/>
+          <w:sz w:val="22"/>
+          <w:lang w:val="zh-CN"/>
+        </w:rPr>
+      </w:pPr>
+    </w:p>
+    <w:p>
+      <w:pPr>
+        <w:pStyle w:val="a3"/>
+        <w:numPr>
+          <w:ilvl w:val="0"/>
+          <w:numId w:val="13"/>
+        </w:numPr>
+        <w:spacing w:beforeLines="50" w:before="156" w:afterLines="50" w:after="156"/>
+        <w:ind w:left="357" w:firstLineChars="0" w:hanging="357"/>
+        <w:rPr>
+          <w:rFonts w:ascii="楷体" w:eastAsia="楷体" w:hAnsi="楷体" w:cs="宋体" w:hint="eastAsia"/>
+          <w:b/>
+          <w:kern w:val="0"/>
+          <w:sz w:val="22"/>
+          <w:lang w:val="zh-CN"/>
+        </w:rPr>
+      </w:pPr>
+      <w:r>
+        <w:rPr>
+          <w:rFonts w:ascii="楷体" w:eastAsia="楷体" w:hAnsi="楷体" w:cs="宋体"/>
+          <w:b/>
+          <w:kern w:val="0"/>
+          <w:sz w:val="22"/>
+          <w:lang w:val="zh-CN"/>
+        </w:rPr>
+        <w:t>智能控制：从涂布到卷绕的全链路难题攻克</w:t>
+      </w:r>
+    </w:p>
+    <w:p>
+      <w:pPr>
+        <w:pStyle w:val="a3"/>
+        <w:numPr>
+          <w:ilvl w:val="1"/>
+          <w:numId w:val="10"/>
+        </w:numPr>
+        <w:spacing w:beforeLines="50" w:before="156"/>
+        <w:ind w:firstLineChars="0"/>
+        <w:rPr>
+          <w:rFonts w:ascii="楷体" w:eastAsia="楷体" w:hAnsi="楷体" w:cs="宋体" w:hint="eastAsia"/>
+          <w:b/>
+          <w:bCs/>
+          <w:kern w:val="0"/>
+          <w:sz w:val="22"/>
+          <w:lang w:val="zh-CN"/>
+        </w:rPr>
+      </w:pPr>
+      <w:r>
+        <w:rPr>
+          <w:rFonts w:ascii="楷体" w:eastAsia="楷体" w:hAnsi="楷体" w:cs="宋体"/>
+          <w:b/>
+          <w:bCs/>
+          <w:kern w:val="0"/>
+          <w:sz w:val="22"/>
+          <w:lang w:val="zh-CN"/>
+        </w:rPr>
+        <w:t>涂布工序：从不可能的任务到标配方案</w:t>
+      </w:r>
+    </w:p>
+    <w:p>
+      <w:pPr>
+        <w:pStyle w:val="a3"/>
+        <w:numPr>
+          <w:ilvl w:val="1"/>
+          <w:numId w:val="4"/>
+        </w:numPr>
+        <w:spacing w:beforeLines="50" w:before="156"/>
+        <w:ind w:firstLineChars="0"/>
+        <w:rPr>
+          <w:rFonts w:ascii="楷体" w:eastAsia="楷体" w:hAnsi="楷体" w:cs="宋体" w:hint="eastAsia"/>
+          <w:kern w:val="0"/>
+          <w:sz w:val="22"/>
+          <w:lang w:val="zh-CN"/>
+        </w:rPr>
+      </w:pPr>
+      <w:r>
+        <w:rPr>
+          <w:rFonts w:ascii="楷体" w:eastAsia="楷体" w:hAnsi="楷体" w:cs="宋体" w:hint="eastAsia"/>
+          <w:b/>
+          <w:bCs/>
+          <w:kern w:val="0"/>
+          <w:sz w:val="22"/>
+          <w:lang w:val="zh-CN"/>
+        </w:rPr>
+        <w:t>核心痛点：</w:t>
+      </w:r>
+      <w:r>
+        <w:rPr>
+          <w:rFonts w:ascii="楷体" w:eastAsia="楷体" w:hAnsi="楷体" w:cs="宋体" w:hint="eastAsia"/>
+          <w:kern w:val="0"/>
+          <w:sz w:val="22"/>
+          <w:lang w:val="zh-CN"/>
+        </w:rPr>
+        <w:t>宁德时代的首要难题出现在涂布工序。该工序要求在100米/分钟的高速下，将浆料均匀涂覆于1.4米宽的薄铜箔和铝箔上，厚度误差需控制在±1微米以内。传统设备完全依赖人工调节，不仅精度差，且调节响应滞后，无法满足要求。该问题在当时业界，尤其在中国，没有现成的解决方案。</w:t>
+      </w:r>
+    </w:p>
+    <w:p>
+      <w:pPr>
+        <w:pStyle w:val="a3"/>
+        <w:numPr>
+          <w:ilvl w:val="1"/>
+          <w:numId w:val="4"/>
+        </w:numPr>
+        <w:spacing w:beforeLines="50" w:before="156"/>
+        <w:ind w:firstLineChars="0"/>
+        <w:rPr>
+          <w:rFonts w:ascii="楷体" w:eastAsia="楷体" w:hAnsi="楷体" w:cs="宋体" w:hint="eastAsia"/>
+          <w:kern w:val="0"/>
+          <w:sz w:val="22"/>
+          <w:lang w:val="zh-CN"/>
+        </w:rPr>
+      </w:pPr>
+      <w:proofErr w:type="gramStart"/>
+      <w:r>
+        <w:rPr>
+          <w:rFonts w:ascii="楷体" w:eastAsia="楷体" w:hAnsi="楷体" w:cs="宋体" w:hint="eastAsia"/>
+          <w:b/>
+          <w:bCs/>
+          <w:kern w:val="0"/>
+          <w:sz w:val="22"/>
+          <w:lang w:val="zh-CN"/>
+        </w:rPr>
+        <w:t>安脉</w:t>
+      </w:r>
+      <w:proofErr w:type="gramEnd"/>
+      <w:r>
+        <w:rPr>
+          <w:rFonts w:ascii="楷体" w:eastAsia="楷体" w:hAnsi="楷体" w:cs="宋体" w:hint="eastAsia"/>
+          <w:b/>
+          <w:bCs/>
+          <w:kern w:val="0"/>
+          <w:sz w:val="22"/>
+          <w:lang w:val="zh-CN"/>
+        </w:rPr>
+        <w:t>盛的独特方法论：</w:t>
+      </w:r>
+      <w:r>
+        <w:rPr>
+          <w:rFonts w:ascii="楷体" w:eastAsia="楷体" w:hAnsi="楷体" w:cs="宋体" w:hint="eastAsia"/>
+          <w:kern w:val="0"/>
+          <w:sz w:val="22"/>
+          <w:lang w:val="zh-CN"/>
+        </w:rPr>
+        <w:t>与传统试错法不同，</w:t>
+      </w:r>
+      <w:proofErr w:type="gramStart"/>
+      <w:r>
+        <w:rPr>
+          <w:rFonts w:ascii="楷体" w:eastAsia="楷体" w:hAnsi="楷体" w:cs="宋体" w:hint="eastAsia"/>
+          <w:kern w:val="0"/>
+          <w:sz w:val="22"/>
+          <w:lang w:val="zh-CN"/>
+        </w:rPr>
+        <w:t>安脉</w:t>
+      </w:r>
+      <w:proofErr w:type="gramEnd"/>
+      <w:r>
+        <w:rPr>
+          <w:rFonts w:ascii="楷体" w:eastAsia="楷体" w:hAnsi="楷体" w:cs="宋体" w:hint="eastAsia"/>
+          <w:kern w:val="0"/>
+          <w:sz w:val="22"/>
+          <w:lang w:val="zh-CN"/>
+        </w:rPr>
+        <w:t>盛的核心优势在于从第一性原理出发。他们首先深入分析问题产生的物理机理，再设计最恰当的解决方案。</w:t>
+      </w:r>
+    </w:p>
+    <w:p>
+      <w:pPr>
+        <w:pStyle w:val="a3"/>
+        <w:numPr>
+          <w:ilvl w:val="1"/>
+          <w:numId w:val="4"/>
+        </w:numPr>
+        <w:spacing w:beforeLines="50" w:before="156"/>
+        <w:ind w:firstLineChars="0"/>
+        <w:rPr>
+          <w:rFonts w:ascii="楷体" w:eastAsia="楷体" w:hAnsi="楷体" w:cs="宋体" w:hint="eastAsia"/>
+          <w:b/>
+          <w:bCs/>
+          <w:kern w:val="0"/>
+          <w:sz w:val="22"/>
+          <w:lang w:val="zh-CN"/>
+        </w:rPr>
+      </w:pPr>
+      <w:r>
+        <w:rPr>
+          <w:rFonts w:ascii="楷体" w:eastAsia="楷体" w:hAnsi="楷体" w:cs="宋体" w:hint="eastAsia"/>
+          <w:b/>
+          <w:bCs/>
+          <w:kern w:val="0"/>
+          <w:sz w:val="22"/>
+          <w:lang w:val="zh-CN"/>
+        </w:rPr>
+        <w:t>智能模头的诞生与原理：</w:t>
+      </w:r>
+    </w:p>
+    <w:p>
+      <w:pPr>
+        <w:pStyle w:val="a3"/>
+        <w:numPr>
+          <w:ilvl w:val="1"/>
+          <w:numId w:val="12"/>
+        </w:numPr>
+        <w:spacing w:beforeLines="50" w:before="156"/>
+        <w:ind w:left="1276" w:firstLineChars="0"/>
+        <w:rPr>
+          <w:rFonts w:ascii="楷体" w:eastAsia="楷体" w:hAnsi="楷体" w:cs="宋体" w:hint="eastAsia"/>
+          <w:kern w:val="0"/>
+          <w:sz w:val="22"/>
+          <w:lang w:val="zh-CN"/>
+        </w:rPr>
+      </w:pPr>
+      <w:r>
+        <w:rPr>
+          <w:rFonts w:ascii="楷体" w:eastAsia="楷体" w:hAnsi="楷体" w:cs="宋体" w:hint="eastAsia"/>
+          <w:b/>
+          <w:bCs/>
+          <w:kern w:val="0"/>
+          <w:sz w:val="22"/>
+          <w:lang w:val="zh-CN"/>
+        </w:rPr>
+        <w:lastRenderedPageBreak/>
+        <w:t>问题根源：</w:t>
+      </w:r>
+      <w:r>
+        <w:rPr>
+          <w:rFonts w:ascii="楷体" w:eastAsia="楷体" w:hAnsi="楷体" w:cs="宋体" w:hint="eastAsia"/>
+          <w:kern w:val="0"/>
+          <w:sz w:val="22"/>
+          <w:lang w:val="zh-CN"/>
+        </w:rPr>
+        <w:t>涂布不均源于长达1.4米的金属模头在压力下会产生微小形变，导致不同位置的狭缝宽度不一致。</w:t>
+      </w:r>
+    </w:p>
+    <w:p>
+      <w:pPr>
+        <w:pStyle w:val="a3"/>
+        <w:numPr>
+          <w:ilvl w:val="1"/>
+          <w:numId w:val="12"/>
+        </w:numPr>
+        <w:spacing w:beforeLines="50" w:before="156"/>
+        <w:ind w:left="1276" w:firstLineChars="0"/>
+        <w:rPr>
+          <w:rFonts w:ascii="楷体" w:eastAsia="楷体" w:hAnsi="楷体" w:cs="宋体" w:hint="eastAsia"/>
+          <w:kern w:val="0"/>
+          <w:sz w:val="22"/>
+          <w:lang w:val="zh-CN"/>
+        </w:rPr>
+      </w:pPr>
+      <w:proofErr w:type="gramStart"/>
+      <w:r>
+        <w:rPr>
+          <w:rFonts w:ascii="楷体" w:eastAsia="楷体" w:hAnsi="楷体" w:cs="宋体" w:hint="eastAsia"/>
+          <w:b/>
+          <w:bCs/>
+          <w:kern w:val="0"/>
+          <w:sz w:val="22"/>
+          <w:lang w:val="zh-CN"/>
+        </w:rPr>
+        <w:t>安脉</w:t>
+      </w:r>
+      <w:proofErr w:type="gramEnd"/>
+      <w:r>
+        <w:rPr>
+          <w:rFonts w:ascii="楷体" w:eastAsia="楷体" w:hAnsi="楷体" w:cs="宋体" w:hint="eastAsia"/>
+          <w:b/>
+          <w:bCs/>
+          <w:kern w:val="0"/>
+          <w:sz w:val="22"/>
+          <w:lang w:val="zh-CN"/>
+        </w:rPr>
+        <w:t>盛方案：</w:t>
+      </w:r>
+      <w:r>
+        <w:rPr>
+          <w:rFonts w:ascii="楷体" w:eastAsia="楷体" w:hAnsi="楷体" w:cs="宋体" w:hint="eastAsia"/>
+          <w:kern w:val="0"/>
+          <w:sz w:val="22"/>
+          <w:lang w:val="zh-CN"/>
+        </w:rPr>
+        <w:t>在模头上每隔</w:t>
+      </w:r>
+      <w:proofErr w:type="gramStart"/>
+      <w:r>
+        <w:rPr>
+          <w:rFonts w:ascii="楷体" w:eastAsia="楷体" w:hAnsi="楷体" w:cs="宋体" w:hint="eastAsia"/>
+          <w:kern w:val="0"/>
+          <w:sz w:val="22"/>
+          <w:lang w:val="zh-CN"/>
+        </w:rPr>
+        <w:t>一</w:t>
+      </w:r>
+      <w:proofErr w:type="gramEnd"/>
+      <w:r>
+        <w:rPr>
+          <w:rFonts w:ascii="楷体" w:eastAsia="楷体" w:hAnsi="楷体" w:cs="宋体" w:hint="eastAsia"/>
+          <w:kern w:val="0"/>
+          <w:sz w:val="22"/>
+          <w:lang w:val="zh-CN"/>
+        </w:rPr>
+        <w:t>小段距离安装一个独立的微型控制器，对该段的形变进行精确的主动补偿。</w:t>
+      </w:r>
+    </w:p>
+    <w:p>
+      <w:pPr>
+        <w:pStyle w:val="a3"/>
+        <w:numPr>
+          <w:ilvl w:val="1"/>
+          <w:numId w:val="12"/>
+        </w:numPr>
+        <w:spacing w:beforeLines="50" w:before="156"/>
+        <w:ind w:left="1276" w:firstLineChars="0"/>
+        <w:rPr>
+          <w:rFonts w:ascii="楷体" w:eastAsia="楷体" w:hAnsi="楷体" w:cs="宋体" w:hint="eastAsia"/>
+          <w:kern w:val="0"/>
+          <w:sz w:val="22"/>
+          <w:lang w:val="zh-CN"/>
+        </w:rPr>
+      </w:pPr>
+      <w:r>
+        <w:rPr>
+          <w:rFonts w:ascii="楷体" w:eastAsia="楷体" w:hAnsi="楷体" w:cs="宋体" w:hint="eastAsia"/>
+          <w:b/>
+          <w:bCs/>
+          <w:kern w:val="0"/>
+          <w:sz w:val="22"/>
+          <w:lang w:val="zh-CN"/>
+        </w:rPr>
+        <w:t>闭环控制：</w:t>
+      </w:r>
+      <w:r>
+        <w:rPr>
+          <w:rFonts w:ascii="楷体" w:eastAsia="楷体" w:hAnsi="楷体" w:cs="宋体" w:hint="eastAsia"/>
+          <w:kern w:val="0"/>
+          <w:sz w:val="22"/>
+          <w:lang w:val="zh-CN"/>
+        </w:rPr>
+        <w:t>系统通过实时检测涂布的实际厚度，形成闭环反馈，动态调整各段控制器的输出，以保证整个幅宽的涂布厚度均匀一致。</w:t>
+      </w:r>
+    </w:p>
+    <w:p>
+      <w:pPr>
+        <w:pStyle w:val="a3"/>
+        <w:numPr>
+          <w:ilvl w:val="1"/>
+          <w:numId w:val="12"/>
+        </w:numPr>
+        <w:spacing w:beforeLines="50" w:before="156"/>
+        <w:ind w:left="1276" w:firstLineChars="0"/>
+        <w:rPr>
+          <w:rFonts w:ascii="楷体" w:eastAsia="楷体" w:hAnsi="楷体" w:cs="宋体" w:hint="eastAsia"/>
+          <w:kern w:val="0"/>
+          <w:sz w:val="22"/>
+          <w:lang w:val="zh-CN"/>
+        </w:rPr>
+      </w:pPr>
+      <w:r>
+        <w:rPr>
+          <w:rFonts w:ascii="楷体" w:eastAsia="楷体" w:hAnsi="楷体" w:cs="宋体" w:hint="eastAsia"/>
+          <w:b/>
+          <w:bCs/>
+          <w:kern w:val="0"/>
+          <w:sz w:val="22"/>
+          <w:lang w:val="zh-CN"/>
+        </w:rPr>
+        <w:t>合作成果：</w:t>
+      </w:r>
+      <w:r>
+        <w:rPr>
+          <w:rFonts w:ascii="楷体" w:eastAsia="楷体" w:hAnsi="楷体" w:cs="宋体" w:hint="eastAsia"/>
+          <w:kern w:val="0"/>
+          <w:sz w:val="22"/>
+          <w:lang w:val="zh-CN"/>
+        </w:rPr>
+        <w:t>这个名为“智能模头”或“智能涂头”的系统，一次性将涂布精度和质量提升到顶级水平，给宁德时代带来了全新的视角。由于是基于确定的机理模型，开发过程不依赖宁德时代提供海量数据，</w:t>
+      </w:r>
+      <w:proofErr w:type="gramStart"/>
+      <w:r>
+        <w:rPr>
+          <w:rFonts w:ascii="楷体" w:eastAsia="楷体" w:hAnsi="楷体" w:cs="宋体" w:hint="eastAsia"/>
+          <w:kern w:val="0"/>
+          <w:sz w:val="22"/>
+          <w:lang w:val="zh-CN"/>
+        </w:rPr>
+        <w:t>初代产品</w:t>
+      </w:r>
+      <w:proofErr w:type="gramEnd"/>
+      <w:r>
+        <w:rPr>
+          <w:rFonts w:ascii="楷体" w:eastAsia="楷体" w:hAnsi="楷体" w:cs="宋体" w:hint="eastAsia"/>
+          <w:kern w:val="0"/>
+          <w:sz w:val="22"/>
+          <w:lang w:val="zh-CN"/>
+        </w:rPr>
+        <w:t>验证效果就非常好。</w:t>
+      </w:r>
+    </w:p>
+    <w:p>
+      <w:pPr>
+        <w:pStyle w:val="a3"/>
+        <w:numPr>
+          <w:ilvl w:val="1"/>
+          <w:numId w:val="4"/>
+        </w:numPr>
+        <w:spacing w:beforeLines="50" w:before="156"/>
+        <w:ind w:firstLineChars="0"/>
+        <w:rPr>
+          <w:rFonts w:ascii="楷体" w:eastAsia="楷体" w:hAnsi="楷体" w:cs="宋体" w:hint="eastAsia"/>
+          <w:b/>
+          <w:bCs/>
+          <w:kern w:val="0"/>
+          <w:sz w:val="22"/>
+          <w:lang w:val="zh-CN"/>
+        </w:rPr>
+      </w:pPr>
+      <w:r>
+        <w:rPr>
+          <w:rFonts w:ascii="楷体" w:eastAsia="楷体" w:hAnsi="楷体" w:cs="宋体" w:hint="eastAsia"/>
+          <w:b/>
+          <w:bCs/>
+          <w:kern w:val="0"/>
+          <w:sz w:val="22"/>
+          <w:lang w:val="zh-CN"/>
+        </w:rPr>
+        <w:t>商业化进程：</w:t>
+      </w:r>
+    </w:p>
+    <w:p>
+      <w:pPr>
+        <w:pStyle w:val="a3"/>
+        <w:numPr>
+          <w:ilvl w:val="1"/>
+          <w:numId w:val="12"/>
+        </w:numPr>
+        <w:spacing w:beforeLines="50" w:before="156"/>
+        <w:ind w:left="1276" w:firstLineChars="0"/>
+        <w:rPr>
+          <w:rFonts w:ascii="楷体" w:eastAsia="楷体" w:hAnsi="楷体" w:cs="宋体" w:hint="eastAsia"/>
+          <w:kern w:val="0"/>
+          <w:sz w:val="22"/>
+          <w:lang w:val="zh-CN"/>
+        </w:rPr>
+      </w:pPr>
+      <w:r>
+        <w:rPr>
+          <w:rFonts w:ascii="楷体" w:eastAsia="楷体" w:hAnsi="楷体" w:cs="宋体" w:hint="eastAsia"/>
+          <w:b/>
+          <w:bCs/>
+          <w:kern w:val="0"/>
+          <w:sz w:val="22"/>
+          <w:lang w:val="zh-CN"/>
+        </w:rPr>
+        <w:t>时间线：</w:t>
+      </w:r>
+      <w:r>
+        <w:rPr>
+          <w:rFonts w:ascii="楷体" w:eastAsia="楷体" w:hAnsi="楷体" w:cs="宋体" w:hint="eastAsia"/>
+          <w:kern w:val="0"/>
+          <w:sz w:val="22"/>
+          <w:lang w:val="zh-CN"/>
+        </w:rPr>
+        <w:t>双方于2019年底至2020年初开始接触，但由于初期产品定价较高，经过一段时间的成本效益权衡和验证后，于2022年左右开始大规模应用。</w:t>
+      </w:r>
+    </w:p>
+    <w:p>
+      <w:pPr>
+        <w:pStyle w:val="a3"/>
+        <w:numPr>
+          <w:ilvl w:val="1"/>
+          <w:numId w:val="12"/>
+        </w:numPr>
+        <w:spacing w:beforeLines="50" w:before="156"/>
+        <w:ind w:left="1276" w:firstLineChars="0"/>
+        <w:rPr>
+          <w:rFonts w:ascii="楷体" w:eastAsia="楷体" w:hAnsi="楷体" w:cs="宋体" w:hint="eastAsia"/>
+          <w:kern w:val="0"/>
+          <w:sz w:val="22"/>
+          <w:lang w:val="zh-CN"/>
+        </w:rPr>
+      </w:pPr>
+      <w:r>
+        <w:rPr>
+          <w:rFonts w:ascii="楷体" w:eastAsia="楷体" w:hAnsi="楷体" w:cs="宋体" w:hint="eastAsia"/>
+          <w:b/>
+          <w:bCs/>
+          <w:kern w:val="0"/>
+          <w:sz w:val="22"/>
+          <w:lang w:val="zh-CN"/>
+        </w:rPr>
+        <w:t>当前状况：</w:t>
+      </w:r>
+      <w:r>
+        <w:rPr>
+          <w:rFonts w:ascii="楷体" w:eastAsia="楷体" w:hAnsi="楷体" w:cs="宋体" w:hint="eastAsia"/>
+          <w:kern w:val="0"/>
+          <w:sz w:val="22"/>
+          <w:lang w:val="zh-CN"/>
+        </w:rPr>
+        <w:t>目前，</w:t>
+      </w:r>
+      <w:proofErr w:type="gramStart"/>
+      <w:r>
+        <w:rPr>
+          <w:rFonts w:ascii="楷体" w:eastAsia="楷体" w:hAnsi="楷体" w:cs="宋体" w:hint="eastAsia"/>
+          <w:kern w:val="0"/>
+          <w:sz w:val="22"/>
+          <w:lang w:val="zh-CN"/>
+        </w:rPr>
+        <w:t>安脉</w:t>
+      </w:r>
+      <w:proofErr w:type="gramEnd"/>
+      <w:r>
+        <w:rPr>
+          <w:rFonts w:ascii="楷体" w:eastAsia="楷体" w:hAnsi="楷体" w:cs="宋体" w:hint="eastAsia"/>
+          <w:kern w:val="0"/>
+          <w:sz w:val="22"/>
+          <w:lang w:val="zh-CN"/>
+        </w:rPr>
+        <w:t>盛的智能模头在宁德时代的</w:t>
+      </w:r>
+      <w:proofErr w:type="gramStart"/>
+      <w:r>
+        <w:rPr>
+          <w:rFonts w:ascii="楷体" w:eastAsia="楷体" w:hAnsi="楷体" w:cs="宋体" w:hint="eastAsia"/>
+          <w:kern w:val="0"/>
+          <w:sz w:val="22"/>
+          <w:lang w:val="zh-CN"/>
+        </w:rPr>
+        <w:t>新建产线上</w:t>
+      </w:r>
+      <w:proofErr w:type="gramEnd"/>
+      <w:r>
+        <w:rPr>
+          <w:rFonts w:ascii="楷体" w:eastAsia="楷体" w:hAnsi="楷体" w:cs="宋体" w:hint="eastAsia"/>
+          <w:kern w:val="0"/>
+          <w:sz w:val="22"/>
+          <w:lang w:val="zh-CN"/>
+        </w:rPr>
+        <w:t>已基本成为标配。一条</w:t>
+      </w:r>
+      <w:proofErr w:type="gramStart"/>
+      <w:r>
+        <w:rPr>
+          <w:rFonts w:ascii="楷体" w:eastAsia="楷体" w:hAnsi="楷体" w:cs="宋体" w:hint="eastAsia"/>
+          <w:kern w:val="0"/>
+          <w:sz w:val="22"/>
+          <w:lang w:val="zh-CN"/>
+        </w:rPr>
+        <w:t>产线配置</w:t>
+      </w:r>
+      <w:proofErr w:type="gramEnd"/>
+      <w:r>
+        <w:rPr>
+          <w:rFonts w:ascii="楷体" w:eastAsia="楷体" w:hAnsi="楷体" w:cs="宋体" w:hint="eastAsia"/>
+          <w:kern w:val="0"/>
+          <w:sz w:val="22"/>
+          <w:lang w:val="zh-CN"/>
+        </w:rPr>
+        <w:t>两套模头，价值约400多万元。对于存量产线，则采取在生产间隙逐步替换升级的策略。</w:t>
+      </w:r>
+    </w:p>
+    <w:p>
+      <w:pPr>
+        <w:pStyle w:val="a3"/>
+        <w:numPr>
+          <w:ilvl w:val="1"/>
+          <w:numId w:val="10"/>
+        </w:numPr>
+        <w:spacing w:beforeLines="50" w:before="156"/>
+        <w:ind w:firstLineChars="0"/>
+        <w:rPr>
+          <w:rFonts w:ascii="楷体" w:eastAsia="楷体" w:hAnsi="楷体" w:cs="宋体" w:hint="eastAsia"/>
+          <w:b/>
+          <w:bCs/>
+          <w:kern w:val="0"/>
+          <w:sz w:val="22"/>
+          <w:lang w:val="zh-CN"/>
+        </w:rPr>
+      </w:pPr>
+      <w:r>
+        <w:rPr>
+          <w:rFonts w:ascii="楷体" w:eastAsia="楷体" w:hAnsi="楷体" w:cs="宋体"/>
+          <w:b/>
+          <w:bCs/>
+          <w:kern w:val="0"/>
+          <w:sz w:val="22"/>
+          <w:lang w:val="zh-CN"/>
+        </w:rPr>
+        <w:t>辊压工序：消除隐患，提升一致性</w:t>
+      </w:r>
+    </w:p>
+    <w:p>
+      <w:pPr>
+        <w:pStyle w:val="a3"/>
+        <w:numPr>
+          <w:ilvl w:val="1"/>
+          <w:numId w:val="4"/>
+        </w:numPr>
+        <w:spacing w:beforeLines="50" w:before="156"/>
+        <w:ind w:firstLineChars="0"/>
+        <w:rPr>
+          <w:rFonts w:ascii="楷体" w:eastAsia="楷体" w:hAnsi="楷体" w:cs="宋体" w:hint="eastAsia"/>
+          <w:kern w:val="0"/>
+          <w:sz w:val="22"/>
+          <w:lang w:val="zh-CN"/>
+        </w:rPr>
+      </w:pPr>
+      <w:r>
+        <w:rPr>
+          <w:rFonts w:ascii="楷体" w:eastAsia="楷体" w:hAnsi="楷体" w:cs="宋体" w:hint="eastAsia"/>
+          <w:b/>
+          <w:bCs/>
+          <w:kern w:val="0"/>
+          <w:sz w:val="22"/>
+          <w:lang w:val="zh-CN"/>
+        </w:rPr>
+        <w:t>工艺流程：</w:t>
+      </w:r>
+      <w:r>
+        <w:rPr>
+          <w:rFonts w:ascii="楷体" w:eastAsia="楷体" w:hAnsi="楷体" w:cs="宋体" w:hint="eastAsia"/>
+          <w:kern w:val="0"/>
+          <w:sz w:val="22"/>
+          <w:lang w:val="zh-CN"/>
+        </w:rPr>
+        <w:t>涂布完成后的极片，会经过一个烘烤环节，该环节同样复杂，涉及热控和能效控制。烘烤之后，才进入辊压工序。</w:t>
+      </w:r>
+    </w:p>
+    <w:p>
+      <w:pPr>
+        <w:pStyle w:val="a3"/>
+        <w:numPr>
+          <w:ilvl w:val="1"/>
+          <w:numId w:val="4"/>
+        </w:numPr>
+        <w:spacing w:beforeLines="50" w:before="156"/>
+        <w:ind w:firstLineChars="0"/>
+        <w:rPr>
+          <w:rFonts w:ascii="楷体" w:eastAsia="楷体" w:hAnsi="楷体" w:cs="宋体" w:hint="eastAsia"/>
+          <w:kern w:val="0"/>
+          <w:sz w:val="22"/>
+          <w:lang w:val="zh-CN"/>
+        </w:rPr>
+      </w:pPr>
+      <w:r>
+        <w:rPr>
+          <w:rFonts w:ascii="楷体" w:eastAsia="楷体" w:hAnsi="楷体" w:cs="宋体" w:hint="eastAsia"/>
+          <w:b/>
+          <w:bCs/>
+          <w:kern w:val="0"/>
+          <w:sz w:val="22"/>
+          <w:lang w:val="zh-CN"/>
+        </w:rPr>
+        <w:t>工艺痛点：</w:t>
+      </w:r>
+      <w:r>
+        <w:rPr>
+          <w:rFonts w:ascii="楷体" w:eastAsia="楷体" w:hAnsi="楷体" w:cs="宋体" w:hint="eastAsia"/>
+          <w:kern w:val="0"/>
+          <w:sz w:val="22"/>
+          <w:lang w:val="zh-CN"/>
+        </w:rPr>
+        <w:t>辊压用于压实极片。传统辊压设备精度不足，会导致极片厚度不均。这一微小偏差在后续高速卷绕时会被累积放大，最终导致</w:t>
+      </w:r>
+      <w:proofErr w:type="gramStart"/>
+      <w:r>
+        <w:rPr>
+          <w:rFonts w:ascii="楷体" w:eastAsia="楷体" w:hAnsi="楷体" w:cs="宋体" w:hint="eastAsia"/>
+          <w:kern w:val="0"/>
+          <w:sz w:val="22"/>
+          <w:lang w:val="zh-CN"/>
+        </w:rPr>
+        <w:t>极</w:t>
+      </w:r>
+      <w:proofErr w:type="gramEnd"/>
+      <w:r>
+        <w:rPr>
+          <w:rFonts w:ascii="楷体" w:eastAsia="楷体" w:hAnsi="楷体" w:cs="宋体" w:hint="eastAsia"/>
+          <w:kern w:val="0"/>
+          <w:sz w:val="22"/>
+          <w:lang w:val="zh-CN"/>
+        </w:rPr>
+        <w:t>耳位置错位，是锂电行业一个巨大的浪费来源，造成大量电芯报废。</w:t>
+      </w:r>
+    </w:p>
+    <w:p>
+      <w:pPr>
+        <w:pStyle w:val="a3"/>
+        <w:numPr>
+          <w:ilvl w:val="1"/>
+          <w:numId w:val="4"/>
+        </w:numPr>
+        <w:spacing w:beforeLines="50" w:before="156"/>
+        <w:ind w:firstLineChars="0"/>
+        <w:rPr>
+          <w:rFonts w:ascii="楷体" w:eastAsia="楷体" w:hAnsi="楷体" w:cs="宋体" w:hint="eastAsia"/>
+          <w:kern w:val="0"/>
+          <w:sz w:val="22"/>
+          <w:lang w:val="zh-CN"/>
+        </w:rPr>
+      </w:pPr>
+      <w:r>
+        <w:rPr>
+          <w:rFonts w:ascii="楷体" w:eastAsia="楷体" w:hAnsi="楷体" w:cs="宋体" w:hint="eastAsia"/>
+          <w:b/>
+          <w:bCs/>
+          <w:kern w:val="0"/>
+          <w:sz w:val="22"/>
+          <w:lang w:val="zh-CN"/>
+        </w:rPr>
+        <w:t>传统设备局限：</w:t>
+      </w:r>
+      <w:r>
+        <w:rPr>
+          <w:rFonts w:ascii="楷体" w:eastAsia="楷体" w:hAnsi="楷体" w:cs="宋体" w:hint="eastAsia"/>
+          <w:kern w:val="0"/>
+          <w:sz w:val="22"/>
+          <w:lang w:val="zh-CN"/>
+        </w:rPr>
+        <w:t>宁德时代此前使用的辊压设备主要有两类：一类是自带闭环算法但效果不佳的设备；另一类是纯机械设备，需配合激光测厚仪，由人工根据测量结果手动调节，效率和精度都有限。</w:t>
+      </w:r>
+    </w:p>
+    <w:p>
+      <w:pPr>
+        <w:pStyle w:val="a3"/>
+        <w:numPr>
+          <w:ilvl w:val="1"/>
+          <w:numId w:val="4"/>
+        </w:numPr>
+        <w:spacing w:beforeLines="50" w:before="156"/>
+        <w:ind w:firstLineChars="0"/>
+        <w:rPr>
+          <w:rFonts w:ascii="楷体" w:eastAsia="楷体" w:hAnsi="楷体" w:cs="宋体" w:hint="eastAsia"/>
+          <w:kern w:val="0"/>
+          <w:sz w:val="22"/>
+          <w:lang w:val="zh-CN"/>
+        </w:rPr>
+      </w:pPr>
+      <w:proofErr w:type="gramStart"/>
+      <w:r>
+        <w:rPr>
+          <w:rFonts w:ascii="楷体" w:eastAsia="楷体" w:hAnsi="楷体" w:cs="宋体" w:hint="eastAsia"/>
+          <w:b/>
+          <w:bCs/>
+          <w:kern w:val="0"/>
+          <w:sz w:val="22"/>
+          <w:lang w:val="zh-CN"/>
+        </w:rPr>
+        <w:t>安脉</w:t>
+      </w:r>
+      <w:proofErr w:type="gramEnd"/>
+      <w:r>
+        <w:rPr>
+          <w:rFonts w:ascii="楷体" w:eastAsia="楷体" w:hAnsi="楷体" w:cs="宋体" w:hint="eastAsia"/>
+          <w:b/>
+          <w:bCs/>
+          <w:kern w:val="0"/>
+          <w:sz w:val="22"/>
+          <w:lang w:val="zh-CN"/>
+        </w:rPr>
+        <w:t>盛的解决方案：</w:t>
+      </w:r>
+      <w:r>
+        <w:rPr>
+          <w:rFonts w:ascii="楷体" w:eastAsia="楷体" w:hAnsi="楷体" w:cs="宋体" w:hint="eastAsia"/>
+          <w:kern w:val="0"/>
+          <w:sz w:val="22"/>
+          <w:lang w:val="zh-CN"/>
+        </w:rPr>
+        <w:t>双方合作开发了基于PID和APC模型的智能辊压控制系统。该系统利用激光测厚仪实时监测极片厚度，形成闭环反馈，自动、精确地调整辊压压力。此项目的内部代号为“致敬钱老”，体现了对控制理论科学性的尊重，因为类似的控制思路在钱学森于</w:t>
+      </w:r>
+      <w:proofErr w:type="gramStart"/>
+      <w:r>
+        <w:rPr>
+          <w:rFonts w:ascii="楷体" w:eastAsia="楷体" w:hAnsi="楷体" w:cs="宋体" w:hint="eastAsia"/>
+          <w:kern w:val="0"/>
+          <w:sz w:val="22"/>
+          <w:lang w:val="zh-CN"/>
+        </w:rPr>
+        <w:t>1960</w:t>
+      </w:r>
+      <w:proofErr w:type="gramEnd"/>
+      <w:r>
+        <w:rPr>
+          <w:rFonts w:ascii="楷体" w:eastAsia="楷体" w:hAnsi="楷体" w:cs="宋体" w:hint="eastAsia"/>
+          <w:kern w:val="0"/>
+          <w:sz w:val="22"/>
+          <w:lang w:val="zh-CN"/>
+        </w:rPr>
+        <w:t>年代的著作中已有论述。</w:t>
+      </w:r>
+    </w:p>
+    <w:p>
+      <w:pPr>
+        <w:pStyle w:val="a3"/>
+        <w:numPr>
+          <w:ilvl w:val="1"/>
+          <w:numId w:val="4"/>
+        </w:numPr>
+        <w:spacing w:beforeLines="50" w:before="156"/>
+        <w:ind w:firstLineChars="0"/>
+        <w:rPr>
+          <w:rFonts w:ascii="楷体" w:eastAsia="楷体" w:hAnsi="楷体" w:cs="宋体" w:hint="eastAsia"/>
+          <w:kern w:val="0"/>
+          <w:sz w:val="22"/>
+          <w:lang w:val="zh-CN"/>
+        </w:rPr>
+      </w:pPr>
+      <w:r>
+        <w:rPr>
+          <w:rFonts w:ascii="楷体" w:eastAsia="楷体" w:hAnsi="楷体" w:cs="宋体" w:hint="eastAsia"/>
+          <w:b/>
+          <w:bCs/>
+          <w:kern w:val="0"/>
+          <w:sz w:val="22"/>
+          <w:lang w:val="zh-CN"/>
+        </w:rPr>
+        <w:t>合作成果：</w:t>
+      </w:r>
+      <w:r>
+        <w:rPr>
+          <w:rFonts w:ascii="楷体" w:eastAsia="楷体" w:hAnsi="楷体" w:cs="宋体" w:hint="eastAsia"/>
+          <w:kern w:val="0"/>
+          <w:sz w:val="22"/>
+          <w:lang w:val="zh-CN"/>
+        </w:rPr>
+        <w:t>该方案使辊压后极片的一致性提升了约10%，显著降低了卷绕工序的报废率。目前该方案已验证完成，并在部分工厂</w:t>
+      </w:r>
+      <w:proofErr w:type="gramStart"/>
+      <w:r>
+        <w:rPr>
+          <w:rFonts w:ascii="楷体" w:eastAsia="楷体" w:hAnsi="楷体" w:cs="宋体" w:hint="eastAsia"/>
+          <w:kern w:val="0"/>
+          <w:sz w:val="22"/>
+          <w:lang w:val="zh-CN"/>
+        </w:rPr>
+        <w:t>的产线上</w:t>
+      </w:r>
+      <w:proofErr w:type="gramEnd"/>
+      <w:r>
+        <w:rPr>
+          <w:rFonts w:ascii="楷体" w:eastAsia="楷体" w:hAnsi="楷体" w:cs="宋体" w:hint="eastAsia"/>
+          <w:kern w:val="0"/>
+          <w:sz w:val="22"/>
+          <w:lang w:val="zh-CN"/>
+        </w:rPr>
+        <w:t>开始使用。</w:t>
+      </w:r>
+    </w:p>
+    <w:p>
+      <w:pPr>
+        <w:pStyle w:val="a3"/>
+        <w:numPr>
+          <w:ilvl w:val="1"/>
+          <w:numId w:val="10"/>
+        </w:numPr>
+        <w:spacing w:beforeLines="50" w:before="156"/>
+        <w:ind w:firstLineChars="0"/>
+        <w:rPr>
+          <w:rFonts w:ascii="楷体" w:eastAsia="楷体" w:hAnsi="楷体" w:cs="宋体" w:hint="eastAsia"/>
+          <w:b/>
+          <w:bCs/>
+          <w:kern w:val="0"/>
+          <w:sz w:val="22"/>
+          <w:lang w:val="zh-CN"/>
+        </w:rPr>
+      </w:pPr>
+      <w:r>
+        <w:rPr>
+          <w:rFonts w:ascii="楷体" w:eastAsia="楷体" w:hAnsi="楷体" w:cs="宋体"/>
+          <w:b/>
+          <w:bCs/>
+          <w:kern w:val="0"/>
+          <w:sz w:val="22"/>
+          <w:lang w:val="zh-CN"/>
+        </w:rPr>
+        <w:t>卷绕工序：挑战工艺复杂性的极限</w:t>
+      </w:r>
+    </w:p>
+    <w:p>
+      <w:pPr>
+        <w:pStyle w:val="a3"/>
+        <w:numPr>
+          <w:ilvl w:val="1"/>
+          <w:numId w:val="4"/>
+        </w:numPr>
+        <w:spacing w:beforeLines="50" w:before="156"/>
+        <w:ind w:firstLineChars="0"/>
+        <w:rPr>
+          <w:rFonts w:ascii="楷体" w:eastAsia="楷体" w:hAnsi="楷体" w:cs="宋体" w:hint="eastAsia"/>
+          <w:kern w:val="0"/>
+          <w:sz w:val="22"/>
+          <w:lang w:val="zh-CN"/>
+        </w:rPr>
+      </w:pPr>
+      <w:r>
+        <w:rPr>
+          <w:rFonts w:ascii="楷体" w:eastAsia="楷体" w:hAnsi="楷体" w:cs="宋体" w:hint="eastAsia"/>
+          <w:b/>
+          <w:bCs/>
+          <w:kern w:val="0"/>
+          <w:sz w:val="22"/>
+          <w:lang w:val="zh-CN"/>
+        </w:rPr>
+        <w:t>工艺极端复杂性：</w:t>
+      </w:r>
+      <w:r>
+        <w:rPr>
+          <w:rFonts w:ascii="楷体" w:eastAsia="楷体" w:hAnsi="楷体" w:cs="宋体" w:hint="eastAsia"/>
+          <w:kern w:val="0"/>
+          <w:sz w:val="22"/>
+          <w:lang w:val="zh-CN"/>
+        </w:rPr>
+        <w:t>卷绕是锂电制造中最复杂的工序之一，一台卷绕</w:t>
+      </w:r>
+      <w:proofErr w:type="gramStart"/>
+      <w:r>
+        <w:rPr>
+          <w:rFonts w:ascii="楷体" w:eastAsia="楷体" w:hAnsi="楷体" w:cs="宋体" w:hint="eastAsia"/>
+          <w:kern w:val="0"/>
+          <w:sz w:val="22"/>
+          <w:lang w:val="zh-CN"/>
+        </w:rPr>
+        <w:t>机涉及</w:t>
+      </w:r>
+      <w:proofErr w:type="gramEnd"/>
+      <w:r>
+        <w:rPr>
+          <w:rFonts w:ascii="楷体" w:eastAsia="楷体" w:hAnsi="楷体" w:cs="宋体" w:hint="eastAsia"/>
+          <w:kern w:val="0"/>
+          <w:sz w:val="22"/>
+          <w:lang w:val="zh-CN"/>
+        </w:rPr>
+        <w:t>超过4万个零部件，运行速度可达3.6米/秒，其控制难度极大。</w:t>
+      </w:r>
+    </w:p>
+    <w:p>
+      <w:pPr>
+        <w:pStyle w:val="a3"/>
+        <w:numPr>
+          <w:ilvl w:val="1"/>
+          <w:numId w:val="4"/>
+        </w:numPr>
+        <w:spacing w:beforeLines="50" w:before="156"/>
+        <w:ind w:firstLineChars="0"/>
+        <w:rPr>
+          <w:rFonts w:ascii="楷体" w:eastAsia="楷体" w:hAnsi="楷体" w:cs="宋体" w:hint="eastAsia"/>
+          <w:kern w:val="0"/>
+          <w:sz w:val="22"/>
+          <w:lang w:val="zh-CN"/>
+        </w:rPr>
+      </w:pPr>
+      <w:r>
+        <w:rPr>
+          <w:rFonts w:ascii="楷体" w:eastAsia="楷体" w:hAnsi="楷体" w:cs="宋体" w:hint="eastAsia"/>
+          <w:b/>
+          <w:bCs/>
+          <w:kern w:val="0"/>
+          <w:sz w:val="22"/>
+          <w:lang w:val="zh-CN"/>
+        </w:rPr>
+        <w:t>核心控制难点：</w:t>
+      </w:r>
+      <w:r>
+        <w:rPr>
+          <w:rFonts w:ascii="楷体" w:eastAsia="楷体" w:hAnsi="楷体" w:cs="宋体" w:hint="eastAsia"/>
+          <w:kern w:val="0"/>
+          <w:sz w:val="22"/>
+          <w:lang w:val="zh-CN"/>
+        </w:rPr>
+        <w:t>包括正负极片与隔离膜在卷绕过程中的精确对齐、随直径变化的动态张力控制、以及高速下的材料切断与传送等，都需要微米级或毫秒级的</w:t>
+      </w:r>
+      <w:r>
+        <w:rPr>
+          <w:rFonts w:ascii="楷体" w:eastAsia="楷体" w:hAnsi="楷体" w:cs="宋体" w:hint="eastAsia"/>
+          <w:kern w:val="0"/>
+          <w:sz w:val="22"/>
+          <w:lang w:val="zh-CN"/>
+        </w:rPr>
+        <w:lastRenderedPageBreak/>
+        <w:t>精密控制。例如，在切断后，需要通过精确控制的气流来保持材料形态，防止其打折或错乱。</w:t>
+      </w:r>
+    </w:p>
+    <w:p>
+      <w:pPr>
+        <w:pStyle w:val="a3"/>
+        <w:numPr>
+          <w:ilvl w:val="1"/>
+          <w:numId w:val="4"/>
+        </w:numPr>
+        <w:spacing w:beforeLines="50" w:before="156"/>
+        <w:ind w:firstLineChars="0"/>
+        <w:rPr>
+          <w:rFonts w:ascii="楷体" w:eastAsia="楷体" w:hAnsi="楷体" w:cs="宋体" w:hint="eastAsia"/>
+          <w:kern w:val="0"/>
+          <w:sz w:val="22"/>
+          <w:lang w:val="zh-CN"/>
+        </w:rPr>
+      </w:pPr>
+      <w:r>
+        <w:rPr>
+          <w:rFonts w:ascii="楷体" w:eastAsia="楷体" w:hAnsi="楷体" w:cs="宋体" w:hint="eastAsia"/>
+          <w:b/>
+          <w:bCs/>
+          <w:kern w:val="0"/>
+          <w:sz w:val="22"/>
+          <w:lang w:val="zh-CN"/>
+        </w:rPr>
+        <w:t>合作进展：</w:t>
+      </w:r>
+      <w:r>
+        <w:rPr>
+          <w:rFonts w:ascii="楷体" w:eastAsia="楷体" w:hAnsi="楷体" w:cs="宋体" w:hint="eastAsia"/>
+          <w:kern w:val="0"/>
+          <w:sz w:val="22"/>
+          <w:lang w:val="zh-CN"/>
+        </w:rPr>
+        <w:t>双方正在合作研发新一代的卷绕机控制系统。目前，</w:t>
+      </w:r>
+      <w:proofErr w:type="gramStart"/>
+      <w:r>
+        <w:rPr>
+          <w:rFonts w:ascii="楷体" w:eastAsia="楷体" w:hAnsi="楷体" w:cs="宋体" w:hint="eastAsia"/>
+          <w:kern w:val="0"/>
+          <w:sz w:val="22"/>
+          <w:lang w:val="zh-CN"/>
+        </w:rPr>
+        <w:t>安脉</w:t>
+      </w:r>
+      <w:proofErr w:type="gramEnd"/>
+      <w:r>
+        <w:rPr>
+          <w:rFonts w:ascii="楷体" w:eastAsia="楷体" w:hAnsi="楷体" w:cs="宋体" w:hint="eastAsia"/>
+          <w:kern w:val="0"/>
+          <w:sz w:val="22"/>
+          <w:lang w:val="zh-CN"/>
+        </w:rPr>
+        <w:t>盛研发的第二代卷绕机控制系统，已作为工程样机在宁德时代</w:t>
+      </w:r>
+      <w:proofErr w:type="gramStart"/>
+      <w:r>
+        <w:rPr>
+          <w:rFonts w:ascii="楷体" w:eastAsia="楷体" w:hAnsi="楷体" w:cs="宋体" w:hint="eastAsia"/>
+          <w:kern w:val="0"/>
+          <w:sz w:val="22"/>
+          <w:lang w:val="zh-CN"/>
+        </w:rPr>
+        <w:t>的产线内</w:t>
+      </w:r>
+      <w:proofErr w:type="gramEnd"/>
+      <w:r>
+        <w:rPr>
+          <w:rFonts w:ascii="楷体" w:eastAsia="楷体" w:hAnsi="楷体" w:cs="宋体" w:hint="eastAsia"/>
+          <w:kern w:val="0"/>
+          <w:sz w:val="22"/>
+          <w:lang w:val="zh-CN"/>
+        </w:rPr>
+        <w:t>进行测试和应用。</w:t>
+      </w:r>
+    </w:p>
+    <w:p>
+      <w:pPr>
+        <w:pStyle w:val="a3"/>
+        <w:numPr>
+          <w:ilvl w:val="1"/>
+          <w:numId w:val="10"/>
+        </w:numPr>
+        <w:spacing w:beforeLines="50" w:before="156"/>
+        <w:ind w:firstLineChars="0"/>
+        <w:rPr>
+          <w:rFonts w:ascii="楷体" w:eastAsia="楷体" w:hAnsi="楷体" w:cs="宋体" w:hint="eastAsia"/>
+          <w:b/>
+          <w:bCs/>
+          <w:kern w:val="0"/>
+          <w:sz w:val="22"/>
+          <w:lang w:val="zh-CN"/>
+        </w:rPr>
+      </w:pPr>
+      <w:r>
+        <w:rPr>
+          <w:rFonts w:ascii="楷体" w:eastAsia="楷体" w:hAnsi="楷体" w:cs="宋体"/>
+          <w:b/>
+          <w:bCs/>
+          <w:kern w:val="0"/>
+          <w:sz w:val="22"/>
+          <w:lang w:val="zh-CN"/>
+        </w:rPr>
+        <w:t>工艺路线与市场规模对比</w:t>
+      </w:r>
+    </w:p>
+    <w:p>
+      <w:pPr>
+        <w:pStyle w:val="a3"/>
+        <w:numPr>
+          <w:ilvl w:val="1"/>
+          <w:numId w:val="4"/>
+        </w:numPr>
+        <w:spacing w:beforeLines="50" w:before="156"/>
+        <w:ind w:firstLineChars="0"/>
+        <w:rPr>
+          <w:rFonts w:ascii="楷体" w:eastAsia="楷体" w:hAnsi="楷体" w:cs="宋体" w:hint="eastAsia"/>
+          <w:kern w:val="0"/>
+          <w:sz w:val="22"/>
+          <w:lang w:val="zh-CN"/>
+        </w:rPr>
+      </w:pPr>
+      <w:r>
+        <w:rPr>
+          <w:rFonts w:ascii="楷体" w:eastAsia="楷体" w:hAnsi="楷体" w:cs="宋体" w:hint="eastAsia"/>
+          <w:b/>
+          <w:bCs/>
+          <w:kern w:val="0"/>
+          <w:sz w:val="22"/>
+          <w:lang w:val="zh-CN"/>
+        </w:rPr>
+        <w:t>叠片工艺：</w:t>
+      </w:r>
+      <w:r>
+        <w:rPr>
+          <w:rFonts w:ascii="楷体" w:eastAsia="楷体" w:hAnsi="楷体" w:cs="宋体" w:hint="eastAsia"/>
+          <w:kern w:val="0"/>
+          <w:sz w:val="22"/>
+          <w:lang w:val="zh-CN"/>
+        </w:rPr>
+        <w:t>宁德时代也拥有叠片产线，但目前主流仍是卷绕工艺。叠片工艺由于涉及更多次的裁切，其主要痛点是会产生更多的毛刺，因此对毛刺的检测变得至关重要。</w:t>
+      </w:r>
+      <w:proofErr w:type="gramStart"/>
+      <w:r>
+        <w:rPr>
+          <w:rFonts w:ascii="楷体" w:eastAsia="楷体" w:hAnsi="楷体" w:cs="宋体" w:hint="eastAsia"/>
+          <w:kern w:val="0"/>
+          <w:sz w:val="22"/>
+          <w:lang w:val="zh-CN"/>
+        </w:rPr>
+        <w:t>安脉</w:t>
+      </w:r>
+      <w:proofErr w:type="gramEnd"/>
+      <w:r>
+        <w:rPr>
+          <w:rFonts w:ascii="楷体" w:eastAsia="楷体" w:hAnsi="楷体" w:cs="宋体" w:hint="eastAsia"/>
+          <w:kern w:val="0"/>
+          <w:sz w:val="22"/>
+          <w:lang w:val="zh-CN"/>
+        </w:rPr>
+        <w:t>盛在叠片的生产设备上未参与，但在叠片检测设备方面，实现了全面合作。</w:t>
+      </w:r>
+    </w:p>
+    <w:p>
+      <w:pPr>
+        <w:pStyle w:val="a3"/>
+        <w:numPr>
+          <w:ilvl w:val="1"/>
+          <w:numId w:val="4"/>
+        </w:numPr>
+        <w:spacing w:beforeLines="50" w:before="156"/>
+        <w:ind w:firstLineChars="0"/>
+        <w:rPr>
+          <w:rFonts w:ascii="楷体" w:eastAsia="楷体" w:hAnsi="楷体" w:cs="宋体" w:hint="eastAsia"/>
+          <w:kern w:val="0"/>
+          <w:sz w:val="22"/>
+          <w:lang w:val="zh-CN"/>
+        </w:rPr>
+      </w:pPr>
+      <w:r>
+        <w:rPr>
+          <w:rFonts w:ascii="楷体" w:eastAsia="楷体" w:hAnsi="楷体" w:cs="宋体" w:hint="eastAsia"/>
+          <w:b/>
+          <w:bCs/>
+          <w:kern w:val="0"/>
+          <w:sz w:val="22"/>
+          <w:lang w:val="zh-CN"/>
+        </w:rPr>
+        <w:t>设备数量与市场规模：</w:t>
+      </w:r>
+      <w:r>
+        <w:rPr>
+          <w:rFonts w:ascii="楷体" w:eastAsia="楷体" w:hAnsi="楷体" w:cs="宋体" w:hint="eastAsia"/>
+          <w:kern w:val="0"/>
+          <w:sz w:val="22"/>
+          <w:lang w:val="zh-CN"/>
+        </w:rPr>
+        <w:t>涂布机由于其1.4米的大幅宽，一台设备产出的极片需要经过分条工序，切割成多条窄片，以供后续的多台卷绕机使用。因此，在一条完整</w:t>
+      </w:r>
+      <w:proofErr w:type="gramStart"/>
+      <w:r>
+        <w:rPr>
+          <w:rFonts w:ascii="楷体" w:eastAsia="楷体" w:hAnsi="楷体" w:cs="宋体" w:hint="eastAsia"/>
+          <w:kern w:val="0"/>
+          <w:sz w:val="22"/>
+          <w:lang w:val="zh-CN"/>
+        </w:rPr>
+        <w:t>的产线中</w:t>
+      </w:r>
+      <w:proofErr w:type="gramEnd"/>
+      <w:r>
+        <w:rPr>
+          <w:rFonts w:ascii="楷体" w:eastAsia="楷体" w:hAnsi="楷体" w:cs="宋体" w:hint="eastAsia"/>
+          <w:kern w:val="0"/>
+          <w:sz w:val="22"/>
+          <w:lang w:val="zh-CN"/>
+        </w:rPr>
+        <w:t>，卷绕机的数量远大于涂布机，这意味着卷绕环节相关设备（包括控制和检测）的市场规模也相应更大。</w:t>
+      </w:r>
+    </w:p>
+    <w:p>
+      <w:pPr>
+        <w:spacing w:beforeLines="50" w:before="156"/>
+        <w:rPr>
+          <w:rFonts w:ascii="楷体" w:eastAsia="楷体" w:hAnsi="楷体" w:cs="宋体" w:hint="eastAsia"/>
+          <w:kern w:val="0"/>
+          <w:sz w:val="22"/>
+          <w:lang w:val="zh-CN"/>
+        </w:rPr>
+      </w:pPr>
+    </w:p>
+    <w:p>
+      <w:pPr>
+        <w:pStyle w:val="a3"/>
+        <w:numPr>
+          <w:ilvl w:val="0"/>
+          <w:numId w:val="13"/>
+        </w:numPr>
+        <w:spacing w:beforeLines="50" w:before="156" w:afterLines="50" w:after="156"/>
+        <w:ind w:left="357" w:firstLineChars="0" w:hanging="357"/>
+        <w:rPr>
+          <w:rFonts w:ascii="楷体" w:eastAsia="楷体" w:hAnsi="楷体" w:cs="宋体" w:hint="eastAsia"/>
+          <w:b/>
+          <w:kern w:val="0"/>
+          <w:sz w:val="22"/>
+          <w:lang w:val="zh-CN"/>
+        </w:rPr>
+      </w:pPr>
+      <w:r>
+        <w:rPr>
+          <w:rFonts w:ascii="楷体" w:eastAsia="楷体" w:hAnsi="楷体" w:cs="宋体"/>
+          <w:b/>
+          <w:kern w:val="0"/>
+          <w:sz w:val="22"/>
+          <w:lang w:val="zh-CN"/>
+        </w:rPr>
+        <w:t>智能检测：以绝对实力赢得关键项目</w:t>
+      </w:r>
+    </w:p>
+    <w:p>
+      <w:pPr>
+        <w:pStyle w:val="a3"/>
+        <w:numPr>
+          <w:ilvl w:val="1"/>
+          <w:numId w:val="10"/>
+        </w:numPr>
+        <w:spacing w:beforeLines="50" w:before="156"/>
+        <w:ind w:firstLineChars="0"/>
+        <w:rPr>
+          <w:rFonts w:ascii="楷体" w:eastAsia="楷体" w:hAnsi="楷体" w:cs="宋体" w:hint="eastAsia"/>
+          <w:b/>
+          <w:bCs/>
+          <w:kern w:val="0"/>
+          <w:sz w:val="22"/>
+          <w:lang w:val="zh-CN"/>
+        </w:rPr>
+      </w:pPr>
+      <w:r>
+        <w:rPr>
+          <w:rFonts w:ascii="楷体" w:eastAsia="楷体" w:hAnsi="楷体" w:cs="宋体"/>
+          <w:b/>
+          <w:bCs/>
+          <w:kern w:val="0"/>
+          <w:sz w:val="22"/>
+          <w:lang w:val="zh-CN"/>
+        </w:rPr>
+        <w:t>核心原则与六面检测的挑战</w:t>
+      </w:r>
+    </w:p>
+    <w:p>
+      <w:pPr>
+        <w:pStyle w:val="a3"/>
+        <w:numPr>
+          <w:ilvl w:val="1"/>
+          <w:numId w:val="4"/>
+        </w:numPr>
+        <w:spacing w:beforeLines="50" w:before="156"/>
+        <w:ind w:firstLineChars="0"/>
+        <w:rPr>
+          <w:rFonts w:ascii="楷体" w:eastAsia="楷体" w:hAnsi="楷体" w:cs="宋体" w:hint="eastAsia"/>
+          <w:kern w:val="0"/>
+          <w:sz w:val="22"/>
+          <w:lang w:val="zh-CN"/>
+        </w:rPr>
+      </w:pPr>
+      <w:proofErr w:type="gramStart"/>
+      <w:r>
+        <w:rPr>
+          <w:rFonts w:ascii="楷体" w:eastAsia="楷体" w:hAnsi="楷体" w:cs="宋体" w:hint="eastAsia"/>
+          <w:b/>
+          <w:bCs/>
+          <w:kern w:val="0"/>
+          <w:sz w:val="22"/>
+          <w:lang w:val="zh-CN"/>
+        </w:rPr>
+        <w:t>无人化</w:t>
+      </w:r>
+      <w:proofErr w:type="gramEnd"/>
+      <w:r>
+        <w:rPr>
+          <w:rFonts w:ascii="楷体" w:eastAsia="楷体" w:hAnsi="楷体" w:cs="宋体" w:hint="eastAsia"/>
+          <w:b/>
+          <w:bCs/>
+          <w:kern w:val="0"/>
+          <w:sz w:val="22"/>
+          <w:lang w:val="zh-CN"/>
+        </w:rPr>
+        <w:t>理念：</w:t>
+      </w:r>
+      <w:r>
+        <w:rPr>
+          <w:rFonts w:ascii="楷体" w:eastAsia="楷体" w:hAnsi="楷体" w:cs="宋体" w:hint="eastAsia"/>
+          <w:kern w:val="0"/>
+          <w:sz w:val="22"/>
+          <w:lang w:val="zh-CN"/>
+        </w:rPr>
+        <w:t>宁德时代学习半导体行业的制造理念，力求在生产过程中完全避免人工对产品的碰触，以杜绝人为因素对产品一致性和品质的干扰。</w:t>
+      </w:r>
+    </w:p>
+    <w:p>
+      <w:pPr>
+        <w:pStyle w:val="a3"/>
+        <w:numPr>
+          <w:ilvl w:val="1"/>
+          <w:numId w:val="4"/>
+        </w:numPr>
+        <w:spacing w:beforeLines="50" w:before="156"/>
+        <w:ind w:firstLineChars="0"/>
+        <w:rPr>
+          <w:rFonts w:ascii="楷体" w:eastAsia="楷体" w:hAnsi="楷体" w:cs="宋体" w:hint="eastAsia"/>
+          <w:kern w:val="0"/>
+          <w:sz w:val="22"/>
+          <w:lang w:val="zh-CN"/>
+        </w:rPr>
+      </w:pPr>
+      <w:r>
+        <w:rPr>
+          <w:rFonts w:ascii="楷体" w:eastAsia="楷体" w:hAnsi="楷体" w:cs="宋体" w:hint="eastAsia"/>
+          <w:b/>
+          <w:bCs/>
+          <w:kern w:val="0"/>
+          <w:sz w:val="22"/>
+          <w:lang w:val="zh-CN"/>
+        </w:rPr>
+        <w:t>终极挑战：</w:t>
+      </w:r>
+      <w:r>
+        <w:rPr>
+          <w:rFonts w:ascii="楷体" w:eastAsia="楷体" w:hAnsi="楷体" w:cs="宋体" w:hint="eastAsia"/>
+          <w:kern w:val="0"/>
+          <w:sz w:val="22"/>
+          <w:lang w:val="zh-CN"/>
+        </w:rPr>
+        <w:t>电芯的最终六面外观检测是实现这一理念的关键瓶颈。其难度极高，融合了多项技术挑战：</w:t>
+      </w:r>
+    </w:p>
+    <w:p>
+      <w:pPr>
+        <w:pStyle w:val="a3"/>
+        <w:numPr>
+          <w:ilvl w:val="1"/>
+          <w:numId w:val="12"/>
+        </w:numPr>
+        <w:spacing w:beforeLines="50" w:before="156"/>
+        <w:ind w:left="1276" w:firstLineChars="0"/>
+        <w:rPr>
+          <w:rFonts w:ascii="楷体" w:eastAsia="楷体" w:hAnsi="楷体" w:cs="宋体" w:hint="eastAsia"/>
+          <w:kern w:val="0"/>
+          <w:sz w:val="22"/>
+          <w:lang w:val="zh-CN"/>
+        </w:rPr>
+      </w:pPr>
+      <w:r>
+        <w:rPr>
+          <w:rFonts w:ascii="楷体" w:eastAsia="楷体" w:hAnsi="楷体" w:cs="宋体" w:hint="eastAsia"/>
+          <w:b/>
+          <w:bCs/>
+          <w:kern w:val="0"/>
+          <w:sz w:val="22"/>
+          <w:lang w:val="zh-CN"/>
+        </w:rPr>
+        <w:t>精密机械：</w:t>
+      </w:r>
+      <w:r>
+        <w:rPr>
+          <w:rFonts w:ascii="楷体" w:eastAsia="楷体" w:hAnsi="楷体" w:cs="宋体" w:hint="eastAsia"/>
+          <w:kern w:val="0"/>
+          <w:sz w:val="22"/>
+          <w:lang w:val="zh-CN"/>
+        </w:rPr>
+        <w:t>需要设计复杂的机械结构来高速、平稳地翻转电芯，同时要确保夹持点后续也能被无死角地检测到。</w:t>
+      </w:r>
+    </w:p>
+    <w:p>
+      <w:pPr>
+        <w:pStyle w:val="a3"/>
+        <w:numPr>
+          <w:ilvl w:val="1"/>
+          <w:numId w:val="12"/>
+        </w:numPr>
+        <w:spacing w:beforeLines="50" w:before="156"/>
+        <w:ind w:left="1276" w:firstLineChars="0"/>
+        <w:rPr>
+          <w:rFonts w:ascii="楷体" w:eastAsia="楷体" w:hAnsi="楷体" w:cs="宋体" w:hint="eastAsia"/>
+          <w:kern w:val="0"/>
+          <w:sz w:val="22"/>
+          <w:lang w:val="zh-CN"/>
+        </w:rPr>
+      </w:pPr>
+      <w:r>
+        <w:rPr>
+          <w:rFonts w:ascii="楷体" w:eastAsia="楷体" w:hAnsi="楷体" w:cs="宋体" w:hint="eastAsia"/>
+          <w:b/>
+          <w:bCs/>
+          <w:kern w:val="0"/>
+          <w:sz w:val="22"/>
+          <w:lang w:val="zh-CN"/>
+        </w:rPr>
+        <w:t>复杂光学：</w:t>
+      </w:r>
+      <w:r>
+        <w:rPr>
+          <w:rFonts w:ascii="楷体" w:eastAsia="楷体" w:hAnsi="楷体" w:cs="宋体" w:hint="eastAsia"/>
+          <w:kern w:val="0"/>
+          <w:sz w:val="22"/>
+          <w:lang w:val="zh-CN"/>
+        </w:rPr>
+        <w:t>电芯的棱角处极易因反光导致图像曝光过度，对打光技术和环境</w:t>
+      </w:r>
+      <w:proofErr w:type="gramStart"/>
+      <w:r>
+        <w:rPr>
+          <w:rFonts w:ascii="楷体" w:eastAsia="楷体" w:hAnsi="楷体" w:cs="宋体" w:hint="eastAsia"/>
+          <w:kern w:val="0"/>
+          <w:sz w:val="22"/>
+          <w:lang w:val="zh-CN"/>
+        </w:rPr>
+        <w:t>光控制</w:t>
+      </w:r>
+      <w:proofErr w:type="gramEnd"/>
+      <w:r>
+        <w:rPr>
+          <w:rFonts w:ascii="楷体" w:eastAsia="楷体" w:hAnsi="楷体" w:cs="宋体" w:hint="eastAsia"/>
+          <w:kern w:val="0"/>
+          <w:sz w:val="22"/>
+          <w:lang w:val="zh-CN"/>
+        </w:rPr>
+        <w:t>要求极高。</w:t>
+      </w:r>
+    </w:p>
+    <w:p>
+      <w:pPr>
+        <w:pStyle w:val="a3"/>
+        <w:numPr>
+          <w:ilvl w:val="1"/>
+          <w:numId w:val="12"/>
+        </w:numPr>
+        <w:spacing w:beforeLines="50" w:before="156"/>
+        <w:ind w:left="1276" w:firstLineChars="0"/>
+        <w:rPr>
+          <w:rFonts w:ascii="楷体" w:eastAsia="楷体" w:hAnsi="楷体" w:cs="宋体" w:hint="eastAsia"/>
+          <w:kern w:val="0"/>
+          <w:sz w:val="22"/>
+          <w:lang w:val="zh-CN"/>
+        </w:rPr>
+      </w:pPr>
+      <w:r>
+        <w:rPr>
+          <w:rFonts w:ascii="楷体" w:eastAsia="楷体" w:hAnsi="楷体" w:cs="宋体" w:hint="eastAsia"/>
+          <w:b/>
+          <w:bCs/>
+          <w:kern w:val="0"/>
+          <w:sz w:val="22"/>
+          <w:lang w:val="zh-CN"/>
+        </w:rPr>
+        <w:t>强大算法：</w:t>
+      </w:r>
+      <w:r>
+        <w:rPr>
+          <w:rFonts w:ascii="楷体" w:eastAsia="楷体" w:hAnsi="楷体" w:cs="宋体" w:hint="eastAsia"/>
+          <w:kern w:val="0"/>
+          <w:sz w:val="22"/>
+          <w:lang w:val="zh-CN"/>
+        </w:rPr>
+        <w:t>需检测上百个缺陷点，算法必须精准高效。</w:t>
+      </w:r>
+    </w:p>
+    <w:p>
+      <w:pPr>
+        <w:pStyle w:val="a3"/>
+        <w:numPr>
+          <w:ilvl w:val="1"/>
+          <w:numId w:val="12"/>
+        </w:numPr>
+        <w:spacing w:beforeLines="50" w:before="156"/>
+        <w:ind w:left="1276" w:firstLineChars="0"/>
+        <w:rPr>
+          <w:rFonts w:ascii="楷体" w:eastAsia="楷体" w:hAnsi="楷体" w:cs="宋体" w:hint="eastAsia"/>
+          <w:kern w:val="0"/>
+          <w:sz w:val="22"/>
+          <w:lang w:val="zh-CN"/>
+        </w:rPr>
+      </w:pPr>
+      <w:r>
+        <w:rPr>
+          <w:rFonts w:ascii="楷体" w:eastAsia="楷体" w:hAnsi="楷体" w:cs="宋体" w:hint="eastAsia"/>
+          <w:b/>
+          <w:bCs/>
+          <w:kern w:val="0"/>
+          <w:sz w:val="22"/>
+          <w:lang w:val="zh-CN"/>
+        </w:rPr>
+        <w:t>快速换型：</w:t>
+      </w:r>
+      <w:r>
+        <w:rPr>
+          <w:rFonts w:ascii="楷体" w:eastAsia="楷体" w:hAnsi="楷体" w:cs="宋体" w:hint="eastAsia"/>
+          <w:kern w:val="0"/>
+          <w:sz w:val="22"/>
+          <w:lang w:val="zh-CN"/>
+        </w:rPr>
+        <w:t>宁德时代产品型号极其丰富，均为定制化。检测系统必须能够在新旧型号间快速切换，无需长时间的重新编程或算法迭代，这对模型的泛化能力是巨大考验。</w:t>
+      </w:r>
+    </w:p>
+    <w:p>
+      <w:pPr>
+        <w:pStyle w:val="a3"/>
+        <w:numPr>
+          <w:ilvl w:val="1"/>
+          <w:numId w:val="10"/>
+        </w:numPr>
+        <w:spacing w:beforeLines="50" w:before="156"/>
+        <w:ind w:firstLineChars="0"/>
+        <w:rPr>
+          <w:rFonts w:ascii="楷体" w:eastAsia="楷体" w:hAnsi="楷体" w:cs="宋体" w:hint="eastAsia"/>
+          <w:b/>
+          <w:bCs/>
+          <w:kern w:val="0"/>
+          <w:sz w:val="22"/>
+          <w:lang w:val="zh-CN"/>
+        </w:rPr>
+      </w:pPr>
+      <w:r>
+        <w:rPr>
+          <w:rFonts w:ascii="楷体" w:eastAsia="楷体" w:hAnsi="楷体" w:cs="宋体"/>
+          <w:b/>
+          <w:bCs/>
+          <w:kern w:val="0"/>
+          <w:sz w:val="22"/>
+          <w:lang w:val="zh-CN"/>
+        </w:rPr>
+        <w:t>POC验证：击败巨头的胜利</w:t>
+      </w:r>
+    </w:p>
+    <w:p>
+      <w:pPr>
+        <w:pStyle w:val="a3"/>
+        <w:numPr>
+          <w:ilvl w:val="1"/>
+          <w:numId w:val="4"/>
+        </w:numPr>
+        <w:spacing w:beforeLines="50" w:before="156"/>
+        <w:ind w:firstLineChars="0"/>
+        <w:rPr>
+          <w:rFonts w:ascii="楷体" w:eastAsia="楷体" w:hAnsi="楷体" w:cs="宋体" w:hint="eastAsia"/>
+          <w:kern w:val="0"/>
+          <w:sz w:val="22"/>
+          <w:lang w:val="zh-CN"/>
+        </w:rPr>
+      </w:pPr>
+      <w:r>
+        <w:rPr>
+          <w:rFonts w:ascii="楷体" w:eastAsia="楷体" w:hAnsi="楷体" w:cs="宋体" w:hint="eastAsia"/>
+          <w:b/>
+          <w:bCs/>
+          <w:kern w:val="0"/>
+          <w:sz w:val="22"/>
+          <w:lang w:val="zh-CN"/>
+        </w:rPr>
+        <w:t>筛选模式：</w:t>
+      </w:r>
+      <w:r>
+        <w:rPr>
+          <w:rFonts w:ascii="楷体" w:eastAsia="楷体" w:hAnsi="楷体" w:cs="宋体" w:hint="eastAsia"/>
+          <w:kern w:val="0"/>
+          <w:sz w:val="22"/>
+          <w:lang w:val="zh-CN"/>
+        </w:rPr>
+        <w:t>由于该项目难度史无前例，市场上没有现成的解决方案，宁德时代采用了POC（Proof of Concept）概念验证的方式，向</w:t>
+      </w:r>
+      <w:proofErr w:type="gramStart"/>
+      <w:r>
+        <w:rPr>
+          <w:rFonts w:ascii="楷体" w:eastAsia="楷体" w:hAnsi="楷体" w:cs="宋体" w:hint="eastAsia"/>
+          <w:kern w:val="0"/>
+          <w:sz w:val="22"/>
+          <w:lang w:val="zh-CN"/>
+        </w:rPr>
+        <w:t>业界广发英雄</w:t>
+      </w:r>
+      <w:proofErr w:type="gramEnd"/>
+      <w:r>
+        <w:rPr>
+          <w:rFonts w:ascii="楷体" w:eastAsia="楷体" w:hAnsi="楷体" w:cs="宋体" w:hint="eastAsia"/>
+          <w:kern w:val="0"/>
+          <w:sz w:val="22"/>
+          <w:lang w:val="zh-CN"/>
+        </w:rPr>
+        <w:t>帖，邀请有能力的公司前来攻关，谁能解决难题，就优先定点给谁。</w:t>
+      </w:r>
+    </w:p>
+    <w:p>
+      <w:pPr>
+        <w:pStyle w:val="a3"/>
+        <w:numPr>
+          <w:ilvl w:val="1"/>
+          <w:numId w:val="4"/>
+        </w:numPr>
+        <w:spacing w:beforeLines="50" w:before="156"/>
+        <w:ind w:firstLineChars="0"/>
+        <w:rPr>
+          <w:rFonts w:ascii="楷体" w:eastAsia="楷体" w:hAnsi="楷体" w:cs="宋体" w:hint="eastAsia"/>
+          <w:kern w:val="0"/>
+          <w:sz w:val="22"/>
+          <w:lang w:val="zh-CN"/>
+        </w:rPr>
+      </w:pPr>
+      <w:r>
+        <w:rPr>
+          <w:rFonts w:ascii="楷体" w:eastAsia="楷体" w:hAnsi="楷体" w:cs="宋体" w:hint="eastAsia"/>
+          <w:b/>
+          <w:bCs/>
+          <w:kern w:val="0"/>
+          <w:sz w:val="22"/>
+          <w:lang w:val="zh-CN"/>
+        </w:rPr>
+        <w:t>激烈竞争：</w:t>
+      </w:r>
+      <w:r>
+        <w:rPr>
+          <w:rFonts w:ascii="楷体" w:eastAsia="楷体" w:hAnsi="楷体" w:cs="宋体" w:hint="eastAsia"/>
+          <w:kern w:val="0"/>
+          <w:sz w:val="22"/>
+          <w:lang w:val="zh-CN"/>
+        </w:rPr>
+        <w:t>参与该项目的公司包括多家业界巨头，</w:t>
+      </w:r>
+      <w:proofErr w:type="gramStart"/>
+      <w:r>
+        <w:rPr>
+          <w:rFonts w:ascii="楷体" w:eastAsia="楷体" w:hAnsi="楷体" w:cs="宋体" w:hint="eastAsia"/>
+          <w:kern w:val="0"/>
+          <w:sz w:val="22"/>
+          <w:lang w:val="zh-CN"/>
+        </w:rPr>
+        <w:t>如腾讯和</w:t>
+      </w:r>
+      <w:proofErr w:type="gramEnd"/>
+      <w:r>
+        <w:rPr>
+          <w:rFonts w:ascii="楷体" w:eastAsia="楷体" w:hAnsi="楷体" w:cs="宋体" w:hint="eastAsia"/>
+          <w:kern w:val="0"/>
+          <w:sz w:val="22"/>
+          <w:lang w:val="zh-CN"/>
+        </w:rPr>
+        <w:t>华为等，他们均派出了各自顶尖的算法团队和核心研发力量参与攻坚。</w:t>
+      </w:r>
+    </w:p>
+    <w:p>
+      <w:pPr>
+        <w:pStyle w:val="a3"/>
+        <w:numPr>
+          <w:ilvl w:val="1"/>
+          <w:numId w:val="4"/>
+        </w:numPr>
+        <w:spacing w:beforeLines="50" w:before="156"/>
+        <w:ind w:firstLineChars="0"/>
+        <w:rPr>
+          <w:rFonts w:ascii="楷体" w:eastAsia="楷体" w:hAnsi="楷体" w:cs="宋体" w:hint="eastAsia"/>
+          <w:kern w:val="0"/>
+          <w:sz w:val="22"/>
+          <w:lang w:val="zh-CN"/>
+        </w:rPr>
+      </w:pPr>
+      <w:proofErr w:type="gramStart"/>
+      <w:r>
+        <w:rPr>
+          <w:rFonts w:ascii="楷体" w:eastAsia="楷体" w:hAnsi="楷体" w:cs="宋体" w:hint="eastAsia"/>
+          <w:b/>
+          <w:bCs/>
+          <w:kern w:val="0"/>
+          <w:sz w:val="22"/>
+          <w:lang w:val="zh-CN"/>
+        </w:rPr>
+        <w:t>安脉</w:t>
+      </w:r>
+      <w:proofErr w:type="gramEnd"/>
+      <w:r>
+        <w:rPr>
+          <w:rFonts w:ascii="楷体" w:eastAsia="楷体" w:hAnsi="楷体" w:cs="宋体" w:hint="eastAsia"/>
+          <w:b/>
+          <w:bCs/>
+          <w:kern w:val="0"/>
+          <w:sz w:val="22"/>
+          <w:lang w:val="zh-CN"/>
+        </w:rPr>
+        <w:t>盛胜出：</w:t>
+      </w:r>
+      <w:r>
+        <w:rPr>
+          <w:rFonts w:ascii="楷体" w:eastAsia="楷体" w:hAnsi="楷体" w:cs="宋体" w:hint="eastAsia"/>
+          <w:kern w:val="0"/>
+          <w:sz w:val="22"/>
+          <w:lang w:val="zh-CN"/>
+        </w:rPr>
+        <w:t>在漫长而艰难的攻关过程中，多家大公司因无法达到要求而中途退出。最终，只有</w:t>
+      </w:r>
+      <w:proofErr w:type="gramStart"/>
+      <w:r>
+        <w:rPr>
+          <w:rFonts w:ascii="楷体" w:eastAsia="楷体" w:hAnsi="楷体" w:cs="宋体" w:hint="eastAsia"/>
+          <w:kern w:val="0"/>
+          <w:sz w:val="22"/>
+          <w:lang w:val="zh-CN"/>
+        </w:rPr>
+        <w:t>安脉</w:t>
+      </w:r>
+      <w:proofErr w:type="gramEnd"/>
+      <w:r>
+        <w:rPr>
+          <w:rFonts w:ascii="楷体" w:eastAsia="楷体" w:hAnsi="楷体" w:cs="宋体" w:hint="eastAsia"/>
+          <w:kern w:val="0"/>
+          <w:sz w:val="22"/>
+          <w:lang w:val="zh-CN"/>
+        </w:rPr>
+        <w:t>盛凭借其综合实力，成功攻克了所有技术难题，其方案</w:t>
+      </w:r>
+      <w:r>
+        <w:rPr>
+          <w:rFonts w:ascii="楷体" w:eastAsia="楷体" w:hAnsi="楷体" w:cs="宋体" w:hint="eastAsia"/>
+          <w:kern w:val="0"/>
+          <w:sz w:val="22"/>
+          <w:lang w:val="zh-CN"/>
+        </w:rPr>
+        <w:lastRenderedPageBreak/>
+        <w:t>在各项指标上均满足了宁德时代的要求，从而赢得了该项目。</w:t>
+      </w:r>
+    </w:p>
+    <w:p>
+      <w:pPr>
+        <w:pStyle w:val="a3"/>
+        <w:numPr>
+          <w:ilvl w:val="1"/>
+          <w:numId w:val="10"/>
+        </w:numPr>
+        <w:spacing w:beforeLines="50" w:before="156"/>
+        <w:ind w:firstLineChars="0"/>
+        <w:rPr>
+          <w:rFonts w:ascii="楷体" w:eastAsia="楷体" w:hAnsi="楷体" w:cs="宋体" w:hint="eastAsia"/>
+          <w:b/>
+          <w:bCs/>
+          <w:kern w:val="0"/>
+          <w:sz w:val="22"/>
+          <w:lang w:val="zh-CN"/>
+        </w:rPr>
+      </w:pPr>
+      <w:r>
+        <w:rPr>
+          <w:rFonts w:ascii="楷体" w:eastAsia="楷体" w:hAnsi="楷体" w:cs="宋体"/>
+          <w:b/>
+          <w:bCs/>
+          <w:kern w:val="0"/>
+          <w:sz w:val="22"/>
+          <w:lang w:val="zh-CN"/>
+        </w:rPr>
+        <w:t>应用拓展与市场空间</w:t>
+      </w:r>
+    </w:p>
+    <w:p>
+      <w:pPr>
+        <w:pStyle w:val="a3"/>
+        <w:numPr>
+          <w:ilvl w:val="1"/>
+          <w:numId w:val="4"/>
+        </w:numPr>
+        <w:spacing w:beforeLines="50" w:before="156"/>
+        <w:ind w:firstLineChars="0"/>
+        <w:rPr>
+          <w:rFonts w:ascii="楷体" w:eastAsia="楷体" w:hAnsi="楷体" w:cs="宋体" w:hint="eastAsia"/>
+          <w:kern w:val="0"/>
+          <w:sz w:val="22"/>
+          <w:lang w:val="zh-CN"/>
+        </w:rPr>
+      </w:pPr>
+      <w:r>
+        <w:rPr>
+          <w:rFonts w:ascii="楷体" w:eastAsia="楷体" w:hAnsi="楷体" w:cs="宋体" w:hint="eastAsia"/>
+          <w:b/>
+          <w:bCs/>
+          <w:kern w:val="0"/>
+          <w:sz w:val="22"/>
+          <w:lang w:val="zh-CN"/>
+        </w:rPr>
+        <w:t>应用范围：</w:t>
+      </w:r>
+      <w:r>
+        <w:rPr>
+          <w:rFonts w:ascii="楷体" w:eastAsia="楷体" w:hAnsi="楷体" w:cs="宋体" w:hint="eastAsia"/>
+          <w:kern w:val="0"/>
+          <w:sz w:val="22"/>
+          <w:lang w:val="zh-CN"/>
+        </w:rPr>
+        <w:t>除了难度最高的最终电</w:t>
+      </w:r>
+      <w:proofErr w:type="gramStart"/>
+      <w:r>
+        <w:rPr>
+          <w:rFonts w:ascii="楷体" w:eastAsia="楷体" w:hAnsi="楷体" w:cs="宋体" w:hint="eastAsia"/>
+          <w:kern w:val="0"/>
+          <w:sz w:val="22"/>
+          <w:lang w:val="zh-CN"/>
+        </w:rPr>
+        <w:t>芯六面目</w:t>
+      </w:r>
+      <w:proofErr w:type="gramEnd"/>
+      <w:r>
+        <w:rPr>
+          <w:rFonts w:ascii="楷体" w:eastAsia="楷体" w:hAnsi="楷体" w:cs="宋体" w:hint="eastAsia"/>
+          <w:kern w:val="0"/>
+          <w:sz w:val="22"/>
+          <w:lang w:val="zh-CN"/>
+        </w:rPr>
+        <w:t>检设备，</w:t>
+      </w:r>
+      <w:proofErr w:type="gramStart"/>
+      <w:r>
+        <w:rPr>
+          <w:rFonts w:ascii="楷体" w:eastAsia="楷体" w:hAnsi="楷体" w:cs="宋体" w:hint="eastAsia"/>
+          <w:kern w:val="0"/>
+          <w:sz w:val="22"/>
+          <w:lang w:val="zh-CN"/>
+        </w:rPr>
+        <w:t>安脉</w:t>
+      </w:r>
+      <w:proofErr w:type="gramEnd"/>
+      <w:r>
+        <w:rPr>
+          <w:rFonts w:ascii="楷体" w:eastAsia="楷体" w:hAnsi="楷体" w:cs="宋体" w:hint="eastAsia"/>
+          <w:kern w:val="0"/>
+          <w:sz w:val="22"/>
+          <w:lang w:val="zh-CN"/>
+        </w:rPr>
+        <w:t>盛的视觉检测技术还被广泛应用到生产过程中的多个环节，如</w:t>
+      </w:r>
+      <w:proofErr w:type="gramStart"/>
+      <w:r>
+        <w:rPr>
+          <w:rFonts w:ascii="楷体" w:eastAsia="楷体" w:hAnsi="楷体" w:cs="宋体" w:hint="eastAsia"/>
+          <w:kern w:val="0"/>
+          <w:sz w:val="22"/>
+          <w:lang w:val="zh-CN"/>
+        </w:rPr>
+        <w:t>极耳翻折状态</w:t>
+      </w:r>
+      <w:proofErr w:type="gramEnd"/>
+      <w:r>
+        <w:rPr>
+          <w:rFonts w:ascii="楷体" w:eastAsia="楷体" w:hAnsi="楷体" w:cs="宋体" w:hint="eastAsia"/>
+          <w:kern w:val="0"/>
+          <w:sz w:val="22"/>
+          <w:lang w:val="zh-CN"/>
+        </w:rPr>
+        <w:t>检测、分切后的毛刺检测等。</w:t>
+      </w:r>
+    </w:p>
+    <w:p>
+      <w:pPr>
+        <w:pStyle w:val="a3"/>
+        <w:numPr>
+          <w:ilvl w:val="1"/>
+          <w:numId w:val="4"/>
+        </w:numPr>
+        <w:spacing w:beforeLines="50" w:before="156"/>
+        <w:ind w:firstLineChars="0"/>
+        <w:rPr>
+          <w:rFonts w:ascii="楷体" w:eastAsia="楷体" w:hAnsi="楷体" w:cs="宋体" w:hint="eastAsia"/>
+          <w:kern w:val="0"/>
+          <w:sz w:val="22"/>
+          <w:lang w:val="zh-CN"/>
+        </w:rPr>
+      </w:pPr>
+      <w:r>
+        <w:rPr>
+          <w:rFonts w:ascii="楷体" w:eastAsia="楷体" w:hAnsi="楷体" w:cs="宋体" w:hint="eastAsia"/>
+          <w:b/>
+          <w:bCs/>
+          <w:kern w:val="0"/>
+          <w:sz w:val="22"/>
+          <w:lang w:val="zh-CN"/>
+        </w:rPr>
+        <w:t>市场潜力：</w:t>
+      </w:r>
+      <w:r>
+        <w:rPr>
+          <w:rFonts w:ascii="楷体" w:eastAsia="楷体" w:hAnsi="楷体" w:cs="宋体" w:hint="eastAsia"/>
+          <w:kern w:val="0"/>
+          <w:sz w:val="22"/>
+          <w:lang w:val="zh-CN"/>
+        </w:rPr>
+        <w:t>与</w:t>
+      </w:r>
+      <w:proofErr w:type="gramStart"/>
+      <w:r>
+        <w:rPr>
+          <w:rFonts w:ascii="楷体" w:eastAsia="楷体" w:hAnsi="楷体" w:cs="宋体" w:hint="eastAsia"/>
+          <w:kern w:val="0"/>
+          <w:sz w:val="22"/>
+          <w:lang w:val="zh-CN"/>
+        </w:rPr>
+        <w:t>一条产线仅</w:t>
+      </w:r>
+      <w:proofErr w:type="gramEnd"/>
+      <w:r>
+        <w:rPr>
+          <w:rFonts w:ascii="楷体" w:eastAsia="楷体" w:hAnsi="楷体" w:cs="宋体" w:hint="eastAsia"/>
+          <w:kern w:val="0"/>
+          <w:sz w:val="22"/>
+          <w:lang w:val="zh-CN"/>
+        </w:rPr>
+        <w:t>需几台的涂布机或辊压机不同，检测类设备</w:t>
+      </w:r>
+      <w:proofErr w:type="gramStart"/>
+      <w:r>
+        <w:rPr>
+          <w:rFonts w:ascii="楷体" w:eastAsia="楷体" w:hAnsi="楷体" w:cs="宋体" w:hint="eastAsia"/>
+          <w:kern w:val="0"/>
+          <w:sz w:val="22"/>
+          <w:lang w:val="zh-CN"/>
+        </w:rPr>
+        <w:t>在产线中</w:t>
+      </w:r>
+      <w:proofErr w:type="gramEnd"/>
+      <w:r>
+        <w:rPr>
+          <w:rFonts w:ascii="楷体" w:eastAsia="楷体" w:hAnsi="楷体" w:cs="宋体" w:hint="eastAsia"/>
+          <w:kern w:val="0"/>
+          <w:sz w:val="22"/>
+          <w:lang w:val="zh-CN"/>
+        </w:rPr>
+        <w:t>的数量要大得多，因此其市场空间和设备需求量远超前道的智能控制设备。</w:t>
+      </w:r>
+    </w:p>
+    <w:p>
+      <w:pPr>
+        <w:spacing w:beforeLines="50" w:before="156"/>
+        <w:rPr>
+          <w:rFonts w:ascii="楷体" w:eastAsia="楷体" w:hAnsi="楷体" w:cs="宋体" w:hint="eastAsia"/>
+          <w:kern w:val="0"/>
+          <w:sz w:val="22"/>
+          <w:lang w:val="zh-CN"/>
+        </w:rPr>
+      </w:pPr>
+    </w:p>
+    <w:p>
+      <w:pPr>
+        <w:pStyle w:val="a3"/>
+        <w:numPr>
+          <w:ilvl w:val="0"/>
+          <w:numId w:val="13"/>
+        </w:numPr>
+        <w:spacing w:beforeLines="50" w:before="156" w:afterLines="50" w:after="156"/>
+        <w:ind w:left="357" w:firstLineChars="0" w:hanging="357"/>
+        <w:rPr>
+          <w:rFonts w:ascii="楷体" w:eastAsia="楷体" w:hAnsi="楷体" w:cs="宋体" w:hint="eastAsia"/>
+          <w:b/>
+          <w:kern w:val="0"/>
+          <w:sz w:val="22"/>
+          <w:lang w:val="zh-CN"/>
+        </w:rPr>
+      </w:pPr>
+      <w:r>
+        <w:rPr>
+          <w:rFonts w:ascii="楷体" w:eastAsia="楷体" w:hAnsi="楷体" w:cs="宋体"/>
+          <w:b/>
+          <w:kern w:val="0"/>
+          <w:sz w:val="22"/>
+          <w:lang w:val="zh-CN"/>
+        </w:rPr>
+        <w:t>商业与采购策略</w:t>
+      </w:r>
+    </w:p>
+    <w:p>
+      <w:pPr>
+        <w:pStyle w:val="a3"/>
+        <w:numPr>
+          <w:ilvl w:val="1"/>
+          <w:numId w:val="10"/>
+        </w:numPr>
+        <w:spacing w:beforeLines="50" w:before="156"/>
+        <w:ind w:firstLineChars="0"/>
+        <w:rPr>
+          <w:rFonts w:ascii="楷体" w:eastAsia="楷体" w:hAnsi="楷体" w:cs="宋体" w:hint="eastAsia"/>
+          <w:b/>
+          <w:bCs/>
+          <w:kern w:val="0"/>
+          <w:sz w:val="22"/>
+          <w:lang w:val="zh-CN"/>
+        </w:rPr>
+      </w:pPr>
+      <w:r>
+        <w:rPr>
+          <w:rFonts w:ascii="楷体" w:eastAsia="楷体" w:hAnsi="楷体" w:cs="宋体"/>
+          <w:b/>
+          <w:bCs/>
+          <w:kern w:val="0"/>
+          <w:sz w:val="22"/>
+          <w:lang w:val="zh-CN"/>
+        </w:rPr>
+        <w:t>供应商合作策略：首创定点、寻求二供、核心排他</w:t>
+      </w:r>
+    </w:p>
+    <w:p>
+      <w:pPr>
+        <w:pStyle w:val="a3"/>
+        <w:numPr>
+          <w:ilvl w:val="1"/>
+          <w:numId w:val="4"/>
+        </w:numPr>
+        <w:spacing w:beforeLines="50" w:before="156"/>
+        <w:ind w:firstLineChars="0"/>
+        <w:rPr>
+          <w:rFonts w:ascii="楷体" w:eastAsia="楷体" w:hAnsi="楷体" w:cs="宋体" w:hint="eastAsia"/>
+          <w:kern w:val="0"/>
+          <w:sz w:val="22"/>
+          <w:lang w:val="zh-CN"/>
+        </w:rPr>
+      </w:pPr>
+      <w:r>
+        <w:rPr>
+          <w:rFonts w:ascii="楷体" w:eastAsia="楷体" w:hAnsi="楷体" w:cs="宋体" w:hint="eastAsia"/>
+          <w:b/>
+          <w:bCs/>
+          <w:kern w:val="0"/>
+          <w:sz w:val="22"/>
+          <w:lang w:val="zh-CN"/>
+        </w:rPr>
+        <w:t>首创定点：</w:t>
+      </w:r>
+      <w:r>
+        <w:rPr>
+          <w:rFonts w:ascii="楷体" w:eastAsia="楷体" w:hAnsi="楷体" w:cs="宋体" w:hint="eastAsia"/>
+          <w:kern w:val="0"/>
+          <w:sz w:val="22"/>
+          <w:lang w:val="zh-CN"/>
+        </w:rPr>
+        <w:t>对于行业内没有成熟解决方案的创新项目，宁德时代会采用联合开发或POC验证的方式，将首批量产订单定点给率先成功实现技术突破的厂商。</w:t>
+      </w:r>
+    </w:p>
+    <w:p>
+      <w:pPr>
+        <w:pStyle w:val="a3"/>
+        <w:numPr>
+          <w:ilvl w:val="1"/>
+          <w:numId w:val="4"/>
+        </w:numPr>
+        <w:spacing w:beforeLines="50" w:before="156"/>
+        <w:ind w:firstLineChars="0"/>
+        <w:rPr>
+          <w:rFonts w:ascii="楷体" w:eastAsia="楷体" w:hAnsi="楷体" w:cs="宋体" w:hint="eastAsia"/>
+          <w:kern w:val="0"/>
+          <w:sz w:val="22"/>
+          <w:lang w:val="zh-CN"/>
+        </w:rPr>
+      </w:pPr>
+      <w:r>
+        <w:rPr>
+          <w:rFonts w:ascii="楷体" w:eastAsia="楷体" w:hAnsi="楷体" w:cs="宋体" w:hint="eastAsia"/>
+          <w:b/>
+          <w:bCs/>
+          <w:kern w:val="0"/>
+          <w:sz w:val="22"/>
+          <w:lang w:val="zh-CN"/>
+        </w:rPr>
+        <w:t>寻求二供：</w:t>
+      </w:r>
+      <w:r>
+        <w:rPr>
+          <w:rFonts w:ascii="楷体" w:eastAsia="楷体" w:hAnsi="楷体" w:cs="宋体" w:hint="eastAsia"/>
+          <w:kern w:val="0"/>
+          <w:sz w:val="22"/>
+          <w:lang w:val="zh-CN"/>
+        </w:rPr>
+        <w:t>出于供应</w:t>
+      </w:r>
+      <w:proofErr w:type="gramStart"/>
+      <w:r>
+        <w:rPr>
+          <w:rFonts w:ascii="楷体" w:eastAsia="楷体" w:hAnsi="楷体" w:cs="宋体" w:hint="eastAsia"/>
+          <w:kern w:val="0"/>
+          <w:sz w:val="22"/>
+          <w:lang w:val="zh-CN"/>
+        </w:rPr>
+        <w:t>链安全</w:t>
+      </w:r>
+      <w:proofErr w:type="gramEnd"/>
+      <w:r>
+        <w:rPr>
+          <w:rFonts w:ascii="楷体" w:eastAsia="楷体" w:hAnsi="楷体" w:cs="宋体" w:hint="eastAsia"/>
+          <w:kern w:val="0"/>
+          <w:sz w:val="22"/>
+          <w:lang w:val="zh-CN"/>
+        </w:rPr>
+        <w:t>和成本优化的考虑，在首家供应商的产品成熟并实现量产后，宁德时代会积极在市场上寻找并扶持第二家供应商，形成竞争格局。</w:t>
+      </w:r>
+    </w:p>
+    <w:p>
+      <w:pPr>
+        <w:pStyle w:val="a3"/>
+        <w:numPr>
+          <w:ilvl w:val="1"/>
+          <w:numId w:val="4"/>
+        </w:numPr>
+        <w:spacing w:beforeLines="50" w:before="156"/>
+        <w:ind w:firstLineChars="0"/>
+        <w:rPr>
+          <w:rFonts w:ascii="楷体" w:eastAsia="楷体" w:hAnsi="楷体" w:cs="宋体" w:hint="eastAsia"/>
+          <w:kern w:val="0"/>
+          <w:sz w:val="22"/>
+          <w:lang w:val="zh-CN"/>
+        </w:rPr>
+      </w:pPr>
+      <w:r>
+        <w:rPr>
+          <w:rFonts w:ascii="楷体" w:eastAsia="楷体" w:hAnsi="楷体" w:cs="宋体" w:hint="eastAsia"/>
+          <w:b/>
+          <w:bCs/>
+          <w:kern w:val="0"/>
+          <w:sz w:val="22"/>
+          <w:lang w:val="zh-CN"/>
+        </w:rPr>
+        <w:t>核心排他：</w:t>
+      </w:r>
+      <w:r>
+        <w:rPr>
+          <w:rFonts w:ascii="楷体" w:eastAsia="楷体" w:hAnsi="楷体" w:cs="宋体" w:hint="eastAsia"/>
+          <w:kern w:val="0"/>
+          <w:sz w:val="22"/>
+          <w:lang w:val="zh-CN"/>
+        </w:rPr>
+        <w:t>对于集成了宁德时代核心制造Know-how的尖端设备，宁德时代会与</w:t>
+      </w:r>
+      <w:proofErr w:type="gramStart"/>
+      <w:r>
+        <w:rPr>
+          <w:rFonts w:ascii="楷体" w:eastAsia="楷体" w:hAnsi="楷体" w:cs="宋体" w:hint="eastAsia"/>
+          <w:kern w:val="0"/>
+          <w:sz w:val="22"/>
+          <w:lang w:val="zh-CN"/>
+        </w:rPr>
+        <w:t>安脉</w:t>
+      </w:r>
+      <w:proofErr w:type="gramEnd"/>
+      <w:r>
+        <w:rPr>
+          <w:rFonts w:ascii="楷体" w:eastAsia="楷体" w:hAnsi="楷体" w:cs="宋体" w:hint="eastAsia"/>
+          <w:kern w:val="0"/>
+          <w:sz w:val="22"/>
+          <w:lang w:val="zh-CN"/>
+        </w:rPr>
+        <w:t>盛等核心伙伴签订双向排他协议。宁德时代拥有6800多个核心质量控制点，这些Know-how会固化到设备控制逻辑中。为了保护这些知识产权，公司要求供应商不得将含有这些核心技术的设备出售给其他锂电池企业。作为交换，宁德时代会承诺优先采购该供应商的设备。</w:t>
+      </w:r>
+    </w:p>
+    <w:p>
+      <w:pPr>
+        <w:pStyle w:val="a3"/>
+        <w:numPr>
+          <w:ilvl w:val="1"/>
+          <w:numId w:val="10"/>
+        </w:numPr>
+        <w:spacing w:beforeLines="50" w:before="156"/>
+        <w:ind w:firstLineChars="0"/>
+        <w:rPr>
+          <w:rFonts w:ascii="楷体" w:eastAsia="楷体" w:hAnsi="楷体" w:cs="宋体" w:hint="eastAsia"/>
+          <w:b/>
+          <w:bCs/>
+          <w:kern w:val="0"/>
+          <w:sz w:val="22"/>
+          <w:lang w:val="zh-CN"/>
+        </w:rPr>
+      </w:pPr>
+      <w:r>
+        <w:rPr>
+          <w:rFonts w:ascii="楷体" w:eastAsia="楷体" w:hAnsi="楷体" w:cs="宋体"/>
+          <w:b/>
+          <w:bCs/>
+          <w:kern w:val="0"/>
+          <w:sz w:val="22"/>
+          <w:lang w:val="zh-CN"/>
+        </w:rPr>
+        <w:t>定价、议价与价值认可</w:t>
+      </w:r>
+    </w:p>
+    <w:p>
+      <w:pPr>
+        <w:pStyle w:val="a3"/>
+        <w:numPr>
+          <w:ilvl w:val="1"/>
+          <w:numId w:val="4"/>
+        </w:numPr>
+        <w:spacing w:beforeLines="50" w:before="156"/>
+        <w:ind w:firstLineChars="0"/>
+        <w:rPr>
+          <w:rFonts w:ascii="楷体" w:eastAsia="楷体" w:hAnsi="楷体" w:cs="宋体" w:hint="eastAsia"/>
+          <w:kern w:val="0"/>
+          <w:sz w:val="22"/>
+          <w:lang w:val="zh-CN"/>
+        </w:rPr>
+      </w:pPr>
+      <w:r>
+        <w:rPr>
+          <w:rFonts w:ascii="楷体" w:eastAsia="楷体" w:hAnsi="楷体" w:cs="宋体" w:hint="eastAsia"/>
+          <w:b/>
+          <w:bCs/>
+          <w:kern w:val="0"/>
+          <w:sz w:val="22"/>
+          <w:lang w:val="zh-CN"/>
+        </w:rPr>
+        <w:t>职责分离：</w:t>
+      </w:r>
+      <w:r>
+        <w:rPr>
+          <w:rFonts w:ascii="楷体" w:eastAsia="楷体" w:hAnsi="楷体" w:cs="宋体" w:hint="eastAsia"/>
+          <w:kern w:val="0"/>
+          <w:sz w:val="22"/>
+          <w:lang w:val="zh-CN"/>
+        </w:rPr>
+        <w:t>技术部门（如智能工厂）负责提出需求和验证技术方案，但不参与具体的商务定价，定价由采购部门负责，以保证流程的专业性和公正性。</w:t>
+      </w:r>
+    </w:p>
+    <w:p>
+      <w:pPr>
+        <w:pStyle w:val="a3"/>
+        <w:numPr>
+          <w:ilvl w:val="1"/>
+          <w:numId w:val="4"/>
+        </w:numPr>
+        <w:spacing w:beforeLines="50" w:before="156"/>
+        <w:ind w:firstLineChars="0"/>
+        <w:rPr>
+          <w:rFonts w:ascii="楷体" w:eastAsia="楷体" w:hAnsi="楷体" w:cs="宋体" w:hint="eastAsia"/>
+          <w:kern w:val="0"/>
+          <w:sz w:val="22"/>
+          <w:lang w:val="zh-CN"/>
+        </w:rPr>
+      </w:pPr>
+      <w:r>
+        <w:rPr>
+          <w:rFonts w:ascii="楷体" w:eastAsia="楷体" w:hAnsi="楷体" w:cs="宋体" w:hint="eastAsia"/>
+          <w:b/>
+          <w:bCs/>
+          <w:kern w:val="0"/>
+          <w:sz w:val="22"/>
+          <w:lang w:val="zh-CN"/>
+        </w:rPr>
+        <w:t>议价模式：</w:t>
+      </w:r>
+      <w:r>
+        <w:rPr>
+          <w:rFonts w:ascii="楷体" w:eastAsia="楷体" w:hAnsi="楷体" w:cs="宋体" w:hint="eastAsia"/>
+          <w:kern w:val="0"/>
+          <w:sz w:val="22"/>
+          <w:lang w:val="zh-CN"/>
+        </w:rPr>
+        <w:t>对于首台套验证机，采用一对一议价。进入批量采购阶段后，</w:t>
+      </w:r>
+      <w:proofErr w:type="gramStart"/>
+      <w:r>
+        <w:rPr>
+          <w:rFonts w:ascii="楷体" w:eastAsia="楷体" w:hAnsi="楷体" w:cs="宋体" w:hint="eastAsia"/>
+          <w:kern w:val="0"/>
+          <w:sz w:val="22"/>
+          <w:lang w:val="zh-CN"/>
+        </w:rPr>
+        <w:t>需走招投标</w:t>
+      </w:r>
+      <w:proofErr w:type="gramEnd"/>
+      <w:r>
+        <w:rPr>
+          <w:rFonts w:ascii="楷体" w:eastAsia="楷体" w:hAnsi="楷体" w:cs="宋体" w:hint="eastAsia"/>
+          <w:kern w:val="0"/>
+          <w:sz w:val="22"/>
+          <w:lang w:val="zh-CN"/>
+        </w:rPr>
+        <w:t>流程。但在没有</w:t>
+      </w:r>
+      <w:proofErr w:type="gramStart"/>
+      <w:r>
+        <w:rPr>
+          <w:rFonts w:ascii="楷体" w:eastAsia="楷体" w:hAnsi="楷体" w:cs="宋体" w:hint="eastAsia"/>
+          <w:kern w:val="0"/>
+          <w:sz w:val="22"/>
+          <w:lang w:val="zh-CN"/>
+        </w:rPr>
+        <w:t>合格二供的</w:t>
+      </w:r>
+      <w:proofErr w:type="gramEnd"/>
+      <w:r>
+        <w:rPr>
+          <w:rFonts w:ascii="楷体" w:eastAsia="楷体" w:hAnsi="楷体" w:cs="宋体" w:hint="eastAsia"/>
+          <w:kern w:val="0"/>
+          <w:sz w:val="22"/>
+          <w:lang w:val="zh-CN"/>
+        </w:rPr>
+        <w:t>情况下（如当前的智能模头），实际上仍是与</w:t>
+      </w:r>
+      <w:proofErr w:type="gramStart"/>
+      <w:r>
+        <w:rPr>
+          <w:rFonts w:ascii="楷体" w:eastAsia="楷体" w:hAnsi="楷体" w:cs="宋体" w:hint="eastAsia"/>
+          <w:kern w:val="0"/>
+          <w:sz w:val="22"/>
+          <w:lang w:val="zh-CN"/>
+        </w:rPr>
+        <w:t>安脉盛进行</w:t>
+      </w:r>
+      <w:proofErr w:type="gramEnd"/>
+      <w:r>
+        <w:rPr>
+          <w:rFonts w:ascii="楷体" w:eastAsia="楷体" w:hAnsi="楷体" w:cs="宋体" w:hint="eastAsia"/>
+          <w:kern w:val="0"/>
+          <w:sz w:val="22"/>
+          <w:lang w:val="zh-CN"/>
+        </w:rPr>
+        <w:t>持续的议价，宁德时代会在每次大批量下单时，利用规模优势寻求一定的价格折让。</w:t>
+      </w:r>
+    </w:p>
+    <w:p>
+      <w:pPr>
+        <w:pStyle w:val="a3"/>
+        <w:numPr>
+          <w:ilvl w:val="1"/>
+          <w:numId w:val="4"/>
+        </w:numPr>
+        <w:spacing w:beforeLines="50" w:before="156"/>
+        <w:ind w:firstLineChars="0"/>
+        <w:rPr>
+          <w:rFonts w:ascii="楷体" w:eastAsia="楷体" w:hAnsi="楷体" w:cs="宋体" w:hint="eastAsia"/>
+          <w:kern w:val="0"/>
+          <w:sz w:val="22"/>
+          <w:lang w:val="zh-CN"/>
+        </w:rPr>
+      </w:pPr>
+      <w:r>
+        <w:rPr>
+          <w:rFonts w:ascii="楷体" w:eastAsia="楷体" w:hAnsi="楷体" w:cs="宋体" w:hint="eastAsia"/>
+          <w:b/>
+          <w:bCs/>
+          <w:kern w:val="0"/>
+          <w:sz w:val="22"/>
+          <w:lang w:val="zh-CN"/>
+        </w:rPr>
+        <w:t>价值认可：</w:t>
+      </w:r>
+      <w:r>
+        <w:rPr>
+          <w:rFonts w:ascii="楷体" w:eastAsia="楷体" w:hAnsi="楷体" w:cs="宋体" w:hint="eastAsia"/>
+          <w:kern w:val="0"/>
+          <w:sz w:val="22"/>
+          <w:lang w:val="zh-CN"/>
+        </w:rPr>
+        <w:t>对于常规的大型设备，采购部门可能倾向于按BOM表核算成本。但对于</w:t>
+      </w:r>
+      <w:proofErr w:type="gramStart"/>
+      <w:r>
+        <w:rPr>
+          <w:rFonts w:ascii="楷体" w:eastAsia="楷体" w:hAnsi="楷体" w:cs="宋体" w:hint="eastAsia"/>
+          <w:kern w:val="0"/>
+          <w:sz w:val="22"/>
+          <w:lang w:val="zh-CN"/>
+        </w:rPr>
+        <w:t>安脉盛提供</w:t>
+      </w:r>
+      <w:proofErr w:type="gramEnd"/>
+      <w:r>
+        <w:rPr>
+          <w:rFonts w:ascii="楷体" w:eastAsia="楷体" w:hAnsi="楷体" w:cs="宋体" w:hint="eastAsia"/>
+          <w:kern w:val="0"/>
+          <w:sz w:val="22"/>
+          <w:lang w:val="zh-CN"/>
+        </w:rPr>
+        <w:t>的这类具有人无我有性质、核心价值在于算法和软件的精密控制系统，宁德时代会尊重其知识产权的价值，不会简单粗暴地仅按硬件成本定价。</w:t>
+      </w:r>
+    </w:p>
+    <w:p>
+      <w:pPr>
+        <w:pStyle w:val="a3"/>
+        <w:numPr>
+          <w:ilvl w:val="1"/>
+          <w:numId w:val="10"/>
+        </w:numPr>
+        <w:spacing w:beforeLines="50" w:before="156"/>
+        <w:ind w:firstLineChars="0"/>
+        <w:rPr>
+          <w:rFonts w:ascii="楷体" w:eastAsia="楷体" w:hAnsi="楷体" w:cs="宋体" w:hint="eastAsia"/>
+          <w:b/>
+          <w:bCs/>
+          <w:kern w:val="0"/>
+          <w:sz w:val="22"/>
+          <w:lang w:val="zh-CN"/>
+        </w:rPr>
+      </w:pPr>
+      <w:r>
+        <w:rPr>
+          <w:rFonts w:ascii="楷体" w:eastAsia="楷体" w:hAnsi="楷体" w:cs="宋体" w:hint="eastAsia"/>
+          <w:b/>
+          <w:bCs/>
+          <w:kern w:val="0"/>
+          <w:sz w:val="22"/>
+          <w:lang w:val="zh-CN"/>
+        </w:rPr>
+        <w:t>交付、验收与模型泛化</w:t>
+      </w:r>
+    </w:p>
+    <w:p>
+      <w:pPr>
+        <w:pStyle w:val="a3"/>
+        <w:numPr>
+          <w:ilvl w:val="1"/>
+          <w:numId w:val="4"/>
+        </w:numPr>
+        <w:spacing w:beforeLines="50" w:before="156"/>
+        <w:ind w:firstLineChars="0"/>
+        <w:rPr>
+          <w:rFonts w:ascii="楷体" w:eastAsia="楷体" w:hAnsi="楷体" w:cs="宋体" w:hint="eastAsia"/>
+          <w:kern w:val="0"/>
+          <w:sz w:val="22"/>
+          <w:lang w:val="zh-CN"/>
+        </w:rPr>
+      </w:pPr>
+      <w:r>
+        <w:rPr>
+          <w:rFonts w:ascii="楷体" w:eastAsia="楷体" w:hAnsi="楷体" w:cs="宋体" w:hint="eastAsia"/>
+          <w:b/>
+          <w:bCs/>
+          <w:kern w:val="0"/>
+          <w:sz w:val="22"/>
+          <w:lang w:val="zh-CN"/>
+        </w:rPr>
+        <w:t>交付与陪产：</w:t>
+      </w:r>
+      <w:proofErr w:type="gramStart"/>
+      <w:r>
+        <w:rPr>
+          <w:rFonts w:ascii="楷体" w:eastAsia="楷体" w:hAnsi="楷体" w:cs="宋体" w:hint="eastAsia"/>
+          <w:kern w:val="0"/>
+          <w:sz w:val="22"/>
+          <w:lang w:val="zh-CN"/>
+        </w:rPr>
+        <w:t>安脉盛需派遣</w:t>
+      </w:r>
+      <w:proofErr w:type="gramEnd"/>
+      <w:r>
+        <w:rPr>
+          <w:rFonts w:ascii="楷体" w:eastAsia="楷体" w:hAnsi="楷体" w:cs="宋体" w:hint="eastAsia"/>
+          <w:kern w:val="0"/>
+          <w:sz w:val="22"/>
+          <w:lang w:val="zh-CN"/>
+        </w:rPr>
+        <w:t>工程师到现场进行安装调试，并提供长达3至6个月的陪产服务，确保设备在实际生产环境中稳定运行，并与整线协同。</w:t>
+      </w:r>
+    </w:p>
+    <w:p>
+      <w:pPr>
+        <w:pStyle w:val="a3"/>
+        <w:numPr>
+          <w:ilvl w:val="1"/>
+          <w:numId w:val="4"/>
+        </w:numPr>
+        <w:spacing w:beforeLines="50" w:before="156"/>
+        <w:ind w:firstLineChars="0"/>
+        <w:rPr>
+          <w:rFonts w:ascii="楷体" w:eastAsia="楷体" w:hAnsi="楷体" w:cs="宋体" w:hint="eastAsia"/>
+          <w:b/>
+          <w:bCs/>
+          <w:kern w:val="0"/>
+          <w:sz w:val="22"/>
+          <w:lang w:val="zh-CN"/>
+        </w:rPr>
+      </w:pPr>
+      <w:r>
+        <w:rPr>
+          <w:rFonts w:ascii="楷体" w:eastAsia="楷体" w:hAnsi="楷体" w:cs="宋体" w:hint="eastAsia"/>
+          <w:b/>
+          <w:bCs/>
+          <w:kern w:val="0"/>
+          <w:sz w:val="22"/>
+          <w:lang w:val="zh-CN"/>
+        </w:rPr>
+        <w:t>验收周期分析：</w:t>
+      </w:r>
+    </w:p>
+    <w:p>
+      <w:pPr>
+        <w:pStyle w:val="a3"/>
+        <w:numPr>
+          <w:ilvl w:val="1"/>
+          <w:numId w:val="12"/>
+        </w:numPr>
+        <w:spacing w:beforeLines="50" w:before="156"/>
+        <w:ind w:left="1276" w:firstLineChars="0"/>
+        <w:rPr>
+          <w:rFonts w:ascii="楷体" w:eastAsia="楷体" w:hAnsi="楷体" w:cs="宋体" w:hint="eastAsia"/>
+          <w:b/>
+          <w:bCs/>
+          <w:kern w:val="0"/>
+          <w:sz w:val="22"/>
+          <w:lang w:val="zh-CN"/>
+        </w:rPr>
+      </w:pPr>
+      <w:r>
+        <w:rPr>
+          <w:rFonts w:ascii="楷体" w:eastAsia="楷体" w:hAnsi="楷体" w:cs="宋体" w:hint="eastAsia"/>
+          <w:b/>
+          <w:bCs/>
+          <w:kern w:val="0"/>
+          <w:sz w:val="22"/>
+          <w:lang w:val="zh-CN"/>
+        </w:rPr>
+        <w:t>周期较长原因：单个设备的验收不仅取决于其自身性能，更依赖于整条生产线的调试、磨合与产能爬坡。这其中还包括如搅拌等前序工序的稳定。</w:t>
+      </w:r>
+      <w:r>
+        <w:rPr>
+          <w:rFonts w:ascii="楷体" w:eastAsia="楷体" w:hAnsi="楷体" w:cs="宋体" w:hint="eastAsia"/>
+          <w:b/>
+          <w:bCs/>
+          <w:kern w:val="0"/>
+          <w:sz w:val="22"/>
+          <w:lang w:val="zh-CN"/>
+        </w:rPr>
+        <w:lastRenderedPageBreak/>
+        <w:t>只有当整条线稳定运行时，才能对单个设备进行最终验收。</w:t>
+      </w:r>
+    </w:p>
+    <w:p>
+      <w:pPr>
+        <w:pStyle w:val="a3"/>
+        <w:numPr>
+          <w:ilvl w:val="1"/>
+          <w:numId w:val="12"/>
+        </w:numPr>
+        <w:spacing w:beforeLines="50" w:before="156"/>
+        <w:ind w:left="1276" w:firstLineChars="0"/>
+        <w:rPr>
+          <w:rFonts w:ascii="楷体" w:eastAsia="楷体" w:hAnsi="楷体" w:cs="宋体" w:hint="eastAsia"/>
+          <w:b/>
+          <w:bCs/>
+          <w:kern w:val="0"/>
+          <w:sz w:val="22"/>
+          <w:lang w:val="zh-CN"/>
+        </w:rPr>
+      </w:pPr>
+      <w:r>
+        <w:rPr>
+          <w:rFonts w:ascii="楷体" w:eastAsia="楷体" w:hAnsi="楷体" w:cs="宋体" w:hint="eastAsia"/>
+          <w:b/>
+          <w:bCs/>
+          <w:kern w:val="0"/>
+          <w:sz w:val="22"/>
+          <w:lang w:val="zh-CN"/>
+        </w:rPr>
+        <w:t>产品类型差异：</w:t>
+      </w:r>
+    </w:p>
+    <w:p>
+      <w:pPr>
+        <w:pStyle w:val="a3"/>
+        <w:numPr>
+          <w:ilvl w:val="1"/>
+          <w:numId w:val="14"/>
+        </w:numPr>
+        <w:spacing w:beforeLines="50" w:before="156"/>
+        <w:ind w:left="1701" w:firstLineChars="0"/>
+        <w:rPr>
+          <w:rFonts w:ascii="楷体" w:eastAsia="楷体" w:hAnsi="楷体" w:cs="宋体" w:hint="eastAsia"/>
+          <w:kern w:val="0"/>
+          <w:sz w:val="22"/>
+          <w:lang w:val="zh-CN"/>
+        </w:rPr>
+      </w:pPr>
+      <w:r>
+        <w:rPr>
+          <w:rFonts w:ascii="楷体" w:eastAsia="楷体" w:hAnsi="楷体" w:cs="宋体" w:hint="eastAsia"/>
+          <w:b/>
+          <w:bCs/>
+          <w:kern w:val="0"/>
+          <w:sz w:val="22"/>
+          <w:lang w:val="zh-CN"/>
+        </w:rPr>
+        <w:t>智能控制类（如智能模头）：</w:t>
+      </w:r>
+      <w:r>
+        <w:rPr>
+          <w:rFonts w:ascii="楷体" w:eastAsia="楷体" w:hAnsi="楷体" w:cs="宋体" w:hint="eastAsia"/>
+          <w:kern w:val="0"/>
+          <w:sz w:val="22"/>
+          <w:lang w:val="zh-CN"/>
+        </w:rPr>
+        <w:t>基于确定的物理机理模型（</w:t>
+      </w:r>
+      <w:proofErr w:type="gramStart"/>
+      <w:r>
+        <w:rPr>
+          <w:rFonts w:ascii="楷体" w:eastAsia="楷体" w:hAnsi="楷体" w:cs="宋体" w:hint="eastAsia"/>
+          <w:kern w:val="0"/>
+          <w:sz w:val="22"/>
+          <w:lang w:val="zh-CN"/>
+        </w:rPr>
+        <w:t>白盒模型</w:t>
+      </w:r>
+      <w:proofErr w:type="gramEnd"/>
+      <w:r>
+        <w:rPr>
+          <w:rFonts w:ascii="楷体" w:eastAsia="楷体" w:hAnsi="楷体" w:cs="宋体" w:hint="eastAsia"/>
+          <w:kern w:val="0"/>
+          <w:sz w:val="22"/>
+          <w:lang w:val="zh-CN"/>
+        </w:rPr>
+        <w:t>），泛化性好，调试快。从接单到</w:t>
+      </w:r>
+      <w:proofErr w:type="gramStart"/>
+      <w:r>
+        <w:rPr>
+          <w:rFonts w:ascii="楷体" w:eastAsia="楷体" w:hAnsi="楷体" w:cs="宋体" w:hint="eastAsia"/>
+          <w:kern w:val="0"/>
+          <w:sz w:val="22"/>
+          <w:lang w:val="zh-CN"/>
+        </w:rPr>
+        <w:t>出货仅</w:t>
+      </w:r>
+      <w:proofErr w:type="gramEnd"/>
+      <w:r>
+        <w:rPr>
+          <w:rFonts w:ascii="楷体" w:eastAsia="楷体" w:hAnsi="楷体" w:cs="宋体" w:hint="eastAsia"/>
+          <w:kern w:val="0"/>
+          <w:sz w:val="22"/>
+          <w:lang w:val="zh-CN"/>
+        </w:rPr>
+        <w:t>需1个月，整体交付周期短，90%以上订单能实现一年内验收。</w:t>
+      </w:r>
+    </w:p>
+    <w:p>
+      <w:pPr>
+        <w:pStyle w:val="a3"/>
+        <w:numPr>
+          <w:ilvl w:val="1"/>
+          <w:numId w:val="14"/>
+        </w:numPr>
+        <w:spacing w:beforeLines="50" w:before="156"/>
+        <w:ind w:left="1701" w:firstLineChars="0"/>
+        <w:rPr>
+          <w:rFonts w:ascii="楷体" w:eastAsia="楷体" w:hAnsi="楷体" w:cs="宋体" w:hint="eastAsia"/>
+          <w:kern w:val="0"/>
+          <w:sz w:val="22"/>
+          <w:lang w:val="zh-CN"/>
+        </w:rPr>
+      </w:pPr>
+      <w:r>
+        <w:rPr>
+          <w:rFonts w:ascii="楷体" w:eastAsia="楷体" w:hAnsi="楷体" w:cs="宋体" w:hint="eastAsia"/>
+          <w:b/>
+          <w:bCs/>
+          <w:kern w:val="0"/>
+          <w:sz w:val="22"/>
+          <w:lang w:val="zh-CN"/>
+        </w:rPr>
+        <w:t>视觉检测类（AI类）：</w:t>
+      </w:r>
+      <w:r>
+        <w:rPr>
+          <w:rFonts w:ascii="楷体" w:eastAsia="楷体" w:hAnsi="楷体" w:cs="宋体" w:hint="eastAsia"/>
+          <w:kern w:val="0"/>
+          <w:sz w:val="22"/>
+          <w:lang w:val="zh-CN"/>
+        </w:rPr>
+        <w:t>更像黑盒模型，泛化能力是其最大痛点。面对宁德时代极其多样的定制化产品型号，AI模型需要大量的现场数据进行调试和优化。其硬件生产周期需3-4个月，现场调试1-2个月，陪产周期长达3-6个月，导致总验收周期被拉长至1年到1年半。</w:t>
+      </w:r>
+    </w:p>
+    <w:p>
+      <w:pPr>
+        <w:pStyle w:val="a3"/>
+        <w:numPr>
+          <w:ilvl w:val="1"/>
+          <w:numId w:val="4"/>
+        </w:numPr>
+        <w:spacing w:beforeLines="50" w:before="156"/>
+        <w:ind w:left="1701" w:firstLineChars="0"/>
+        <w:rPr>
+          <w:rFonts w:ascii="楷体" w:eastAsia="楷体" w:hAnsi="楷体" w:cs="宋体" w:hint="eastAsia"/>
+          <w:b/>
+          <w:bCs/>
+          <w:kern w:val="0"/>
+          <w:sz w:val="22"/>
+          <w:lang w:val="zh-CN"/>
+        </w:rPr>
+      </w:pPr>
+      <w:r>
+        <w:rPr>
+          <w:rFonts w:ascii="楷体" w:eastAsia="楷体" w:hAnsi="楷体" w:cs="宋体" w:hint="eastAsia"/>
+          <w:b/>
+          <w:bCs/>
+          <w:kern w:val="0"/>
+          <w:sz w:val="22"/>
+          <w:lang w:val="zh-CN"/>
+        </w:rPr>
+        <w:t>付款节奏：</w:t>
+      </w:r>
+      <w:r>
+        <w:rPr>
+          <w:rFonts w:ascii="楷体" w:eastAsia="楷体" w:hAnsi="楷体" w:cs="宋体" w:hint="eastAsia"/>
+          <w:kern w:val="0"/>
+          <w:sz w:val="22"/>
+          <w:lang w:val="zh-CN"/>
+        </w:rPr>
+        <w:t>采用“5-2-3”模式（50%预付，20%到货，30%验收）。高比例的预付款确保了</w:t>
+      </w:r>
+      <w:proofErr w:type="gramStart"/>
+      <w:r>
+        <w:rPr>
+          <w:rFonts w:ascii="楷体" w:eastAsia="楷体" w:hAnsi="楷体" w:cs="宋体" w:hint="eastAsia"/>
+          <w:kern w:val="0"/>
+          <w:sz w:val="22"/>
+          <w:lang w:val="zh-CN"/>
+        </w:rPr>
+        <w:t>安脉盛良好</w:t>
+      </w:r>
+      <w:proofErr w:type="gramEnd"/>
+      <w:r>
+        <w:rPr>
+          <w:rFonts w:ascii="楷体" w:eastAsia="楷体" w:hAnsi="楷体" w:cs="宋体" w:hint="eastAsia"/>
+          <w:kern w:val="0"/>
+          <w:sz w:val="22"/>
+          <w:lang w:val="zh-CN"/>
+        </w:rPr>
+        <w:t>的现金流，长验收周期主要影响的是其收入确认的时点（采用终验法）。</w:t>
+      </w:r>
+    </w:p>
+    <w:p>
+      <w:pPr>
+        <w:spacing w:beforeLines="50" w:before="156"/>
+        <w:rPr>
+          <w:rFonts w:ascii="楷体" w:eastAsia="楷体" w:hAnsi="楷体" w:cs="宋体" w:hint="eastAsia"/>
+          <w:kern w:val="0"/>
+          <w:sz w:val="22"/>
+          <w:lang w:val="zh-CN"/>
+        </w:rPr>
+      </w:pPr>
+    </w:p>
+    <w:p>
+      <w:pPr>
+        <w:pStyle w:val="a3"/>
+        <w:numPr>
+          <w:ilvl w:val="0"/>
+          <w:numId w:val="13"/>
+        </w:numPr>
+        <w:spacing w:beforeLines="50" w:before="156" w:afterLines="50" w:after="156"/>
+        <w:ind w:left="357" w:firstLineChars="0" w:hanging="357"/>
+        <w:rPr>
+          <w:rFonts w:ascii="楷体" w:eastAsia="楷体" w:hAnsi="楷体" w:cs="宋体" w:hint="eastAsia"/>
+          <w:b/>
+          <w:kern w:val="0"/>
+          <w:sz w:val="22"/>
+          <w:lang w:val="zh-CN"/>
+        </w:rPr>
+      </w:pPr>
+      <w:r>
+        <w:rPr>
+          <w:rFonts w:ascii="楷体" w:eastAsia="楷体" w:hAnsi="楷体" w:cs="宋体"/>
+          <w:b/>
+          <w:kern w:val="0"/>
+          <w:sz w:val="22"/>
+          <w:lang w:val="zh-CN"/>
+        </w:rPr>
+        <w:t>行业洞察与未来展望</w:t>
+      </w:r>
+    </w:p>
+    <w:p>
+      <w:pPr>
+        <w:pStyle w:val="a3"/>
+        <w:numPr>
+          <w:ilvl w:val="1"/>
+          <w:numId w:val="10"/>
+        </w:numPr>
+        <w:spacing w:beforeLines="50" w:before="156"/>
+        <w:ind w:firstLineChars="0"/>
+        <w:rPr>
+          <w:rFonts w:ascii="楷体" w:eastAsia="楷体" w:hAnsi="楷体" w:cs="宋体" w:hint="eastAsia"/>
+          <w:b/>
+          <w:bCs/>
+          <w:kern w:val="0"/>
+          <w:sz w:val="22"/>
+          <w:lang w:val="zh-CN"/>
+        </w:rPr>
+      </w:pPr>
+      <w:r>
+        <w:rPr>
+          <w:rFonts w:ascii="楷体" w:eastAsia="楷体" w:hAnsi="楷体" w:cs="宋体"/>
+          <w:b/>
+          <w:bCs/>
+          <w:kern w:val="0"/>
+          <w:sz w:val="22"/>
+          <w:lang w:val="zh-CN"/>
+        </w:rPr>
+        <w:t>核心理念：极限制造</w:t>
+      </w:r>
+    </w:p>
+    <w:p>
+      <w:pPr>
+        <w:pStyle w:val="a3"/>
+        <w:numPr>
+          <w:ilvl w:val="1"/>
+          <w:numId w:val="4"/>
+        </w:numPr>
+        <w:spacing w:beforeLines="50" w:before="156"/>
+        <w:ind w:firstLineChars="0"/>
+        <w:rPr>
+          <w:rFonts w:ascii="楷体" w:eastAsia="楷体" w:hAnsi="楷体" w:cs="宋体" w:hint="eastAsia"/>
+          <w:kern w:val="0"/>
+          <w:sz w:val="22"/>
+          <w:lang w:val="zh-CN"/>
+        </w:rPr>
+      </w:pPr>
+      <w:r>
+        <w:rPr>
+          <w:rFonts w:ascii="楷体" w:eastAsia="楷体" w:hAnsi="楷体" w:cs="宋体" w:hint="eastAsia"/>
+          <w:kern w:val="0"/>
+          <w:sz w:val="22"/>
+          <w:lang w:val="zh-CN"/>
+        </w:rPr>
+        <w:t>宁德时代内部推行由创始人提出的极限制造理念，其内涵是追求极精的工艺控制、极高的质量控制、极快的生产速度和极高的生产效率。</w:t>
+      </w:r>
+    </w:p>
+    <w:p>
+      <w:pPr>
+        <w:pStyle w:val="a3"/>
+        <w:numPr>
+          <w:ilvl w:val="1"/>
+          <w:numId w:val="4"/>
+        </w:numPr>
+        <w:spacing w:beforeLines="50" w:before="156"/>
+        <w:ind w:firstLineChars="0"/>
+        <w:rPr>
+          <w:rFonts w:ascii="楷体" w:eastAsia="楷体" w:hAnsi="楷体" w:cs="宋体" w:hint="eastAsia"/>
+          <w:kern w:val="0"/>
+          <w:sz w:val="22"/>
+          <w:lang w:val="zh-CN"/>
+        </w:rPr>
+      </w:pPr>
+      <w:r>
+        <w:rPr>
+          <w:rFonts w:ascii="楷体" w:eastAsia="楷体" w:hAnsi="楷体" w:cs="宋体" w:hint="eastAsia"/>
+          <w:kern w:val="0"/>
+          <w:sz w:val="22"/>
+          <w:lang w:val="zh-CN"/>
+        </w:rPr>
+        <w:t>在实践中发现，真正愿意沉下心来从第一性原理分析问题、挑战技术极限的合作伙伴非常稀少。希望</w:t>
+      </w:r>
+      <w:proofErr w:type="gramStart"/>
+      <w:r>
+        <w:rPr>
+          <w:rFonts w:ascii="楷体" w:eastAsia="楷体" w:hAnsi="楷体" w:cs="宋体" w:hint="eastAsia"/>
+          <w:kern w:val="0"/>
+          <w:sz w:val="22"/>
+          <w:lang w:val="zh-CN"/>
+        </w:rPr>
+        <w:t>安脉盛能继续</w:t>
+      </w:r>
+      <w:proofErr w:type="gramEnd"/>
+      <w:r>
+        <w:rPr>
+          <w:rFonts w:ascii="楷体" w:eastAsia="楷体" w:hAnsi="楷体" w:cs="宋体" w:hint="eastAsia"/>
+          <w:kern w:val="0"/>
+          <w:sz w:val="22"/>
+          <w:lang w:val="zh-CN"/>
+        </w:rPr>
+        <w:t>秉持这一理念，共同推动中国制造业向更高水平发展。</w:t>
+      </w:r>
+    </w:p>
+    <w:p>
+      <w:pPr>
+        <w:pStyle w:val="a3"/>
+        <w:numPr>
+          <w:ilvl w:val="1"/>
+          <w:numId w:val="10"/>
+        </w:numPr>
+        <w:spacing w:beforeLines="50" w:before="156"/>
+        <w:ind w:firstLineChars="0"/>
+        <w:rPr>
+          <w:rFonts w:ascii="楷体" w:eastAsia="楷体" w:hAnsi="楷体" w:cs="宋体" w:hint="eastAsia"/>
+          <w:b/>
+          <w:bCs/>
+          <w:kern w:val="0"/>
+          <w:sz w:val="22"/>
+          <w:lang w:val="zh-CN"/>
+        </w:rPr>
+      </w:pPr>
+      <w:r>
+        <w:rPr>
+          <w:rFonts w:ascii="楷体" w:eastAsia="楷体" w:hAnsi="楷体" w:cs="宋体"/>
+          <w:b/>
+          <w:bCs/>
+          <w:kern w:val="0"/>
+          <w:sz w:val="22"/>
+          <w:lang w:val="zh-CN"/>
+        </w:rPr>
+        <w:t>行业痛点：精密控制领域的人才与价值错位</w:t>
+      </w:r>
+    </w:p>
+    <w:p>
+      <w:pPr>
+        <w:pStyle w:val="a3"/>
+        <w:numPr>
+          <w:ilvl w:val="1"/>
+          <w:numId w:val="4"/>
+        </w:numPr>
+        <w:spacing w:beforeLines="50" w:before="156"/>
+        <w:ind w:firstLineChars="0"/>
+        <w:rPr>
+          <w:rFonts w:ascii="楷体" w:eastAsia="楷体" w:hAnsi="楷体" w:cs="宋体" w:hint="eastAsia"/>
+          <w:kern w:val="0"/>
+          <w:sz w:val="22"/>
+          <w:lang w:val="zh-CN"/>
+        </w:rPr>
+      </w:pPr>
+      <w:r>
+        <w:rPr>
+          <w:rFonts w:ascii="楷体" w:eastAsia="楷体" w:hAnsi="楷体" w:cs="宋体" w:hint="eastAsia"/>
+          <w:b/>
+          <w:bCs/>
+          <w:kern w:val="0"/>
+          <w:sz w:val="22"/>
+          <w:lang w:val="zh-CN"/>
+        </w:rPr>
+        <w:t>人才流向问题：</w:t>
+      </w:r>
+      <w:r>
+        <w:rPr>
+          <w:rFonts w:ascii="楷体" w:eastAsia="楷体" w:hAnsi="楷体" w:cs="宋体" w:hint="eastAsia"/>
+          <w:kern w:val="0"/>
+          <w:sz w:val="22"/>
+          <w:lang w:val="zh-CN"/>
+        </w:rPr>
+        <w:t>冯总</w:t>
+      </w:r>
+      <w:r>
+        <w:rPr>
+          <w:rFonts w:ascii="楷体" w:eastAsia="楷体" w:hAnsi="楷体" w:cs="宋体" w:hint="eastAsia"/>
+          <w:kern w:val="0"/>
+          <w:sz w:val="22"/>
+          <w:lang w:val="zh-CN"/>
+        </w:rPr>
+        <w:t>凭借其在海尔、</w:t>
+      </w:r>
+      <w:proofErr w:type="gramStart"/>
+      <w:r>
+        <w:rPr>
+          <w:rFonts w:ascii="楷体" w:eastAsia="楷体" w:hAnsi="楷体" w:cs="宋体" w:hint="eastAsia"/>
+          <w:kern w:val="0"/>
+          <w:sz w:val="22"/>
+          <w:lang w:val="zh-CN"/>
+        </w:rPr>
+        <w:t>玖龙纸业</w:t>
+      </w:r>
+      <w:proofErr w:type="gramEnd"/>
+      <w:r>
+        <w:rPr>
+          <w:rFonts w:ascii="楷体" w:eastAsia="楷体" w:hAnsi="楷体" w:cs="宋体" w:hint="eastAsia"/>
+          <w:kern w:val="0"/>
+          <w:sz w:val="22"/>
+          <w:lang w:val="zh-CN"/>
+        </w:rPr>
+        <w:t>及宁德时代等多年制造业经验观察到，顶尖的软件和AI人才更愿意去薪资高、工作环境优越的互联网公司，而非投身于工厂环境，解决底层的设备控制难题。</w:t>
+      </w:r>
+    </w:p>
+    <w:p>
+      <w:pPr>
+        <w:pStyle w:val="a3"/>
+        <w:numPr>
+          <w:ilvl w:val="1"/>
+          <w:numId w:val="4"/>
+        </w:numPr>
+        <w:spacing w:beforeLines="50" w:before="156"/>
+        <w:ind w:firstLineChars="0"/>
+        <w:rPr>
+          <w:rFonts w:ascii="楷体" w:eastAsia="楷体" w:hAnsi="楷体" w:cs="宋体" w:hint="eastAsia"/>
+          <w:kern w:val="0"/>
+          <w:sz w:val="22"/>
+          <w:lang w:val="zh-CN"/>
+        </w:rPr>
+      </w:pPr>
+      <w:r>
+        <w:rPr>
+          <w:rFonts w:ascii="楷体" w:eastAsia="楷体" w:hAnsi="楷体" w:cs="宋体" w:hint="eastAsia"/>
+          <w:b/>
+          <w:bCs/>
+          <w:kern w:val="0"/>
+          <w:sz w:val="22"/>
+          <w:lang w:val="zh-CN"/>
+        </w:rPr>
+        <w:t>软件价值困境：</w:t>
+      </w:r>
+      <w:r>
+        <w:rPr>
+          <w:rFonts w:ascii="楷体" w:eastAsia="楷体" w:hAnsi="楷体" w:cs="宋体" w:hint="eastAsia"/>
+          <w:kern w:val="0"/>
+          <w:sz w:val="22"/>
+          <w:lang w:val="zh-CN"/>
+        </w:rPr>
+        <w:t>国内设备行业长期存在软件卖不上价的现象。甲方采购时习惯按BOM核价，导致硬件价值被看重，而作为核心增值部分的软件和算法却常被要求附送，这打击了设备厂商在软件研发上进行长期投入的积极性，形成恶性循环。</w:t>
+      </w:r>
+    </w:p>
+    <w:p>
+      <w:pPr>
+        <w:pStyle w:val="a3"/>
+        <w:numPr>
+          <w:ilvl w:val="1"/>
+          <w:numId w:val="10"/>
+        </w:numPr>
+        <w:spacing w:beforeLines="50" w:before="156"/>
+        <w:ind w:firstLineChars="0"/>
+        <w:rPr>
+          <w:rFonts w:ascii="楷体" w:eastAsia="楷体" w:hAnsi="楷体" w:cs="宋体" w:hint="eastAsia"/>
+          <w:b/>
+          <w:bCs/>
+          <w:kern w:val="0"/>
+          <w:sz w:val="22"/>
+          <w:lang w:val="zh-CN"/>
+        </w:rPr>
+      </w:pPr>
+      <w:r>
+        <w:rPr>
+          <w:rFonts w:ascii="楷体" w:eastAsia="楷体" w:hAnsi="楷体" w:cs="宋体" w:hint="eastAsia"/>
+          <w:b/>
+          <w:bCs/>
+          <w:kern w:val="0"/>
+          <w:sz w:val="22"/>
+          <w:lang w:val="zh-CN"/>
+        </w:rPr>
+        <w:t>市场需求与产能扩张</w:t>
+      </w:r>
+    </w:p>
+    <w:p>
+      <w:pPr>
+        <w:pStyle w:val="a3"/>
+        <w:numPr>
+          <w:ilvl w:val="1"/>
+          <w:numId w:val="4"/>
+        </w:numPr>
+        <w:spacing w:beforeLines="50" w:before="156"/>
+        <w:ind w:firstLineChars="0"/>
+        <w:rPr>
+          <w:rFonts w:ascii="楷体" w:eastAsia="楷体" w:hAnsi="楷体" w:cs="宋体" w:hint="eastAsia"/>
+          <w:kern w:val="0"/>
+          <w:sz w:val="22"/>
+          <w:lang w:val="zh-CN"/>
+        </w:rPr>
+      </w:pPr>
+      <w:r>
+        <w:rPr>
+          <w:rFonts w:ascii="楷体" w:eastAsia="楷体" w:hAnsi="楷体" w:cs="宋体" w:hint="eastAsia"/>
+          <w:b/>
+          <w:bCs/>
+          <w:kern w:val="0"/>
+          <w:sz w:val="22"/>
+          <w:lang w:val="zh-CN"/>
+        </w:rPr>
+        <w:t>强劲市场需求：</w:t>
+      </w:r>
+      <w:r>
+        <w:rPr>
+          <w:rFonts w:ascii="楷体" w:eastAsia="楷体" w:hAnsi="楷体" w:cs="宋体" w:hint="eastAsia"/>
+          <w:kern w:val="0"/>
+          <w:sz w:val="22"/>
+          <w:lang w:val="zh-CN"/>
+        </w:rPr>
+        <w:t>2025年受4月份左右开始</w:t>
+      </w:r>
+      <w:proofErr w:type="gramStart"/>
+      <w:r>
+        <w:rPr>
+          <w:rFonts w:ascii="楷体" w:eastAsia="楷体" w:hAnsi="楷体" w:cs="宋体" w:hint="eastAsia"/>
+          <w:kern w:val="0"/>
+          <w:sz w:val="22"/>
+          <w:lang w:val="zh-CN"/>
+        </w:rPr>
+        <w:t>的重卡电动</w:t>
+      </w:r>
+      <w:proofErr w:type="gramEnd"/>
+      <w:r>
+        <w:rPr>
+          <w:rFonts w:ascii="楷体" w:eastAsia="楷体" w:hAnsi="楷体" w:cs="宋体" w:hint="eastAsia"/>
+          <w:kern w:val="0"/>
+          <w:sz w:val="22"/>
+          <w:lang w:val="zh-CN"/>
+        </w:rPr>
+        <w:t>化市场和后续接力的储能市场爆发的双重驱动，高端锂电池市场呈现严重的供不应求状态。</w:t>
+      </w:r>
+    </w:p>
+    <w:p>
+      <w:pPr>
+        <w:pStyle w:val="a3"/>
+        <w:numPr>
+          <w:ilvl w:val="1"/>
+          <w:numId w:val="4"/>
+        </w:numPr>
+        <w:spacing w:beforeLines="50" w:before="156"/>
+        <w:ind w:firstLineChars="0"/>
+        <w:rPr>
+          <w:rFonts w:ascii="楷体" w:eastAsia="楷体" w:hAnsi="楷体" w:cs="宋体" w:hint="eastAsia"/>
+          <w:kern w:val="0"/>
+          <w:sz w:val="22"/>
+          <w:lang w:val="zh-CN"/>
+        </w:rPr>
+      </w:pPr>
+      <w:r>
+        <w:rPr>
+          <w:rFonts w:ascii="楷体" w:eastAsia="楷体" w:hAnsi="楷体" w:cs="宋体" w:hint="eastAsia"/>
+          <w:b/>
+          <w:bCs/>
+          <w:kern w:val="0"/>
+          <w:sz w:val="22"/>
+          <w:lang w:val="zh-CN"/>
+        </w:rPr>
+        <w:t>产能应对：</w:t>
+      </w:r>
+      <w:r>
+        <w:rPr>
+          <w:rFonts w:ascii="楷体" w:eastAsia="楷体" w:hAnsi="楷体" w:cs="宋体" w:hint="eastAsia"/>
+          <w:kern w:val="0"/>
+          <w:sz w:val="22"/>
+          <w:lang w:val="zh-CN"/>
+        </w:rPr>
+        <w:t>宁德时代的产能利用率已超过90%，几乎没有停线窗口进行大规模</w:t>
+      </w:r>
+      <w:proofErr w:type="gramStart"/>
+      <w:r>
+        <w:rPr>
+          <w:rFonts w:ascii="楷体" w:eastAsia="楷体" w:hAnsi="楷体" w:cs="宋体" w:hint="eastAsia"/>
+          <w:kern w:val="0"/>
+          <w:sz w:val="22"/>
+          <w:lang w:val="zh-CN"/>
+        </w:rPr>
+        <w:t>的产线改造</w:t>
+      </w:r>
+      <w:proofErr w:type="gramEnd"/>
+      <w:r>
+        <w:rPr>
+          <w:rFonts w:ascii="楷体" w:eastAsia="楷体" w:hAnsi="楷体" w:cs="宋体" w:hint="eastAsia"/>
+          <w:kern w:val="0"/>
+          <w:sz w:val="22"/>
+          <w:lang w:val="zh-CN"/>
+        </w:rPr>
+        <w:t>，</w:t>
+      </w:r>
+      <w:proofErr w:type="gramStart"/>
+      <w:r>
+        <w:rPr>
+          <w:rFonts w:ascii="楷体" w:eastAsia="楷体" w:hAnsi="楷体" w:cs="宋体" w:hint="eastAsia"/>
+          <w:kern w:val="0"/>
+          <w:sz w:val="22"/>
+          <w:lang w:val="zh-CN"/>
+        </w:rPr>
+        <w:t>新产线建设</w:t>
+      </w:r>
+      <w:proofErr w:type="gramEnd"/>
+      <w:r>
+        <w:rPr>
+          <w:rFonts w:ascii="楷体" w:eastAsia="楷体" w:hAnsi="楷体" w:cs="宋体" w:hint="eastAsia"/>
+          <w:kern w:val="0"/>
+          <w:sz w:val="22"/>
+          <w:lang w:val="zh-CN"/>
+        </w:rPr>
+        <w:t>迫在眉睫。为此，公司正在全球范围内（包括国内的宁德、福州</w:t>
+      </w:r>
+      <w:r>
+        <w:rPr>
+          <w:rFonts w:ascii="楷体" w:eastAsia="楷体" w:hAnsi="楷体" w:cs="宋体" w:hint="eastAsia"/>
+          <w:kern w:val="0"/>
+          <w:sz w:val="22"/>
+          <w:lang w:val="zh-CN"/>
+        </w:rPr>
+        <w:t>、常州</w:t>
+      </w:r>
+      <w:r>
+        <w:rPr>
+          <w:rFonts w:ascii="楷体" w:eastAsia="楷体" w:hAnsi="楷体" w:cs="宋体" w:hint="eastAsia"/>
+          <w:kern w:val="0"/>
+          <w:sz w:val="22"/>
+          <w:lang w:val="zh-CN"/>
+        </w:rPr>
+        <w:t>、宜宾以及海外的美国项目）进行大规模的产能扩张，外部披露的年度在建产能投资额高达4000亿级别。</w:t>
+      </w:r>
+    </w:p>
+    <w:p>
+      <w:pPr>
+        <w:pStyle w:val="a3"/>
+        <w:numPr>
+          <w:ilvl w:val="1"/>
+          <w:numId w:val="10"/>
+        </w:numPr>
+        <w:spacing w:beforeLines="50" w:before="156"/>
+        <w:ind w:firstLineChars="0"/>
+        <w:rPr>
+          <w:rFonts w:ascii="楷体" w:eastAsia="楷体" w:hAnsi="楷体" w:cs="宋体" w:hint="eastAsia"/>
+          <w:b/>
+          <w:bCs/>
+          <w:kern w:val="0"/>
+          <w:sz w:val="22"/>
+          <w:lang w:val="zh-CN"/>
+        </w:rPr>
+      </w:pPr>
+      <w:r>
+        <w:rPr>
+          <w:rFonts w:ascii="楷体" w:eastAsia="楷体" w:hAnsi="楷体" w:cs="宋体" w:hint="eastAsia"/>
+          <w:b/>
+          <w:bCs/>
+          <w:kern w:val="0"/>
+          <w:sz w:val="22"/>
+          <w:lang w:val="zh-CN"/>
+        </w:rPr>
+        <w:t>设备国产化与宏观环境</w:t>
+      </w:r>
+    </w:p>
+    <w:p>
+      <w:pPr>
+        <w:pStyle w:val="a3"/>
+        <w:numPr>
+          <w:ilvl w:val="1"/>
+          <w:numId w:val="4"/>
+        </w:numPr>
+        <w:spacing w:beforeLines="50" w:before="156"/>
+        <w:ind w:firstLineChars="0"/>
+        <w:rPr>
+          <w:rFonts w:ascii="楷体" w:eastAsia="楷体" w:hAnsi="楷体" w:cs="宋体" w:hint="eastAsia"/>
+          <w:kern w:val="0"/>
+          <w:sz w:val="22"/>
+          <w:lang w:val="zh-CN"/>
+        </w:rPr>
+      </w:pPr>
+      <w:r>
+        <w:rPr>
+          <w:rFonts w:ascii="楷体" w:eastAsia="楷体" w:hAnsi="楷体" w:cs="宋体" w:hint="eastAsia"/>
+          <w:b/>
+          <w:bCs/>
+          <w:kern w:val="0"/>
+          <w:sz w:val="22"/>
+          <w:lang w:val="zh-CN"/>
+        </w:rPr>
+        <w:lastRenderedPageBreak/>
+        <w:t>设备国产化：</w:t>
+      </w:r>
+      <w:r>
+        <w:rPr>
+          <w:rFonts w:ascii="楷体" w:eastAsia="楷体" w:hAnsi="楷体" w:cs="宋体" w:hint="eastAsia"/>
+          <w:kern w:val="0"/>
+          <w:sz w:val="22"/>
+          <w:lang w:val="zh-CN"/>
+        </w:rPr>
+        <w:t>宁德时代从其前身ATL创立之初就坚持核心设备国产化的路线。除部分标准件（如ABB、发那科、库卡的机械臂）外，核心的涂布机、卷绕机、模切机等大型设备均已实现国产化。</w:t>
+      </w:r>
+    </w:p>
+    <w:p>
+      <w:pPr>
+        <w:pStyle w:val="a3"/>
+        <w:numPr>
+          <w:ilvl w:val="1"/>
+          <w:numId w:val="4"/>
+        </w:numPr>
+        <w:spacing w:beforeLines="50" w:before="156"/>
+        <w:ind w:firstLineChars="0"/>
+        <w:rPr>
+          <w:rFonts w:ascii="楷体" w:eastAsia="楷体" w:hAnsi="楷体" w:cs="宋体" w:hint="eastAsia"/>
+          <w:kern w:val="0"/>
+          <w:sz w:val="22"/>
+          <w:lang w:val="zh-CN"/>
+        </w:rPr>
+      </w:pPr>
+      <w:r>
+        <w:rPr>
+          <w:rFonts w:ascii="楷体" w:eastAsia="楷体" w:hAnsi="楷体" w:cs="宋体" w:hint="eastAsia"/>
+          <w:b/>
+          <w:bCs/>
+          <w:kern w:val="0"/>
+          <w:sz w:val="22"/>
+          <w:lang w:val="zh-CN"/>
+        </w:rPr>
+        <w:t>产业趋势：</w:t>
+      </w:r>
+      <w:r>
+        <w:rPr>
+          <w:rFonts w:ascii="楷体" w:eastAsia="楷体" w:hAnsi="楷体" w:cs="宋体" w:hint="eastAsia"/>
+          <w:kern w:val="0"/>
+          <w:sz w:val="22"/>
+          <w:lang w:val="zh-CN"/>
+        </w:rPr>
+        <w:t>自2020年以来，国家政策和资本正驱动社会资源从需求侧（如互联网模式创新）向供给侧（硬科技、底层技术）转移，形成了投大、投难、</w:t>
+      </w:r>
+      <w:proofErr w:type="gramStart"/>
+      <w:r>
+        <w:rPr>
+          <w:rFonts w:ascii="楷体" w:eastAsia="楷体" w:hAnsi="楷体" w:cs="宋体" w:hint="eastAsia"/>
+          <w:kern w:val="0"/>
+          <w:sz w:val="22"/>
+          <w:lang w:val="zh-CN"/>
+        </w:rPr>
+        <w:t>投硬的</w:t>
+      </w:r>
+      <w:proofErr w:type="gramEnd"/>
+      <w:r>
+        <w:rPr>
+          <w:rFonts w:ascii="楷体" w:eastAsia="楷体" w:hAnsi="楷体" w:cs="宋体" w:hint="eastAsia"/>
+          <w:kern w:val="0"/>
+          <w:sz w:val="22"/>
+          <w:lang w:val="zh-CN"/>
+        </w:rPr>
+        <w:t>趋势。这为</w:t>
+      </w:r>
+      <w:proofErr w:type="gramStart"/>
+      <w:r>
+        <w:rPr>
+          <w:rFonts w:ascii="楷体" w:eastAsia="楷体" w:hAnsi="楷体" w:cs="宋体" w:hint="eastAsia"/>
+          <w:kern w:val="0"/>
+          <w:sz w:val="22"/>
+          <w:lang w:val="zh-CN"/>
+        </w:rPr>
+        <w:t>安脉</w:t>
+      </w:r>
+      <w:proofErr w:type="gramEnd"/>
+      <w:r>
+        <w:rPr>
+          <w:rFonts w:ascii="楷体" w:eastAsia="楷体" w:hAnsi="楷体" w:cs="宋体" w:hint="eastAsia"/>
+          <w:kern w:val="0"/>
+          <w:sz w:val="22"/>
+          <w:lang w:val="zh-CN"/>
+        </w:rPr>
+        <w:t>盛这类深耕底层技术的公司创造了历史性的发展机遇。</w:t>
+      </w:r>
+    </w:p>
+    <w:p>
+      <w:pPr>
+        <w:pStyle w:val="a3"/>
+        <w:numPr>
+          <w:ilvl w:val="1"/>
+          <w:numId w:val="4"/>
+        </w:numPr>
+        <w:spacing w:beforeLines="50" w:before="156"/>
+        <w:ind w:firstLineChars="0"/>
+        <w:rPr>
+          <w:rFonts w:ascii="楷体" w:eastAsia="楷体" w:hAnsi="楷体" w:cs="宋体" w:hint="eastAsia"/>
+          <w:kern w:val="0"/>
+          <w:sz w:val="22"/>
+          <w:lang w:val="zh-CN"/>
+        </w:rPr>
+      </w:pPr>
+      <w:r>
+        <w:rPr>
+          <w:rFonts w:ascii="楷体" w:eastAsia="楷体" w:hAnsi="楷体" w:cs="宋体" w:hint="eastAsia"/>
+          <w:b/>
+          <w:bCs/>
+          <w:kern w:val="0"/>
+          <w:sz w:val="22"/>
+          <w:lang w:val="zh-CN"/>
+        </w:rPr>
+        <w:t>工业软件：</w:t>
+      </w:r>
+      <w:r>
+        <w:rPr>
+          <w:rFonts w:ascii="楷体" w:eastAsia="楷体" w:hAnsi="楷体" w:cs="宋体" w:hint="eastAsia"/>
+          <w:kern w:val="0"/>
+          <w:sz w:val="22"/>
+          <w:lang w:val="zh-CN"/>
+        </w:rPr>
+        <w:t>对国产工业软件的现状表示担忧，在许多领域仍难以替代国外成熟产品，期待AI技术能成为撬动该领域发展的关键力量。</w:t>
+      </w:r>
+    </w:p>
+    <w:p>
+      <w:pPr>
+        <w:pStyle w:val="a3"/>
+        <w:numPr>
+          <w:ilvl w:val="1"/>
+          <w:numId w:val="10"/>
+        </w:numPr>
+        <w:spacing w:beforeLines="50" w:before="156"/>
+        <w:ind w:firstLineChars="0"/>
+        <w:rPr>
+          <w:rFonts w:ascii="楷体" w:eastAsia="楷体" w:hAnsi="楷体" w:cs="宋体" w:hint="eastAsia"/>
+          <w:b/>
+          <w:bCs/>
+          <w:kern w:val="0"/>
+          <w:sz w:val="22"/>
+          <w:lang w:val="zh-CN"/>
+        </w:rPr>
+      </w:pPr>
+      <w:r>
+        <w:rPr>
+          <w:rFonts w:ascii="楷体" w:eastAsia="楷体" w:hAnsi="楷体" w:cs="宋体" w:hint="eastAsia"/>
+          <w:b/>
+          <w:bCs/>
+          <w:kern w:val="0"/>
+          <w:sz w:val="22"/>
+          <w:lang w:val="zh-CN"/>
+        </w:rPr>
+        <w:t>未来技术需求</w:t>
+      </w:r>
+    </w:p>
+    <w:p>
+      <w:pPr>
+        <w:pStyle w:val="a3"/>
+        <w:numPr>
+          <w:ilvl w:val="1"/>
+          <w:numId w:val="4"/>
+        </w:numPr>
+        <w:spacing w:beforeLines="50" w:before="156"/>
+        <w:ind w:firstLineChars="0"/>
+        <w:rPr>
+          <w:rFonts w:ascii="楷体" w:eastAsia="楷体" w:hAnsi="楷体" w:cs="宋体" w:hint="eastAsia"/>
+          <w:kern w:val="0"/>
+          <w:sz w:val="22"/>
+          <w:lang w:val="zh-CN"/>
+        </w:rPr>
+      </w:pPr>
+      <w:r>
+        <w:rPr>
+          <w:rFonts w:ascii="楷体" w:eastAsia="楷体" w:hAnsi="楷体" w:cs="宋体" w:hint="eastAsia"/>
+          <w:b/>
+          <w:bCs/>
+          <w:kern w:val="0"/>
+          <w:sz w:val="22"/>
+          <w:lang w:val="zh-CN"/>
+        </w:rPr>
+        <w:t>新挑战：</w:t>
+      </w:r>
+      <w:r>
+        <w:rPr>
+          <w:rFonts w:ascii="楷体" w:eastAsia="楷体" w:hAnsi="楷体" w:cs="宋体" w:hint="eastAsia"/>
+          <w:kern w:val="0"/>
+          <w:sz w:val="22"/>
+          <w:lang w:val="zh-CN"/>
+        </w:rPr>
+        <w:t>宁德时代已开始着眼于要求更高的航空电池等新领域，这将带来全新的技术挑战。</w:t>
+      </w:r>
+    </w:p>
+    <w:p>
+      <w:pPr>
+        <w:pStyle w:val="a3"/>
+        <w:numPr>
+          <w:ilvl w:val="1"/>
+          <w:numId w:val="4"/>
+        </w:numPr>
+        <w:spacing w:beforeLines="50" w:before="156"/>
+        <w:ind w:firstLineChars="0"/>
+        <w:rPr>
+          <w:rFonts w:ascii="楷体" w:eastAsia="楷体" w:hAnsi="楷体" w:cs="宋体" w:hint="eastAsia"/>
+          <w:kern w:val="0"/>
+          <w:sz w:val="22"/>
+          <w:lang w:val="zh-CN"/>
+        </w:rPr>
+      </w:pPr>
+      <w:r>
+        <w:rPr>
+          <w:rFonts w:ascii="楷体" w:eastAsia="楷体" w:hAnsi="楷体" w:cs="宋体" w:hint="eastAsia"/>
+          <w:b/>
+          <w:bCs/>
+          <w:kern w:val="0"/>
+          <w:sz w:val="22"/>
+          <w:lang w:val="zh-CN"/>
+        </w:rPr>
+        <w:t>技术方向：</w:t>
+      </w:r>
+      <w:r>
+        <w:rPr>
+          <w:rFonts w:ascii="楷体" w:eastAsia="楷体" w:hAnsi="楷体" w:cs="宋体" w:hint="eastAsia"/>
+          <w:kern w:val="0"/>
+          <w:sz w:val="22"/>
+          <w:lang w:val="zh-CN"/>
+        </w:rPr>
+        <w:t>未来需要探索和应用更多新技术来解决制造难题，</w:t>
+      </w:r>
+      <w:proofErr w:type="gramStart"/>
+      <w:r>
+        <w:rPr>
+          <w:rFonts w:ascii="楷体" w:eastAsia="楷体" w:hAnsi="楷体" w:cs="宋体" w:hint="eastAsia"/>
+          <w:kern w:val="0"/>
+          <w:sz w:val="22"/>
+          <w:lang w:val="zh-CN"/>
+        </w:rPr>
+        <w:t>例如具身智能</w:t>
+      </w:r>
+      <w:proofErr w:type="gramEnd"/>
+      <w:r>
+        <w:rPr>
+          <w:rFonts w:ascii="楷体" w:eastAsia="楷体" w:hAnsi="楷体" w:cs="宋体" w:hint="eastAsia"/>
+          <w:kern w:val="0"/>
+          <w:sz w:val="22"/>
+          <w:lang w:val="zh-CN"/>
+        </w:rPr>
+        <w:t>、新型隔热防火材料、以及如X射线等可用于无损探测电池内部状态的新型传感与探测方法等前沿技术。</w:t>
       </w:r>
     </w:p>
     <w:sectPr>

</xml_diff>